<commit_message>
Nuevo ajuste de productos
Puntos de este commit:
- Ahora se puede eliminar y sumar stock al escanear un codigo.
</commit_message>
<xml_diff>
--- a/Fase 2/Evidencias Grupales/2.4_GuiaEstudiante_Fase 2_DesarrolloProyecto APT.docx
+++ b/Fase 2/Evidencias Grupales/2.4_GuiaEstudiante_Fase 2_DesarrolloProyecto APT.docx
@@ -1,11 +1,8 @@
 
 <file path=word/document.xml><?xml version="1.0" encoding="utf-8"?>
-<w:document xmlns:wpc="http://schemas.microsoft.com/office/word/2010/wordprocessingCanvas" xmlns:cx="http://schemas.microsoft.com/office/drawing/2014/chartex" xmlns:mc="http://schemas.openxmlformats.org/markup-compatibility/2006" xmlns:o="urn:schemas-microsoft-com:office:office" xmlns:r="http://schemas.openxmlformats.org/officeDocument/2006/relationships" xmlns:m="http://schemas.openxmlformats.org/officeDocument/2006/math" xmlns:v="urn:schemas-microsoft-com:vml" xmlns:wp14="http://schemas.microsoft.com/office/word/2010/wordprocessingDrawing" xmlns:wp="http://schemas.openxmlformats.org/drawingml/2006/wordprocessingDrawing" xmlns:w10="urn:schemas-microsoft-com:office:word" xmlns:w="http://schemas.openxmlformats.org/wordprocessingml/2006/main" xmlns:w14="http://schemas.microsoft.com/office/word/2010/wordml" xmlns:w15="http://schemas.microsoft.com/office/word/2012/wordml" xmlns:w16se="http://schemas.microsoft.com/office/word/2015/wordml/symex" xmlns:wpg="http://schemas.microsoft.com/office/word/2010/wordprocessingGroup" xmlns:wpi="http://schemas.microsoft.com/office/word/2010/wordprocessingInk" xmlns:wne="http://schemas.microsoft.com/office/word/2006/wordml" xmlns:wps="http://schemas.microsoft.com/office/word/2010/wordprocessingShape" mc:Ignorable="w14 w15 w16se wp14">
+<w:document xmlns:wpc="http://schemas.microsoft.com/office/word/2010/wordprocessingCanvas" xmlns:cx="http://schemas.microsoft.com/office/drawing/2014/chartex" xmlns:cx1="http://schemas.microsoft.com/office/drawing/2015/9/8/chartex" xmlns:cx2="http://schemas.microsoft.com/office/drawing/2015/10/21/chartex" xmlns:cx3="http://schemas.microsoft.com/office/drawing/2016/5/9/chartex" xmlns:cx4="http://schemas.microsoft.com/office/drawing/2016/5/10/chartex" xmlns:cx5="http://schemas.microsoft.com/office/drawing/2016/5/11/chartex" xmlns:cx6="http://schemas.microsoft.com/office/drawing/2016/5/12/chartex" xmlns:cx7="http://schemas.microsoft.com/office/drawing/2016/5/13/chartex" xmlns:cx8="http://schemas.microsoft.com/office/drawing/2016/5/14/chartex" xmlns:mc="http://schemas.openxmlformats.org/markup-compatibility/2006" xmlns:aink="http://schemas.microsoft.com/office/drawing/2016/ink" xmlns:am3d="http://schemas.microsoft.com/office/drawing/2017/model3d" xmlns:o="urn:schemas-microsoft-com:office:office" xmlns:oel="http://schemas.microsoft.com/office/2019/extlst" xmlns:r="http://schemas.openxmlformats.org/officeDocument/2006/relationships" xmlns:m="http://schemas.openxmlformats.org/officeDocument/2006/math" xmlns:v="urn:schemas-microsoft-com:vml" xmlns:wp14="http://schemas.microsoft.com/office/word/2010/wordprocessingDrawing" xmlns:wp="http://schemas.openxmlformats.org/drawingml/2006/wordprocessingDrawing" xmlns:w10="urn:schemas-microsoft-com:office:word" xmlns:w="http://schemas.openxmlformats.org/wordprocessingml/2006/main" xmlns:w14="http://schemas.microsoft.com/office/word/2010/wordml" xmlns:w15="http://schemas.microsoft.com/office/word/2012/wordml" xmlns:w16cex="http://schemas.microsoft.com/office/word/2018/wordml/cex" xmlns:w16cid="http://schemas.microsoft.com/office/word/2016/wordml/cid" xmlns:w16="http://schemas.microsoft.com/office/word/2018/wordml" xmlns:w16du="http://schemas.microsoft.com/office/word/2023/wordml/word16du" xmlns:w16sdtdh="http://schemas.microsoft.com/office/word/2020/wordml/sdtdatahash" xmlns:w16sdtfl="http://schemas.microsoft.com/office/word/2024/wordml/sdtformatlock" xmlns:w16se="http://schemas.microsoft.com/office/word/2015/wordml/symex" xmlns:wpg="http://schemas.microsoft.com/office/word/2010/wordprocessingGroup" xmlns:wpi="http://schemas.microsoft.com/office/word/2010/wordprocessingInk" xmlns:wne="http://schemas.microsoft.com/office/word/2006/wordml" xmlns:wps="http://schemas.microsoft.com/office/word/2010/wordprocessingShape" mc:Ignorable="w14 w15 w16se w16cid w16 w16cex w16sdtdh w16sdtfl w16du wp14">
   <w:body>
-    <w:p>
-      <w:bookmarkStart w:id="0" w:name="_GoBack"/>
-      <w:bookmarkEnd w:id="0"/>
-    </w:p>
+    <w:p/>
     <w:p>
       <w:pPr>
         <w:rPr>
@@ -165,6 +162,7 @@
                                 </w:rPr>
                                 <w:t xml:space="preserve">Asignatura </w:t>
                               </w:r>
+                              <w:proofErr w:type="spellStart"/>
                               <w:r>
                                 <w:rPr>
                                   <w:b/>
@@ -174,6 +172,7 @@
                                 </w:rPr>
                                 <w:t>Capstone</w:t>
                               </w:r>
+                              <w:proofErr w:type="spellEnd"/>
                             </w:p>
                           </w:txbxContent>
                         </wps:txbx>
@@ -238,7 +237,7 @@
           </mc:Choice>
           <mc:Fallback>
             <w:pict>
-              <v:group w14:anchorId="39581AEC" id="Grupo 27" o:spid="_x0000_s1026" style="position:absolute;margin-left:0;margin-top:.75pt;width:491.25pt;height:123pt;z-index:251659264;mso-position-horizontal:center;mso-position-horizontal-relative:margin;mso-width-relative:margin;mso-height-relative:margin" coordsize="59912,15621" o:gfxdata="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">
+              <v:group w14:anchorId="39581AEC" id="Grupo 27" o:spid="_x0000_s1026" style="position:absolute;margin-left:0;margin-top:.75pt;width:491.25pt;height:123pt;z-index:251659264;mso-position-horizontal:center;mso-position-horizontal-relative:margin;mso-width-relative:margin;mso-height-relative:margin" coordsize="59912,15621" o:gfxdata="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">
                 <v:shapetype id="_x0000_t202" coordsize="21600,21600" o:spt="202" path="m,l,21600r21600,l21600,xe">
                   <v:stroke joinstyle="miter"/>
                   <v:path gradientshapeok="t" o:connecttype="rect"/>
@@ -341,6 +340,7 @@
                           </w:rPr>
                           <w:t xml:space="preserve">Asignatura </w:t>
                         </w:r>
+                        <w:proofErr w:type="spellStart"/>
                         <w:r>
                           <w:rPr>
                             <w:b/>
@@ -350,6 +350,7 @@
                           </w:rPr>
                           <w:t>Capstone</w:t>
                         </w:r>
+                        <w:proofErr w:type="spellEnd"/>
                       </w:p>
                     </w:txbxContent>
                   </v:textbox>
@@ -630,133 +631,71 @@
               <w:jc w:val="both"/>
               <w:rPr>
                 <w:rFonts w:ascii="Calibri" w:hAnsi="Calibri" w:cs="Arial"/>
-                <w:i/>
-                <w:color w:val="548DD4"/>
-                <w:sz w:val="20"/>
-                <w:szCs w:val="20"/>
-                <w:lang w:eastAsia="es-CL"/>
-              </w:rPr>
-            </w:pPr>
-            <w:r>
-              <w:rPr>
-                <w:rFonts w:ascii="Calibri" w:hAnsi="Calibri" w:cs="Arial"/>
-                <w:i/>
-                <w:color w:val="548DD4"/>
-                <w:sz w:val="20"/>
-                <w:szCs w:val="20"/>
-                <w:lang w:eastAsia="es-CL"/>
-              </w:rPr>
-              <w:t xml:space="preserve">En esta </w:t>
-            </w:r>
-            <w:r>
-              <w:rPr>
-                <w:rFonts w:ascii="Calibri" w:hAnsi="Calibri" w:cs="Arial"/>
-                <w:i/>
-                <w:color w:val="548DD4"/>
-                <w:sz w:val="20"/>
-                <w:szCs w:val="20"/>
-                <w:lang w:eastAsia="es-CL"/>
-              </w:rPr>
-              <w:t>sección</w:t>
-            </w:r>
-            <w:r>
-              <w:rPr>
-                <w:rFonts w:ascii="Calibri" w:hAnsi="Calibri" w:cs="Arial"/>
-                <w:i/>
-                <w:color w:val="548DD4"/>
-                <w:sz w:val="20"/>
-                <w:szCs w:val="20"/>
-                <w:lang w:eastAsia="es-CL"/>
-              </w:rPr>
-              <w:t xml:space="preserve"> deberá</w:t>
-            </w:r>
-            <w:r>
-              <w:rPr>
-                <w:rFonts w:ascii="Calibri" w:hAnsi="Calibri" w:cs="Arial"/>
-                <w:i/>
-                <w:color w:val="548DD4"/>
-                <w:sz w:val="20"/>
-                <w:szCs w:val="20"/>
-                <w:lang w:eastAsia="es-CL"/>
-              </w:rPr>
-              <w:t>s</w:t>
-            </w:r>
-            <w:r>
-              <w:rPr>
-                <w:rFonts w:ascii="Calibri" w:hAnsi="Calibri" w:cs="Arial"/>
-                <w:i/>
-                <w:color w:val="548DD4"/>
-                <w:sz w:val="20"/>
-                <w:szCs w:val="20"/>
-                <w:lang w:eastAsia="es-CL"/>
-              </w:rPr>
-              <w:t xml:space="preserve"> </w:t>
-            </w:r>
-            <w:r>
-              <w:rPr>
-                <w:rFonts w:ascii="Calibri" w:hAnsi="Calibri" w:cs="Arial"/>
-                <w:i/>
-                <w:color w:val="548DD4"/>
-                <w:sz w:val="20"/>
-                <w:szCs w:val="20"/>
-                <w:lang w:eastAsia="es-CL"/>
-              </w:rPr>
-              <w:t xml:space="preserve">realizar un resumen de los avances que has realizado en tu proyecto APT. </w:t>
-            </w:r>
-            <w:r>
-              <w:rPr>
-                <w:rFonts w:ascii="Calibri" w:hAnsi="Calibri" w:cs="Arial"/>
-                <w:i/>
-                <w:color w:val="548DD4"/>
-                <w:sz w:val="20"/>
-                <w:szCs w:val="20"/>
-                <w:lang w:eastAsia="es-CL"/>
-              </w:rPr>
-              <w:t xml:space="preserve">Relata </w:t>
-            </w:r>
-            <w:r>
-              <w:rPr>
-                <w:rFonts w:ascii="Calibri" w:hAnsi="Calibri" w:cs="Arial"/>
-                <w:i/>
-                <w:color w:val="548DD4"/>
-                <w:sz w:val="20"/>
-                <w:szCs w:val="20"/>
-                <w:lang w:eastAsia="es-CL"/>
-              </w:rPr>
-              <w:t xml:space="preserve">brevemente </w:t>
-            </w:r>
-            <w:r>
-              <w:rPr>
-                <w:rFonts w:ascii="Calibri" w:hAnsi="Calibri" w:cs="Arial"/>
-                <w:i/>
-                <w:color w:val="548DD4"/>
-                <w:sz w:val="20"/>
-                <w:szCs w:val="20"/>
-                <w:lang w:eastAsia="es-CL"/>
-              </w:rPr>
-              <w:t xml:space="preserve">qué </w:t>
-            </w:r>
-            <w:r>
-              <w:rPr>
-                <w:rFonts w:ascii="Calibri" w:hAnsi="Calibri" w:cs="Arial"/>
-                <w:i/>
-                <w:color w:val="548DD4"/>
-                <w:sz w:val="20"/>
-                <w:szCs w:val="20"/>
-                <w:lang w:eastAsia="es-CL"/>
-              </w:rPr>
-              <w:t xml:space="preserve">actividades </w:t>
-            </w:r>
-            <w:r>
-              <w:rPr>
-                <w:rFonts w:ascii="Calibri" w:hAnsi="Calibri" w:cs="Arial"/>
-                <w:i/>
-                <w:color w:val="548DD4"/>
-                <w:sz w:val="20"/>
-                <w:szCs w:val="20"/>
-                <w:lang w:eastAsia="es-CL"/>
-              </w:rPr>
-              <w:t>del proyecto has llevado a cabo y qué objetivos específicos has cumplido hasta el minuto y de qué manera.</w:t>
+                <w:iCs/>
+                <w:color w:val="000000" w:themeColor="text1"/>
+                <w:sz w:val="20"/>
+                <w:szCs w:val="20"/>
+                <w:lang w:eastAsia="es-CL"/>
+              </w:rPr>
+            </w:pPr>
+            <w:r>
+              <w:rPr>
+                <w:rFonts w:ascii="Calibri" w:hAnsi="Calibri" w:cs="Arial"/>
+                <w:iCs/>
+                <w:color w:val="000000" w:themeColor="text1"/>
+                <w:sz w:val="20"/>
+                <w:szCs w:val="20"/>
+                <w:lang w:eastAsia="es-CL"/>
+              </w:rPr>
+              <w:t xml:space="preserve">Hasta el 20 de octubre de 2026, los avances del proyecto </w:t>
+            </w:r>
+            <w:proofErr w:type="spellStart"/>
+            <w:r>
+              <w:rPr>
+                <w:rFonts w:ascii="Calibri" w:hAnsi="Calibri" w:cs="Arial"/>
+                <w:iCs/>
+                <w:color w:val="000000" w:themeColor="text1"/>
+                <w:sz w:val="20"/>
+                <w:szCs w:val="20"/>
+                <w:lang w:eastAsia="es-CL"/>
+              </w:rPr>
+              <w:t>TresStock</w:t>
+            </w:r>
+            <w:proofErr w:type="spellEnd"/>
+            <w:r>
+              <w:rPr>
+                <w:rFonts w:ascii="Calibri" w:hAnsi="Calibri" w:cs="Arial"/>
+                <w:iCs/>
+                <w:color w:val="000000" w:themeColor="text1"/>
+                <w:sz w:val="20"/>
+                <w:szCs w:val="20"/>
+                <w:lang w:eastAsia="es-CL"/>
+              </w:rPr>
+              <w:t xml:space="preserve"> se han enfocado en desarrollar e implementar las funcionalidades básicas del sistema, con el objetivo de contar con una plataforma funcional que permita complementar la gestión de inventario del </w:t>
+            </w:r>
+            <w:proofErr w:type="spellStart"/>
+            <w:r>
+              <w:rPr>
+                <w:rFonts w:ascii="Calibri" w:hAnsi="Calibri" w:cs="Arial"/>
+                <w:iCs/>
+                <w:color w:val="000000" w:themeColor="text1"/>
+                <w:sz w:val="20"/>
+                <w:szCs w:val="20"/>
+                <w:lang w:eastAsia="es-CL"/>
+              </w:rPr>
+              <w:t>minimarket</w:t>
+            </w:r>
+            <w:proofErr w:type="spellEnd"/>
+            <w:r>
+              <w:rPr>
+                <w:rFonts w:ascii="Calibri" w:hAnsi="Calibri" w:cs="Arial"/>
+                <w:iCs/>
+                <w:color w:val="000000" w:themeColor="text1"/>
+                <w:sz w:val="20"/>
+                <w:szCs w:val="20"/>
+                <w:lang w:eastAsia="es-CL"/>
+              </w:rPr>
+              <w:t xml:space="preserve"> Los Tres.</w:t>
             </w:r>
           </w:p>
           <w:p>
@@ -764,23 +703,119 @@
               <w:jc w:val="both"/>
               <w:rPr>
                 <w:rFonts w:ascii="Calibri" w:hAnsi="Calibri" w:cs="Arial"/>
-                <w:i/>
-                <w:color w:val="548DD4"/>
-                <w:sz w:val="20"/>
-                <w:szCs w:val="20"/>
-                <w:lang w:eastAsia="es-CL"/>
-              </w:rPr>
-            </w:pPr>
-            <w:r>
-              <w:rPr>
-                <w:rFonts w:ascii="Calibri" w:hAnsi="Calibri" w:cs="Arial"/>
-                <w:i/>
-                <w:color w:val="548DD4"/>
-                <w:sz w:val="20"/>
-                <w:szCs w:val="20"/>
-                <w:lang w:eastAsia="es-CL"/>
-              </w:rPr>
-              <w:t>En caso que hayas realizado ajustes a los objetivos o metodología, debes incluir dichos apartados nuevamente en este informe, señalando cuáles son dichos ajustes.</w:t>
+                <w:iCs/>
+                <w:color w:val="000000" w:themeColor="text1"/>
+                <w:sz w:val="20"/>
+                <w:szCs w:val="20"/>
+                <w:lang w:eastAsia="es-CL"/>
+              </w:rPr>
+            </w:pPr>
+            <w:r>
+              <w:rPr>
+                <w:rFonts w:ascii="Calibri" w:hAnsi="Calibri" w:cs="Arial"/>
+                <w:iCs/>
+                <w:color w:val="000000" w:themeColor="text1"/>
+                <w:sz w:val="20"/>
+                <w:szCs w:val="20"/>
+                <w:lang w:eastAsia="es-CL"/>
+              </w:rPr>
+              <w:t xml:space="preserve">Entre las actividades realizadas, se encuentra la implementación de la importación de archivos CSV provenientes del sistema de gestión </w:t>
+            </w:r>
+            <w:proofErr w:type="spellStart"/>
+            <w:r>
+              <w:rPr>
+                <w:rFonts w:ascii="Calibri" w:hAnsi="Calibri" w:cs="Arial"/>
+                <w:iCs/>
+                <w:color w:val="000000" w:themeColor="text1"/>
+                <w:sz w:val="20"/>
+                <w:szCs w:val="20"/>
+                <w:lang w:eastAsia="es-CL"/>
+              </w:rPr>
+              <w:t>DimaSoft</w:t>
+            </w:r>
+            <w:proofErr w:type="spellEnd"/>
+            <w:r>
+              <w:rPr>
+                <w:rFonts w:ascii="Calibri" w:hAnsi="Calibri" w:cs="Arial"/>
+                <w:iCs/>
+                <w:color w:val="000000" w:themeColor="text1"/>
+                <w:sz w:val="20"/>
+                <w:szCs w:val="20"/>
+                <w:lang w:eastAsia="es-CL"/>
+              </w:rPr>
+              <w:t>, lo que permite incorporar los datos existentes al sistema desarrollado. Asimismo, se ha avanzado en el desarrollo de los módulos de inventario, gestión de proveedores, inicio de sesión e historial de ventas, estableciendo las funcionalidades principales para la administración y consulta de la información.</w:t>
+            </w:r>
+          </w:p>
+          <w:p>
+            <w:pPr>
+              <w:jc w:val="both"/>
+              <w:rPr>
+                <w:rFonts w:ascii="Calibri" w:hAnsi="Calibri" w:cs="Arial"/>
+                <w:iCs/>
+                <w:color w:val="000000" w:themeColor="text1"/>
+                <w:sz w:val="20"/>
+                <w:szCs w:val="20"/>
+                <w:lang w:eastAsia="es-CL"/>
+              </w:rPr>
+            </w:pPr>
+            <w:r>
+              <w:rPr>
+                <w:rFonts w:ascii="Calibri" w:hAnsi="Calibri" w:cs="Arial"/>
+                <w:iCs/>
+                <w:color w:val="000000" w:themeColor="text1"/>
+                <w:sz w:val="20"/>
+                <w:szCs w:val="20"/>
+                <w:lang w:eastAsia="es-CL"/>
+              </w:rPr>
+              <w:t>Estos avances permiten progresar en el cumplimiento de los objetivos específicos relacionados con la integración de los datos del sistema de gestión existente y el desarrollo de una plataforma que facilite el control del inventario y el seguimiento de las ventas. El trabajo se ha centrado en priorizar las funcionalidades esenciales para disponer de una base operativa sobre la cual continuar incorporando mejoras.</w:t>
+            </w:r>
+          </w:p>
+          <w:p>
+            <w:pPr>
+              <w:jc w:val="both"/>
+              <w:rPr>
+                <w:rFonts w:ascii="Calibri" w:hAnsi="Calibri" w:cs="Arial"/>
+                <w:iCs/>
+                <w:color w:val="000000" w:themeColor="text1"/>
+                <w:sz w:val="20"/>
+                <w:szCs w:val="20"/>
+                <w:lang w:eastAsia="es-CL"/>
+              </w:rPr>
+            </w:pPr>
+            <w:r>
+              <w:rPr>
+                <w:rFonts w:ascii="Calibri" w:hAnsi="Calibri" w:cs="Arial"/>
+                <w:iCs/>
+                <w:color w:val="000000" w:themeColor="text1"/>
+                <w:sz w:val="20"/>
+                <w:szCs w:val="20"/>
+                <w:lang w:eastAsia="es-CL"/>
+              </w:rPr>
+              <w:t>Sin embargo, el desarrollo del proyecto ha experimentado retrasos debido a la realización paralela de la práctica profesional, lo que ha reducido el tiempo disponible para trabajar en el APT. Esta situación ha provocado que varias actividades planificadas en la carta Gantt presenten retrasos respecto de su programación inicial. Se contempla retomar dichas actividades una vez finalizada la práctica profesional, con el propósito de avanzar en las tareas pendientes y continuar con el desarrollo e integración de las funcionalidades restantes.</w:t>
+            </w:r>
+          </w:p>
+          <w:p>
+            <w:pPr>
+              <w:jc w:val="both"/>
+              <w:rPr>
+                <w:rFonts w:ascii="Calibri" w:hAnsi="Calibri" w:cs="Arial"/>
+                <w:iCs/>
+                <w:color w:val="000000" w:themeColor="text1"/>
+                <w:sz w:val="20"/>
+                <w:szCs w:val="20"/>
+                <w:lang w:eastAsia="es-CL"/>
+              </w:rPr>
+            </w:pPr>
+            <w:r>
+              <w:rPr>
+                <w:rFonts w:ascii="Calibri" w:hAnsi="Calibri" w:cs="Arial"/>
+                <w:iCs/>
+                <w:color w:val="000000" w:themeColor="text1"/>
+                <w:sz w:val="20"/>
+                <w:szCs w:val="20"/>
+                <w:lang w:eastAsia="es-CL"/>
+              </w:rPr>
+              <w:t>En cuanto a los objetivos y la metodología, se mantiene el enfoque original del proyecto, priorizando el desarrollo progresivo de las funcionalidades esenciales. No obstante, será necesario considerar los retrasos en la planificación de las actividades pendientes y reorganizar su ejecución para facilitar la continuidad del proyecto.</w:t>
             </w:r>
           </w:p>
         </w:tc>
@@ -806,6 +841,7 @@
                 <w:rFonts w:ascii="Calibri" w:hAnsi="Calibri"/>
                 <w:color w:val="1F3864" w:themeColor="accent1" w:themeShade="80"/>
               </w:rPr>
+              <w:lastRenderedPageBreak/>
               <w:t>Objetivos</w:t>
             </w:r>
           </w:p>
@@ -820,24 +856,72 @@
               <w:jc w:val="both"/>
               <w:rPr>
                 <w:rFonts w:ascii="Calibri" w:hAnsi="Calibri" w:cs="Arial"/>
+                <w:iCs/>
+                <w:color w:val="000000" w:themeColor="text1"/>
+                <w:sz w:val="20"/>
+                <w:szCs w:val="20"/>
+                <w:lang w:eastAsia="es-CL"/>
+              </w:rPr>
+            </w:pPr>
+            <w:r>
+              <w:rPr>
+                <w:rFonts w:ascii="Calibri" w:hAnsi="Calibri" w:cs="Arial"/>
+                <w:iCs/>
+                <w:color w:val="000000" w:themeColor="text1"/>
+                <w:sz w:val="20"/>
+                <w:szCs w:val="20"/>
+                <w:lang w:eastAsia="es-CL"/>
+              </w:rPr>
+              <w:t xml:space="preserve">Se mantiene el objetivo general y los objetivos específicos establecidos inicialmente para el proyecto </w:t>
+            </w:r>
+            <w:proofErr w:type="spellStart"/>
+            <w:r>
+              <w:rPr>
+                <w:rFonts w:ascii="Calibri" w:hAnsi="Calibri" w:cs="Arial"/>
+                <w:iCs/>
+                <w:color w:val="000000" w:themeColor="text1"/>
+                <w:sz w:val="20"/>
+                <w:szCs w:val="20"/>
+                <w:lang w:eastAsia="es-CL"/>
+              </w:rPr>
+              <w:t>TresStock</w:t>
+            </w:r>
+            <w:proofErr w:type="spellEnd"/>
+            <w:r>
+              <w:rPr>
+                <w:rFonts w:ascii="Calibri" w:hAnsi="Calibri" w:cs="Arial"/>
+                <w:iCs/>
+                <w:color w:val="000000" w:themeColor="text1"/>
+                <w:sz w:val="20"/>
+                <w:szCs w:val="20"/>
+                <w:lang w:eastAsia="es-CL"/>
+              </w:rPr>
+              <w:t>. Sin embargo, debido a los retrasos ocasionados por la realización paralela de la práctica profesional, se contempla ajustar la planificación de las actividades pendientes de la carta Gantt, retomando su ejecución una vez finalizada dicha práctica.</w:t>
+            </w:r>
+          </w:p>
+          <w:p>
+            <w:pPr>
+              <w:jc w:val="both"/>
+              <w:rPr>
+                <w:rFonts w:ascii="Calibri" w:hAnsi="Calibri" w:cs="Arial"/>
                 <w:b/>
-                <w:i/>
-                <w:color w:val="548DD4"/>
-                <w:sz w:val="20"/>
-                <w:szCs w:val="20"/>
-                <w:lang w:eastAsia="es-CL"/>
-              </w:rPr>
-            </w:pPr>
-            <w:r>
-              <w:rPr>
-                <w:rFonts w:ascii="Calibri" w:hAnsi="Calibri" w:cs="Arial"/>
-                <w:i/>
-                <w:color w:val="548DD4"/>
-                <w:sz w:val="20"/>
-                <w:szCs w:val="20"/>
-                <w:lang w:eastAsia="es-CL"/>
-              </w:rPr>
-              <w:t>Opcional en caso de ajuste</w:t>
+                <w:iCs/>
+                <w:color w:val="548DD4"/>
+                <w:sz w:val="20"/>
+                <w:szCs w:val="20"/>
+                <w:lang w:eastAsia="es-CL"/>
+              </w:rPr>
+            </w:pPr>
+            <w:r>
+              <w:rPr>
+                <w:rFonts w:ascii="Calibri" w:hAnsi="Calibri" w:cs="Arial"/>
+                <w:iCs/>
+                <w:color w:val="000000" w:themeColor="text1"/>
+                <w:sz w:val="20"/>
+                <w:szCs w:val="20"/>
+                <w:lang w:eastAsia="es-CL"/>
+              </w:rPr>
+              <w:t>Este ajuste no modifica los objetivos del proyecto, sino que busca reorganizar los plazos de trabajo para completar las funcionalidades restantes, integrar los módulos desarrollados y verificar el correcto funcionamiento del sistema.</w:t>
             </w:r>
           </w:p>
         </w:tc>
@@ -877,23 +961,23 @@
               <w:jc w:val="both"/>
               <w:rPr>
                 <w:rFonts w:ascii="Calibri" w:hAnsi="Calibri" w:cs="Arial"/>
-                <w:i/>
-                <w:color w:val="548DD4"/>
-                <w:sz w:val="20"/>
-                <w:szCs w:val="20"/>
-                <w:lang w:eastAsia="es-CL"/>
-              </w:rPr>
-            </w:pPr>
-            <w:r>
-              <w:rPr>
-                <w:rFonts w:ascii="Calibri" w:hAnsi="Calibri" w:cs="Arial"/>
-                <w:i/>
-                <w:color w:val="548DD4"/>
-                <w:sz w:val="20"/>
-                <w:szCs w:val="20"/>
-                <w:lang w:eastAsia="es-CL"/>
-              </w:rPr>
-              <w:t>Opcional en caso de ajuste</w:t>
+                <w:iCs/>
+                <w:color w:val="000000" w:themeColor="text1"/>
+                <w:sz w:val="20"/>
+                <w:szCs w:val="20"/>
+                <w:lang w:eastAsia="es-CL"/>
+              </w:rPr>
+            </w:pPr>
+            <w:r>
+              <w:rPr>
+                <w:rFonts w:ascii="Calibri" w:hAnsi="Calibri" w:cs="Arial"/>
+                <w:iCs/>
+                <w:color w:val="000000" w:themeColor="text1"/>
+                <w:sz w:val="20"/>
+                <w:szCs w:val="20"/>
+                <w:lang w:eastAsia="es-CL"/>
+              </w:rPr>
+              <w:t>SIN MODIFICAR</w:t>
             </w:r>
           </w:p>
         </w:tc>
@@ -1304,8 +1388,8 @@
     <w:tbl>
       <w:tblPr>
         <w:tblStyle w:val="Tablaconcuadrcula"/>
-        <w:tblpPr w:leftFromText="141" w:rightFromText="141" w:vertAnchor="text" w:horzAnchor="margin" w:tblpX="-719" w:tblpY="-116"/>
-        <w:tblW w:w="9640" w:type="dxa"/>
+        <w:tblpPr w:leftFromText="141" w:rightFromText="141" w:vertAnchor="text" w:horzAnchor="margin" w:tblpX="-582" w:tblpY="-116"/>
+        <w:tblW w:w="9503" w:type="dxa"/>
         <w:tblBorders>
           <w:top w:val="single" w:sz="4" w:space="0" w:color="BFBFBF" w:themeColor="background1" w:themeShade="BF"/>
           <w:left w:val="single" w:sz="4" w:space="0" w:color="BFBFBF" w:themeColor="background1" w:themeShade="BF"/>
@@ -1317,7 +1401,7 @@
         <w:tblLook w:val="04A0" w:firstRow="1" w:lastRow="0" w:firstColumn="1" w:lastColumn="0" w:noHBand="0" w:noVBand="1"/>
       </w:tblPr>
       <w:tblGrid>
-        <w:gridCol w:w="9640"/>
+        <w:gridCol w:w="9503"/>
       </w:tblGrid>
       <w:tr>
         <w:trPr>
@@ -1325,7 +1409,7 @@
         </w:trPr>
         <w:tc>
           <w:tcPr>
-            <w:tcW w:w="9640" w:type="dxa"/>
+            <w:tcW w:w="9503" w:type="dxa"/>
             <w:vAlign w:val="center"/>
           </w:tcPr>
           <w:p>
@@ -1344,7 +1428,6 @@
                 <w:sz w:val="28"/>
                 <w:szCs w:val="28"/>
               </w:rPr>
-              <w:lastRenderedPageBreak/>
               <w:t>2</w:t>
             </w:r>
             <w:r>
@@ -1374,7 +1457,7 @@
         </w:trPr>
         <w:tc>
           <w:tcPr>
-            <w:tcW w:w="9640" w:type="dxa"/>
+            <w:tcW w:w="9503" w:type="dxa"/>
             <w:shd w:val="clear" w:color="auto" w:fill="D9E2F3" w:themeFill="accent1" w:themeFillTint="33"/>
             <w:vAlign w:val="center"/>
           </w:tcPr>
@@ -1474,6 +1557,7 @@
                 <w:color w:val="1F3864" w:themeColor="accent1" w:themeShade="80"/>
                 <w:sz w:val="18"/>
               </w:rPr>
+              <w:lastRenderedPageBreak/>
               <w:t>Plan de Trabajo</w:t>
             </w:r>
           </w:p>
@@ -2559,141 +2643,116 @@
               </w:rPr>
               <w:t xml:space="preserve">: </w:t>
             </w:r>
-            <w:r>
-              <w:rPr>
-                <w:rFonts w:ascii="Calibri" w:hAnsi="Calibri" w:cs="Arial"/>
-                <w:i/>
-                <w:iCs/>
-                <w:color w:val="548DD4"/>
-                <w:sz w:val="20"/>
-                <w:szCs w:val="20"/>
-                <w:lang w:eastAsia="es-CL"/>
-              </w:rPr>
-              <w:t>Describe los factores que han facilitado y</w:t>
-            </w:r>
-            <w:r>
-              <w:rPr>
-                <w:rFonts w:ascii="Calibri" w:hAnsi="Calibri" w:cs="Arial"/>
-                <w:i/>
-                <w:iCs/>
-                <w:color w:val="548DD4"/>
-                <w:sz w:val="20"/>
-                <w:szCs w:val="20"/>
-                <w:lang w:eastAsia="es-CL"/>
-              </w:rPr>
-              <w:t>/o</w:t>
-            </w:r>
-            <w:r>
-              <w:rPr>
-                <w:rFonts w:ascii="Calibri" w:hAnsi="Calibri" w:cs="Arial"/>
-                <w:i/>
-                <w:iCs/>
-                <w:color w:val="548DD4"/>
-                <w:sz w:val="20"/>
-                <w:szCs w:val="20"/>
-                <w:lang w:eastAsia="es-CL"/>
-              </w:rPr>
-              <w:t xml:space="preserve"> dificultado el desarrollo de tu Proyecto APT hasta ahora. En el caso de las dificultades</w:t>
-            </w:r>
-            <w:r>
-              <w:rPr>
-                <w:rFonts w:ascii="Calibri" w:hAnsi="Calibri" w:cs="Arial"/>
-                <w:i/>
-                <w:iCs/>
-                <w:color w:val="548DD4"/>
-                <w:sz w:val="20"/>
-                <w:szCs w:val="20"/>
-                <w:lang w:eastAsia="es-CL"/>
-              </w:rPr>
-              <w:t xml:space="preserve"> debes describir</w:t>
-            </w:r>
-            <w:r>
-              <w:rPr>
-                <w:rFonts w:ascii="Calibri" w:hAnsi="Calibri" w:cs="Arial"/>
-                <w:i/>
-                <w:iCs/>
-                <w:color w:val="548DD4"/>
-                <w:sz w:val="20"/>
-                <w:szCs w:val="20"/>
-                <w:lang w:eastAsia="es-CL"/>
-              </w:rPr>
-              <w:t xml:space="preserve"> qué acciones tomaste y/o tomarás para </w:t>
-            </w:r>
-            <w:r>
-              <w:rPr>
-                <w:rFonts w:ascii="Calibri" w:hAnsi="Calibri" w:cs="Arial"/>
-                <w:i/>
-                <w:iCs/>
-                <w:color w:val="548DD4"/>
-                <w:sz w:val="20"/>
-                <w:szCs w:val="20"/>
-                <w:lang w:eastAsia="es-CL"/>
-              </w:rPr>
-              <w:t xml:space="preserve">solucionarlas. </w:t>
-            </w:r>
-            <w:r>
-              <w:rPr>
-                <w:rFonts w:ascii="Calibri" w:hAnsi="Calibri"/>
-                <w:b/>
-                <w:color w:val="1F3864" w:themeColor="accent1" w:themeShade="80"/>
-              </w:rPr>
-              <w:t xml:space="preserve"> </w:t>
-            </w:r>
-          </w:p>
-          <w:p>
-            <w:pPr>
-              <w:rPr>
-                <w:rFonts w:ascii="Calibri" w:hAnsi="Calibri"/>
-                <w:color w:val="1F3864" w:themeColor="accent1" w:themeShade="80"/>
-              </w:rPr>
-            </w:pPr>
-          </w:p>
-          <w:p>
-            <w:pPr>
-              <w:rPr>
-                <w:rFonts w:ascii="Calibri" w:hAnsi="Calibri"/>
-                <w:color w:val="1F3864" w:themeColor="accent1" w:themeShade="80"/>
-              </w:rPr>
-            </w:pPr>
           </w:p>
           <w:p>
             <w:pPr>
               <w:jc w:val="both"/>
               <w:rPr>
                 <w:rFonts w:ascii="Calibri" w:hAnsi="Calibri" w:cs="Arial"/>
-                <w:i/>
-                <w:color w:val="548DD4"/>
-                <w:sz w:val="20"/>
-                <w:szCs w:val="20"/>
-                <w:lang w:eastAsia="es-CL"/>
-              </w:rPr>
-            </w:pPr>
+                <w:color w:val="000000" w:themeColor="text1"/>
+                <w:sz w:val="20"/>
+                <w:szCs w:val="20"/>
+                <w:lang w:eastAsia="es-CL"/>
+              </w:rPr>
+            </w:pPr>
+            <w:r>
+              <w:rPr>
+                <w:rFonts w:ascii="Calibri" w:hAnsi="Calibri" w:cs="Arial"/>
+                <w:color w:val="000000" w:themeColor="text1"/>
+                <w:sz w:val="20"/>
+                <w:szCs w:val="20"/>
+                <w:lang w:eastAsia="es-CL"/>
+              </w:rPr>
+              <w:t xml:space="preserve">Entre los factores que han facilitado el desarrollo del proyecto APT se encuentra el avance progresivo en la implementación de las funcionalidades principales de </w:t>
+            </w:r>
+            <w:proofErr w:type="spellStart"/>
+            <w:r>
+              <w:rPr>
+                <w:rFonts w:ascii="Calibri" w:hAnsi="Calibri" w:cs="Arial"/>
+                <w:color w:val="000000" w:themeColor="text1"/>
+                <w:sz w:val="20"/>
+                <w:szCs w:val="20"/>
+                <w:lang w:eastAsia="es-CL"/>
+              </w:rPr>
+              <w:t>TresStock</w:t>
+            </w:r>
+            <w:proofErr w:type="spellEnd"/>
+            <w:r>
+              <w:rPr>
+                <w:rFonts w:ascii="Calibri" w:hAnsi="Calibri" w:cs="Arial"/>
+                <w:color w:val="000000" w:themeColor="text1"/>
+                <w:sz w:val="20"/>
+                <w:szCs w:val="20"/>
+                <w:lang w:eastAsia="es-CL"/>
+              </w:rPr>
+              <w:t xml:space="preserve">, como la importación de archivos CSV provenientes de </w:t>
+            </w:r>
+            <w:proofErr w:type="spellStart"/>
+            <w:r>
+              <w:rPr>
+                <w:rFonts w:ascii="Calibri" w:hAnsi="Calibri" w:cs="Arial"/>
+                <w:color w:val="000000" w:themeColor="text1"/>
+                <w:sz w:val="20"/>
+                <w:szCs w:val="20"/>
+                <w:lang w:eastAsia="es-CL"/>
+              </w:rPr>
+              <w:t>DimaSoft</w:t>
+            </w:r>
+            <w:proofErr w:type="spellEnd"/>
+            <w:r>
+              <w:rPr>
+                <w:rFonts w:ascii="Calibri" w:hAnsi="Calibri" w:cs="Arial"/>
+                <w:color w:val="000000" w:themeColor="text1"/>
+                <w:sz w:val="20"/>
+                <w:szCs w:val="20"/>
+                <w:lang w:eastAsia="es-CL"/>
+              </w:rPr>
+              <w:t>, el sistema de inventario, la gestión de proveedores, el inicio de sesión y el historial de ventas. Estos avances han permitido establecer una base funcional para continuar con el desarrollo e integración de los distintos módulos.</w:t>
+            </w:r>
           </w:p>
           <w:p>
             <w:pPr>
               <w:jc w:val="both"/>
               <w:rPr>
                 <w:rFonts w:ascii="Calibri" w:hAnsi="Calibri" w:cs="Arial"/>
-                <w:i/>
-                <w:color w:val="548DD4"/>
-                <w:sz w:val="20"/>
-                <w:szCs w:val="20"/>
-                <w:lang w:eastAsia="es-CL"/>
-              </w:rPr>
-            </w:pPr>
+                <w:color w:val="000000" w:themeColor="text1"/>
+                <w:sz w:val="20"/>
+                <w:szCs w:val="20"/>
+                <w:lang w:eastAsia="es-CL"/>
+              </w:rPr>
+            </w:pPr>
+            <w:r>
+              <w:rPr>
+                <w:rFonts w:ascii="Calibri" w:hAnsi="Calibri" w:cs="Arial"/>
+                <w:color w:val="000000" w:themeColor="text1"/>
+                <w:sz w:val="20"/>
+                <w:szCs w:val="20"/>
+                <w:lang w:eastAsia="es-CL"/>
+              </w:rPr>
+              <w:t>Por otra parte, el principal factor que ha dificultado el cumplimiento de la planificación ha sido la realización paralela de la práctica profesional, debido a que ha reducido el tiempo disponible para trabajar en el proyecto y ha generado retrasos en algunas actividades establecidas en la carta Gantt.</w:t>
+            </w:r>
           </w:p>
           <w:p>
             <w:pPr>
               <w:jc w:val="both"/>
               <w:rPr>
                 <w:rFonts w:ascii="Calibri" w:hAnsi="Calibri" w:cs="Arial"/>
-                <w:i/>
-                <w:color w:val="548DD4"/>
-                <w:sz w:val="20"/>
-                <w:szCs w:val="20"/>
-                <w:lang w:eastAsia="es-CL"/>
-              </w:rPr>
-            </w:pPr>
+                <w:color w:val="000000" w:themeColor="text1"/>
+                <w:sz w:val="20"/>
+                <w:szCs w:val="20"/>
+                <w:lang w:eastAsia="es-CL"/>
+              </w:rPr>
+            </w:pPr>
+            <w:r>
+              <w:rPr>
+                <w:rFonts w:ascii="Calibri" w:hAnsi="Calibri" w:cs="Arial"/>
+                <w:color w:val="000000" w:themeColor="text1"/>
+                <w:sz w:val="20"/>
+                <w:szCs w:val="20"/>
+                <w:lang w:eastAsia="es-CL"/>
+              </w:rPr>
+              <w:t>Para abordar esta dificultad, se contempla retomar las actividades pendientes una vez finalizada la práctica profesional, reorganizando los tiempos de trabajo y priorizando las tareas según su importancia para el cumplimiento de los objetivos. De esta manera, se busca avanzar en las funcionalidades restantes, mejorar la integración entre los módulos y verificar el correcto funcionamiento del sistema.</w:t>
+            </w:r>
           </w:p>
         </w:tc>
       </w:tr>
@@ -2753,7 +2812,6 @@
                 <w:rFonts w:ascii="Calibri" w:hAnsi="Calibri"/>
                 <w:color w:val="1F3864" w:themeColor="accent1" w:themeShade="80"/>
               </w:rPr>
-              <w:lastRenderedPageBreak/>
               <w:t xml:space="preserve">Actividades ajustadas o eliminadas: </w:t>
             </w:r>
             <w:r>
@@ -3151,7 +3209,31 @@
                 <w:szCs w:val="20"/>
                 <w:lang w:eastAsia="es-CL"/>
               </w:rPr>
-              <w:t xml:space="preserve"> de acuerdo a tu planificación</w:t>
+              <w:t xml:space="preserve"> </w:t>
+            </w:r>
+            <w:proofErr w:type="gramStart"/>
+            <w:r>
+              <w:rPr>
+                <w:rFonts w:ascii="Calibri" w:hAnsi="Calibri" w:cs="Arial"/>
+                <w:i/>
+                <w:color w:val="548DD4"/>
+                <w:sz w:val="20"/>
+                <w:szCs w:val="20"/>
+                <w:lang w:eastAsia="es-CL"/>
+              </w:rPr>
+              <w:t>de acuerdo a</w:t>
+            </w:r>
+            <w:proofErr w:type="gramEnd"/>
+            <w:r>
+              <w:rPr>
+                <w:rFonts w:ascii="Calibri" w:hAnsi="Calibri" w:cs="Arial"/>
+                <w:i/>
+                <w:color w:val="548DD4"/>
+                <w:sz w:val="20"/>
+                <w:szCs w:val="20"/>
+                <w:lang w:eastAsia="es-CL"/>
+              </w:rPr>
+              <w:t xml:space="preserve"> tu planificación</w:t>
             </w:r>
             <w:r>
               <w:rPr>
@@ -3311,7 +3393,7 @@
 </file>
 
 <file path=word/endnotes.xml><?xml version="1.0" encoding="utf-8"?>
-<w:endnotes xmlns:wpc="http://schemas.microsoft.com/office/word/2010/wordprocessingCanvas" xmlns:cx="http://schemas.microsoft.com/office/drawing/2014/chartex" xmlns:mc="http://schemas.openxmlformats.org/markup-compatibility/2006" xmlns:o="urn:schemas-microsoft-com:office:office" xmlns:r="http://schemas.openxmlformats.org/officeDocument/2006/relationships" xmlns:m="http://schemas.openxmlformats.org/officeDocument/2006/math" xmlns:v="urn:schemas-microsoft-com:vml" xmlns:wp14="http://schemas.microsoft.com/office/word/2010/wordprocessingDrawing" xmlns:wp="http://schemas.openxmlformats.org/drawingml/2006/wordprocessingDrawing" xmlns:w10="urn:schemas-microsoft-com:office:word" xmlns:w="http://schemas.openxmlformats.org/wordprocessingml/2006/main" xmlns:w14="http://schemas.microsoft.com/office/word/2010/wordml" xmlns:w15="http://schemas.microsoft.com/office/word/2012/wordml" xmlns:w16se="http://schemas.microsoft.com/office/word/2015/wordml/symex" xmlns:wpg="http://schemas.microsoft.com/office/word/2010/wordprocessingGroup" xmlns:wpi="http://schemas.microsoft.com/office/word/2010/wordprocessingInk" xmlns:wne="http://schemas.microsoft.com/office/word/2006/wordml" xmlns:wps="http://schemas.microsoft.com/office/word/2010/wordprocessingShape" mc:Ignorable="w14 w15 w16se wp14">
+<w:endnotes xmlns:wpc="http://schemas.microsoft.com/office/word/2010/wordprocessingCanvas" xmlns:cx="http://schemas.microsoft.com/office/drawing/2014/chartex" xmlns:cx1="http://schemas.microsoft.com/office/drawing/2015/9/8/chartex" xmlns:cx2="http://schemas.microsoft.com/office/drawing/2015/10/21/chartex" xmlns:cx3="http://schemas.microsoft.com/office/drawing/2016/5/9/chartex" xmlns:cx4="http://schemas.microsoft.com/office/drawing/2016/5/10/chartex" xmlns:cx5="http://schemas.microsoft.com/office/drawing/2016/5/11/chartex" xmlns:cx6="http://schemas.microsoft.com/office/drawing/2016/5/12/chartex" xmlns:cx7="http://schemas.microsoft.com/office/drawing/2016/5/13/chartex" xmlns:cx8="http://schemas.microsoft.com/office/drawing/2016/5/14/chartex" xmlns:mc="http://schemas.openxmlformats.org/markup-compatibility/2006" xmlns:aink="http://schemas.microsoft.com/office/drawing/2016/ink" xmlns:am3d="http://schemas.microsoft.com/office/drawing/2017/model3d" xmlns:o="urn:schemas-microsoft-com:office:office" xmlns:oel="http://schemas.microsoft.com/office/2019/extlst" xmlns:r="http://schemas.openxmlformats.org/officeDocument/2006/relationships" xmlns:m="http://schemas.openxmlformats.org/officeDocument/2006/math" xmlns:v="urn:schemas-microsoft-com:vml" xmlns:wp14="http://schemas.microsoft.com/office/word/2010/wordprocessingDrawing" xmlns:wp="http://schemas.openxmlformats.org/drawingml/2006/wordprocessingDrawing" xmlns:w10="urn:schemas-microsoft-com:office:word" xmlns:w="http://schemas.openxmlformats.org/wordprocessingml/2006/main" xmlns:w14="http://schemas.microsoft.com/office/word/2010/wordml" xmlns:w15="http://schemas.microsoft.com/office/word/2012/wordml" xmlns:w16cex="http://schemas.microsoft.com/office/word/2018/wordml/cex" xmlns:w16cid="http://schemas.microsoft.com/office/word/2016/wordml/cid" xmlns:w16="http://schemas.microsoft.com/office/word/2018/wordml" xmlns:w16du="http://schemas.microsoft.com/office/word/2023/wordml/word16du" xmlns:w16sdtdh="http://schemas.microsoft.com/office/word/2020/wordml/sdtdatahash" xmlns:w16sdtfl="http://schemas.microsoft.com/office/word/2024/wordml/sdtformatlock" xmlns:w16se="http://schemas.microsoft.com/office/word/2015/wordml/symex" xmlns:wpg="http://schemas.microsoft.com/office/word/2010/wordprocessingGroup" xmlns:wpi="http://schemas.microsoft.com/office/word/2010/wordprocessingInk" xmlns:wne="http://schemas.microsoft.com/office/word/2006/wordml" xmlns:wps="http://schemas.microsoft.com/office/word/2010/wordprocessingShape" mc:Ignorable="w14 w15 w16se w16cid w16 w16cex w16sdtdh w16sdtfl w16du wp14">
   <w:endnote w:type="separator" w:id="-1">
     <w:p>
       <w:pPr>
@@ -3336,7 +3418,7 @@
 </file>
 
 <file path=word/footnotes.xml><?xml version="1.0" encoding="utf-8"?>
-<w:footnotes xmlns:wpc="http://schemas.microsoft.com/office/word/2010/wordprocessingCanvas" xmlns:cx="http://schemas.microsoft.com/office/drawing/2014/chartex" xmlns:mc="http://schemas.openxmlformats.org/markup-compatibility/2006" xmlns:o="urn:schemas-microsoft-com:office:office" xmlns:r="http://schemas.openxmlformats.org/officeDocument/2006/relationships" xmlns:m="http://schemas.openxmlformats.org/officeDocument/2006/math" xmlns:v="urn:schemas-microsoft-com:vml" xmlns:wp14="http://schemas.microsoft.com/office/word/2010/wordprocessingDrawing" xmlns:wp="http://schemas.openxmlformats.org/drawingml/2006/wordprocessingDrawing" xmlns:w10="urn:schemas-microsoft-com:office:word" xmlns:w="http://schemas.openxmlformats.org/wordprocessingml/2006/main" xmlns:w14="http://schemas.microsoft.com/office/word/2010/wordml" xmlns:w15="http://schemas.microsoft.com/office/word/2012/wordml" xmlns:w16se="http://schemas.microsoft.com/office/word/2015/wordml/symex" xmlns:wpg="http://schemas.microsoft.com/office/word/2010/wordprocessingGroup" xmlns:wpi="http://schemas.microsoft.com/office/word/2010/wordprocessingInk" xmlns:wne="http://schemas.microsoft.com/office/word/2006/wordml" xmlns:wps="http://schemas.microsoft.com/office/word/2010/wordprocessingShape" mc:Ignorable="w14 w15 w16se wp14">
+<w:footnotes xmlns:wpc="http://schemas.microsoft.com/office/word/2010/wordprocessingCanvas" xmlns:cx="http://schemas.microsoft.com/office/drawing/2014/chartex" xmlns:cx1="http://schemas.microsoft.com/office/drawing/2015/9/8/chartex" xmlns:cx2="http://schemas.microsoft.com/office/drawing/2015/10/21/chartex" xmlns:cx3="http://schemas.microsoft.com/office/drawing/2016/5/9/chartex" xmlns:cx4="http://schemas.microsoft.com/office/drawing/2016/5/10/chartex" xmlns:cx5="http://schemas.microsoft.com/office/drawing/2016/5/11/chartex" xmlns:cx6="http://schemas.microsoft.com/office/drawing/2016/5/12/chartex" xmlns:cx7="http://schemas.microsoft.com/office/drawing/2016/5/13/chartex" xmlns:cx8="http://schemas.microsoft.com/office/drawing/2016/5/14/chartex" xmlns:mc="http://schemas.openxmlformats.org/markup-compatibility/2006" xmlns:aink="http://schemas.microsoft.com/office/drawing/2016/ink" xmlns:am3d="http://schemas.microsoft.com/office/drawing/2017/model3d" xmlns:o="urn:schemas-microsoft-com:office:office" xmlns:oel="http://schemas.microsoft.com/office/2019/extlst" xmlns:r="http://schemas.openxmlformats.org/officeDocument/2006/relationships" xmlns:m="http://schemas.openxmlformats.org/officeDocument/2006/math" xmlns:v="urn:schemas-microsoft-com:vml" xmlns:wp14="http://schemas.microsoft.com/office/word/2010/wordprocessingDrawing" xmlns:wp="http://schemas.openxmlformats.org/drawingml/2006/wordprocessingDrawing" xmlns:w10="urn:schemas-microsoft-com:office:word" xmlns:w="http://schemas.openxmlformats.org/wordprocessingml/2006/main" xmlns:w14="http://schemas.microsoft.com/office/word/2010/wordml" xmlns:w15="http://schemas.microsoft.com/office/word/2012/wordml" xmlns:w16cex="http://schemas.microsoft.com/office/word/2018/wordml/cex" xmlns:w16cid="http://schemas.microsoft.com/office/word/2016/wordml/cid" xmlns:w16="http://schemas.microsoft.com/office/word/2018/wordml" xmlns:w16du="http://schemas.microsoft.com/office/word/2023/wordml/word16du" xmlns:w16sdtdh="http://schemas.microsoft.com/office/word/2020/wordml/sdtdatahash" xmlns:w16sdtfl="http://schemas.microsoft.com/office/word/2024/wordml/sdtformatlock" xmlns:w16se="http://schemas.microsoft.com/office/word/2015/wordml/symex" xmlns:wpg="http://schemas.microsoft.com/office/word/2010/wordprocessingGroup" xmlns:wpi="http://schemas.microsoft.com/office/word/2010/wordprocessingInk" xmlns:wne="http://schemas.microsoft.com/office/word/2006/wordml" xmlns:wps="http://schemas.microsoft.com/office/word/2010/wordprocessingShape" mc:Ignorable="w14 w15 w16se w16cid w16 w16cex w16sdtdh w16sdtfl w16du wp14">
   <w:footnote w:type="separator" w:id="-1">
     <w:p>
       <w:pPr>
@@ -3419,7 +3501,7 @@
 </file>
 
 <file path=word/header1.xml><?xml version="1.0" encoding="utf-8"?>
-<w:hdr xmlns:wpc="http://schemas.microsoft.com/office/word/2010/wordprocessingCanvas" xmlns:cx="http://schemas.microsoft.com/office/drawing/2014/chartex" xmlns:mc="http://schemas.openxmlformats.org/markup-compatibility/2006" xmlns:o="urn:schemas-microsoft-com:office:office" xmlns:r="http://schemas.openxmlformats.org/officeDocument/2006/relationships" xmlns:m="http://schemas.openxmlformats.org/officeDocument/2006/math" xmlns:v="urn:schemas-microsoft-com:vml" xmlns:wp14="http://schemas.microsoft.com/office/word/2010/wordprocessingDrawing" xmlns:wp="http://schemas.openxmlformats.org/drawingml/2006/wordprocessingDrawing" xmlns:w10="urn:schemas-microsoft-com:office:word" xmlns:w="http://schemas.openxmlformats.org/wordprocessingml/2006/main" xmlns:w14="http://schemas.microsoft.com/office/word/2010/wordml" xmlns:w15="http://schemas.microsoft.com/office/word/2012/wordml" xmlns:w16se="http://schemas.microsoft.com/office/word/2015/wordml/symex" xmlns:wpg="http://schemas.microsoft.com/office/word/2010/wordprocessingGroup" xmlns:wpi="http://schemas.microsoft.com/office/word/2010/wordprocessingInk" xmlns:wne="http://schemas.microsoft.com/office/word/2006/wordml" xmlns:wps="http://schemas.microsoft.com/office/word/2010/wordprocessingShape" mc:Ignorable="w14 w15 w16se wp14">
+<w:hdr xmlns:wpc="http://schemas.microsoft.com/office/word/2010/wordprocessingCanvas" xmlns:cx="http://schemas.microsoft.com/office/drawing/2014/chartex" xmlns:cx1="http://schemas.microsoft.com/office/drawing/2015/9/8/chartex" xmlns:cx2="http://schemas.microsoft.com/office/drawing/2015/10/21/chartex" xmlns:cx3="http://schemas.microsoft.com/office/drawing/2016/5/9/chartex" xmlns:cx4="http://schemas.microsoft.com/office/drawing/2016/5/10/chartex" xmlns:cx5="http://schemas.microsoft.com/office/drawing/2016/5/11/chartex" xmlns:cx6="http://schemas.microsoft.com/office/drawing/2016/5/12/chartex" xmlns:cx7="http://schemas.microsoft.com/office/drawing/2016/5/13/chartex" xmlns:cx8="http://schemas.microsoft.com/office/drawing/2016/5/14/chartex" xmlns:mc="http://schemas.openxmlformats.org/markup-compatibility/2006" xmlns:aink="http://schemas.microsoft.com/office/drawing/2016/ink" xmlns:am3d="http://schemas.microsoft.com/office/drawing/2017/model3d" xmlns:o="urn:schemas-microsoft-com:office:office" xmlns:oel="http://schemas.microsoft.com/office/2019/extlst" xmlns:r="http://schemas.openxmlformats.org/officeDocument/2006/relationships" xmlns:m="http://schemas.openxmlformats.org/officeDocument/2006/math" xmlns:v="urn:schemas-microsoft-com:vml" xmlns:wp14="http://schemas.microsoft.com/office/word/2010/wordprocessingDrawing" xmlns:wp="http://schemas.openxmlformats.org/drawingml/2006/wordprocessingDrawing" xmlns:w10="urn:schemas-microsoft-com:office:word" xmlns:w="http://schemas.openxmlformats.org/wordprocessingml/2006/main" xmlns:w14="http://schemas.microsoft.com/office/word/2010/wordml" xmlns:w15="http://schemas.microsoft.com/office/word/2012/wordml" xmlns:w16cex="http://schemas.microsoft.com/office/word/2018/wordml/cex" xmlns:w16cid="http://schemas.microsoft.com/office/word/2016/wordml/cid" xmlns:w16="http://schemas.microsoft.com/office/word/2018/wordml" xmlns:w16du="http://schemas.microsoft.com/office/word/2023/wordml/word16du" xmlns:w16sdtdh="http://schemas.microsoft.com/office/word/2020/wordml/sdtdatahash" xmlns:w16sdtfl="http://schemas.microsoft.com/office/word/2024/wordml/sdtformatlock" xmlns:w16se="http://schemas.microsoft.com/office/word/2015/wordml/symex" xmlns:wpg="http://schemas.microsoft.com/office/word/2010/wordprocessingGroup" xmlns:wpi="http://schemas.microsoft.com/office/word/2010/wordprocessingInk" xmlns:wne="http://schemas.microsoft.com/office/word/2006/wordml" xmlns:wps="http://schemas.microsoft.com/office/word/2010/wordprocessingShape" mc:Ignorable="w14 w15 w16se w16cid w16 w16cex w16sdtdh w16sdtfl w16du wp14">
   <w:tbl>
     <w:tblPr>
       <w:tblStyle w:val="Tablaconcuadrcula1"/>
@@ -3644,7 +3726,7 @@
 </file>
 
 <file path=word/numbering.xml><?xml version="1.0" encoding="utf-8"?>
-<w:numbering xmlns:wpc="http://schemas.microsoft.com/office/word/2010/wordprocessingCanvas" xmlns:cx="http://schemas.microsoft.com/office/drawing/2014/chartex" xmlns:mc="http://schemas.openxmlformats.org/markup-compatibility/2006" xmlns:o="urn:schemas-microsoft-com:office:office" xmlns:r="http://schemas.openxmlformats.org/officeDocument/2006/relationships" xmlns:m="http://schemas.openxmlformats.org/officeDocument/2006/math" xmlns:v="urn:schemas-microsoft-com:vml" xmlns:wp14="http://schemas.microsoft.com/office/word/2010/wordprocessingDrawing" xmlns:wp="http://schemas.openxmlformats.org/drawingml/2006/wordprocessingDrawing" xmlns:w10="urn:schemas-microsoft-com:office:word" xmlns:w="http://schemas.openxmlformats.org/wordprocessingml/2006/main" xmlns:w14="http://schemas.microsoft.com/office/word/2010/wordml" xmlns:w15="http://schemas.microsoft.com/office/word/2012/wordml" xmlns:w16se="http://schemas.microsoft.com/office/word/2015/wordml/symex" xmlns:wpg="http://schemas.microsoft.com/office/word/2010/wordprocessingGroup" xmlns:wpi="http://schemas.microsoft.com/office/word/2010/wordprocessingInk" xmlns:wne="http://schemas.microsoft.com/office/word/2006/wordml" xmlns:wps="http://schemas.microsoft.com/office/word/2010/wordprocessingShape" mc:Ignorable="w14 w15 w16se wp14">
+<w:numbering xmlns:wpc="http://schemas.microsoft.com/office/word/2010/wordprocessingCanvas" xmlns:cx="http://schemas.microsoft.com/office/drawing/2014/chartex" xmlns:cx1="http://schemas.microsoft.com/office/drawing/2015/9/8/chartex" xmlns:cx2="http://schemas.microsoft.com/office/drawing/2015/10/21/chartex" xmlns:cx3="http://schemas.microsoft.com/office/drawing/2016/5/9/chartex" xmlns:cx4="http://schemas.microsoft.com/office/drawing/2016/5/10/chartex" xmlns:cx5="http://schemas.microsoft.com/office/drawing/2016/5/11/chartex" xmlns:cx6="http://schemas.microsoft.com/office/drawing/2016/5/12/chartex" xmlns:cx7="http://schemas.microsoft.com/office/drawing/2016/5/13/chartex" xmlns:cx8="http://schemas.microsoft.com/office/drawing/2016/5/14/chartex" xmlns:mc="http://schemas.openxmlformats.org/markup-compatibility/2006" xmlns:aink="http://schemas.microsoft.com/office/drawing/2016/ink" xmlns:am3d="http://schemas.microsoft.com/office/drawing/2017/model3d" xmlns:o="urn:schemas-microsoft-com:office:office" xmlns:oel="http://schemas.microsoft.com/office/2019/extlst" xmlns:r="http://schemas.openxmlformats.org/officeDocument/2006/relationships" xmlns:m="http://schemas.openxmlformats.org/officeDocument/2006/math" xmlns:v="urn:schemas-microsoft-com:vml" xmlns:wp14="http://schemas.microsoft.com/office/word/2010/wordprocessingDrawing" xmlns:wp="http://schemas.openxmlformats.org/drawingml/2006/wordprocessingDrawing" xmlns:w10="urn:schemas-microsoft-com:office:word" xmlns:w="http://schemas.openxmlformats.org/wordprocessingml/2006/main" xmlns:w14="http://schemas.microsoft.com/office/word/2010/wordml" xmlns:w15="http://schemas.microsoft.com/office/word/2012/wordml" xmlns:w16cex="http://schemas.microsoft.com/office/word/2018/wordml/cex" xmlns:w16cid="http://schemas.microsoft.com/office/word/2016/wordml/cid" xmlns:w16="http://schemas.microsoft.com/office/word/2018/wordml" xmlns:w16du="http://schemas.microsoft.com/office/word/2023/wordml/word16du" xmlns:w16sdtdh="http://schemas.microsoft.com/office/word/2020/wordml/sdtdatahash" xmlns:w16sdtfl="http://schemas.microsoft.com/office/word/2024/wordml/sdtformatlock" xmlns:w16se="http://schemas.microsoft.com/office/word/2015/wordml/symex" xmlns:wpg="http://schemas.microsoft.com/office/word/2010/wordprocessingGroup" xmlns:wpi="http://schemas.microsoft.com/office/word/2010/wordprocessingInk" xmlns:wne="http://schemas.microsoft.com/office/word/2006/wordml" xmlns:wps="http://schemas.microsoft.com/office/word/2010/wordprocessingShape" mc:Ignorable="w14 w15 w16se w16cid w16 w16cex w16sdtdh w16sdtfl w16du wp14">
   <w:abstractNum w:abstractNumId="0" w15:restartNumberingAfterBreak="0">
     <w:nsid w:val="2FFD4C7F"/>
     <w:multiLevelType w:val="multilevel"/>
@@ -3766,14 +3848,14 @@
       </w:rPr>
     </w:lvl>
   </w:abstractNum>
-  <w:num w:numId="1">
+  <w:num w:numId="1" w16cid:durableId="1293943374">
     <w:abstractNumId w:val="0"/>
   </w:num>
 </w:numbering>
 </file>
 
 <file path=word/styles.xml><?xml version="1.0" encoding="utf-8"?>
-<w:styles xmlns:mc="http://schemas.openxmlformats.org/markup-compatibility/2006" xmlns:r="http://schemas.openxmlformats.org/officeDocument/2006/relationships" xmlns:w="http://schemas.openxmlformats.org/wordprocessingml/2006/main" xmlns:w14="http://schemas.microsoft.com/office/word/2010/wordml" xmlns:w15="http://schemas.microsoft.com/office/word/2012/wordml" xmlns:w16se="http://schemas.microsoft.com/office/word/2015/wordml/symex" mc:Ignorable="w14 w15 w16se">
+<w:styles xmlns:mc="http://schemas.openxmlformats.org/markup-compatibility/2006" xmlns:r="http://schemas.openxmlformats.org/officeDocument/2006/relationships" xmlns:w="http://schemas.openxmlformats.org/wordprocessingml/2006/main" xmlns:w14="http://schemas.microsoft.com/office/word/2010/wordml" xmlns:w15="http://schemas.microsoft.com/office/word/2012/wordml" xmlns:w16cex="http://schemas.microsoft.com/office/word/2018/wordml/cex" xmlns:w16cid="http://schemas.microsoft.com/office/word/2016/wordml/cid" xmlns:w16="http://schemas.microsoft.com/office/word/2018/wordml" xmlns:w16du="http://schemas.microsoft.com/office/word/2023/wordml/word16du" xmlns:w16sdtdh="http://schemas.microsoft.com/office/word/2020/wordml/sdtdatahash" xmlns:w16sdtfl="http://schemas.microsoft.com/office/word/2024/wordml/sdtformatlock" xmlns:w16se="http://schemas.microsoft.com/office/word/2015/wordml/symex" mc:Ignorable="w14 w15 w16se w16cid w16 w16cex w16sdtdh w16sdtfl w16du">
   <w:docDefaults>
     <w:rPrDefault>
       <w:rPr>
@@ -3785,7 +3867,7 @@
     </w:rPrDefault>
     <w:pPrDefault/>
   </w:docDefaults>
-  <w:latentStyles w:defLockedState="0" w:defUIPriority="99" w:defSemiHidden="0" w:defUnhideWhenUsed="0" w:defQFormat="0" w:count="371">
+  <w:latentStyles w:defLockedState="0" w:defUIPriority="99" w:defSemiHidden="0" w:defUnhideWhenUsed="0" w:defQFormat="0" w:count="376">
     <w:lsdException w:name="Normal" w:uiPriority="0" w:qFormat="1"/>
     <w:lsdException w:name="heading 1" w:uiPriority="9" w:qFormat="1"/>
     <w:lsdException w:name="heading 2" w:semiHidden="1" w:uiPriority="9" w:unhideWhenUsed="1" w:qFormat="1"/>
@@ -4157,6 +4239,11 @@
     <w:lsdException w:name="List Table 5 Dark Accent 6" w:uiPriority="50"/>
     <w:lsdException w:name="List Table 6 Colorful Accent 6" w:uiPriority="51"/>
     <w:lsdException w:name="List Table 7 Colorful Accent 6" w:uiPriority="52"/>
+    <w:lsdException w:name="Mention" w:semiHidden="1" w:unhideWhenUsed="1"/>
+    <w:lsdException w:name="Smart Hyperlink" w:semiHidden="1" w:unhideWhenUsed="1"/>
+    <w:lsdException w:name="Hashtag" w:semiHidden="1" w:unhideWhenUsed="1"/>
+    <w:lsdException w:name="Unresolved Mention" w:semiHidden="1" w:unhideWhenUsed="1"/>
+    <w:lsdException w:name="Smart Link" w:semiHidden="1" w:unhideWhenUsed="1"/>
   </w:latentStyles>
   <w:style w:type="paragraph" w:default="1" w:styleId="Normal">
     <w:name w:val="Normal"/>
@@ -4195,7 +4282,6 @@
   <w:style w:type="character" w:default="1" w:styleId="Fuentedeprrafopredeter">
     <w:name w:val="Default Paragraph Font"/>
     <w:uiPriority w:val="1"/>
-    <w:semiHidden/>
     <w:unhideWhenUsed/>
   </w:style>
   <w:style w:type="table" w:default="1" w:styleId="Tablanormal">
@@ -4458,6 +4544,19 @@
       <w:bCs/>
       <w:sz w:val="20"/>
       <w:szCs w:val="20"/>
+    </w:rPr>
+  </w:style>
+  <w:style w:type="paragraph" w:styleId="NormalWeb">
+    <w:name w:val="Normal (Web)"/>
+    <w:basedOn w:val="Normal"/>
+    <w:uiPriority w:val="99"/>
+    <w:semiHidden/>
+    <w:unhideWhenUsed/>
+    <w:rsid w:val="00A54DFB"/>
+    <w:rPr>
+      <w:rFonts w:ascii="Times New Roman" w:hAnsi="Times New Roman" w:cs="Times New Roman"/>
+      <w:sz w:val="24"/>
+      <w:szCs w:val="24"/>
     </w:rPr>
   </w:style>
 </w:styles>
@@ -4765,6 +4864,15 @@
 </file>
 
 <file path=customXml/item2.xml><?xml version="1.0" encoding="utf-8"?>
+<?mso-contentType ?>
+<FormTemplates xmlns="http://schemas.microsoft.com/sharepoint/v3/contenttype/forms">
+  <Display>DocumentLibraryForm</Display>
+  <Edit>DocumentLibraryForm</Edit>
+  <New>DocumentLibraryForm</New>
+</FormTemplates>
+</file>
+
+<file path=customXml/item3.xml><?xml version="1.0" encoding="utf-8"?>
 <ct:contentTypeSchema xmlns:ct="http://schemas.microsoft.com/office/2006/metadata/contentType" xmlns:ma="http://schemas.microsoft.com/office/2006/metadata/properties/metaAttributes" ct:_="" ma:_="" ma:contentTypeName="Documento" ma:contentTypeID="0x010100E96778489EE7714D8BD12CC105EB918B" ma:contentTypeVersion="2" ma:contentTypeDescription="Crear nuevo documento." ma:contentTypeScope="" ma:versionID="416c5c7ae9b5d54d83875cd3c65194e3">
   <xsd:schema xmlns:xsd="http://www.w3.org/2001/XMLSchema" xmlns:xs="http://www.w3.org/2001/XMLSchema" xmlns:p="http://schemas.microsoft.com/office/2006/metadata/properties" xmlns:ns2="126e8a1c-9ea9-435a-ac89-d06c80d62e30" targetNamespace="http://schemas.microsoft.com/office/2006/metadata/properties" ma:root="true" ma:fieldsID="70a237c842677bd850644f8595079f5e" ns2:_="">
     <xsd:import namespace="126e8a1c-9ea9-435a-ac89-d06c80d62e30"/>
@@ -4896,32 +5004,24 @@
 </ct:contentTypeSchema>
 </file>
 
-<file path=customXml/item3.xml><?xml version="1.0" encoding="utf-8"?>
-<?mso-contentType ?>
-<FormTemplates xmlns="http://schemas.microsoft.com/sharepoint/v3/contenttype/forms">
-  <Display>DocumentLibraryForm</Display>
-  <Edit>DocumentLibraryForm</Edit>
-  <New>DocumentLibraryForm</New>
-</FormTemplates>
-</file>
-
 <file path=customXml/itemProps1.xml><?xml version="1.0" encoding="utf-8"?>
 <ds:datastoreItem xmlns:ds="http://schemas.openxmlformats.org/officeDocument/2006/customXml" ds:itemID="{46CA5683-AF87-4E40-B841-2E23A3B52406}">
   <ds:schemaRefs>
-    <ds:schemaRef ds:uri="http://purl.org/dc/terms/"/>
-    <ds:schemaRef ds:uri="http://purl.org/dc/elements/1.1/"/>
-    <ds:schemaRef ds:uri="http://schemas.openxmlformats.org/package/2006/metadata/core-properties"/>
-    <ds:schemaRef ds:uri="http://www.w3.org/XML/1998/namespace"/>
     <ds:schemaRef ds:uri="http://schemas.microsoft.com/office/2006/metadata/properties"/>
-    <ds:schemaRef ds:uri="http://schemas.microsoft.com/office/2006/documentManagement/types"/>
-    <ds:schemaRef ds:uri="http://purl.org/dc/dcmitype/"/>
     <ds:schemaRef ds:uri="http://schemas.microsoft.com/office/infopath/2007/PartnerControls"/>
-    <ds:schemaRef ds:uri="126e8a1c-9ea9-435a-ac89-d06c80d62e30"/>
   </ds:schemaRefs>
 </ds:datastoreItem>
 </file>
 
 <file path=customXml/itemProps2.xml><?xml version="1.0" encoding="utf-8"?>
+<ds:datastoreItem xmlns:ds="http://schemas.openxmlformats.org/officeDocument/2006/customXml" ds:itemID="{D51C61E4-DB75-4684-AD25-71F546404E96}">
+  <ds:schemaRefs>
+    <ds:schemaRef ds:uri="http://schemas.microsoft.com/sharepoint/v3/contenttype/forms"/>
+  </ds:schemaRefs>
+</ds:datastoreItem>
+</file>
+
+<file path=customXml/itemProps3.xml><?xml version="1.0" encoding="utf-8"?>
 <ds:datastoreItem xmlns:ds="http://schemas.openxmlformats.org/officeDocument/2006/customXml" ds:itemID="{6F3661B0-5934-4FAB-ADC6-33A19B814E8D}">
   <ds:schemaRefs>
     <ds:schemaRef ds:uri="http://schemas.microsoft.com/office/2006/metadata/contentType"/>
@@ -4937,12 +5037,4 @@
     <ds:schemaRef ds:uri="http://schemas.microsoft.com/internal/obd"/>
   </ds:schemaRefs>
 </ds:datastoreItem>
-</file>
-
-<file path=customXml/itemProps3.xml><?xml version="1.0" encoding="utf-8"?>
-<ds:datastoreItem xmlns:ds="http://schemas.openxmlformats.org/officeDocument/2006/customXml" ds:itemID="{D51C61E4-DB75-4684-AD25-71F546404E96}">
-  <ds:schemaRefs>
-    <ds:schemaRef ds:uri="http://schemas.microsoft.com/sharepoint/v3/contenttype/forms"/>
-  </ds:schemaRefs>
-</ds:datastoreItem>
 </file>
</xml_diff>

<commit_message>
Actualizacion documento grupal 2
</commit_message>
<xml_diff>
--- a/Fase 2/Evidencias Grupales/2.4_GuiaEstudiante_Fase 2_DesarrolloProyecto APT.docx
+++ b/Fase 2/Evidencias Grupales/2.4_GuiaEstudiante_Fase 2_DesarrolloProyecto APT.docx
@@ -237,7 +237,7 @@
           </mc:Choice>
           <mc:Fallback>
             <w:pict>
-              <v:group w14:anchorId="39581AEC" id="Grupo 27" o:spid="_x0000_s1026" style="position:absolute;margin-left:0;margin-top:.75pt;width:491.25pt;height:123pt;z-index:251659264;mso-position-horizontal:center;mso-position-horizontal-relative:margin;mso-width-relative:margin;mso-height-relative:margin" coordsize="59912,15621" o:gfxdata="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">
+              <v:group w14:anchorId="39581AEC" id="Grupo 27" o:spid="_x0000_s1026" style="position:absolute;margin-left:0;margin-top:.75pt;width:491.25pt;height:123pt;z-index:251659264;mso-position-horizontal:center;mso-position-horizontal-relative:margin;mso-width-relative:margin;mso-height-relative:margin" coordsize="59912,15621" o:gfxdata="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">
                 <v:shapetype id="_x0000_t202" coordsize="21600,21600" o:spt="202" path="m,l,21600r21600,l21600,xe">
                   <v:stroke joinstyle="miter"/>
                   <v:path gradientshapeok="t" o:connecttype="rect"/>
@@ -340,7 +340,6 @@
                           </w:rPr>
                           <w:t xml:space="preserve">Asignatura </w:t>
                         </w:r>
-                        <w:proofErr w:type="spellStart"/>
                         <w:r>
                           <w:rPr>
                             <w:b/>
@@ -350,7 +349,6 @@
                           </w:rPr>
                           <w:t>Capstone</w:t>
                         </w:r>
-                        <w:proofErr w:type="spellEnd"/>
                       </w:p>
                     </w:txbxContent>
                   </v:textbox>
@@ -583,8 +581,8 @@
         <w:tblLook w:val="04A0" w:firstRow="1" w:lastRow="0" w:firstColumn="1" w:lastColumn="0" w:noHBand="0" w:noVBand="1"/>
       </w:tblPr>
       <w:tblGrid>
-        <w:gridCol w:w="2528"/>
-        <w:gridCol w:w="7111"/>
+        <w:gridCol w:w="1858"/>
+        <w:gridCol w:w="7781"/>
       </w:tblGrid>
       <w:tr>
         <w:tc>
@@ -799,8 +797,8 @@
               <w:jc w:val="both"/>
               <w:rPr>
                 <w:rFonts w:ascii="Calibri" w:hAnsi="Calibri" w:cs="Arial"/>
-                <w:iCs/>
-                <w:color w:val="000000" w:themeColor="text1"/>
+                <w:i/>
+                <w:color w:val="548DD4"/>
                 <w:sz w:val="20"/>
                 <w:szCs w:val="20"/>
                 <w:lang w:eastAsia="es-CL"/>
@@ -905,7 +903,7 @@
               <w:rPr>
                 <w:rFonts w:ascii="Calibri" w:hAnsi="Calibri" w:cs="Arial"/>
                 <w:b/>
-                <w:iCs/>
+                <w:i/>
                 <w:color w:val="548DD4"/>
                 <w:sz w:val="20"/>
                 <w:szCs w:val="20"/>
@@ -961,8 +959,8 @@
               <w:jc w:val="both"/>
               <w:rPr>
                 <w:rFonts w:ascii="Calibri" w:hAnsi="Calibri" w:cs="Arial"/>
-                <w:iCs/>
-                <w:color w:val="000000" w:themeColor="text1"/>
+                <w:i/>
+                <w:color w:val="548DD4"/>
                 <w:sz w:val="20"/>
                 <w:szCs w:val="20"/>
                 <w:lang w:eastAsia="es-CL"/>
@@ -1017,227 +1015,301 @@
               <w:jc w:val="both"/>
               <w:rPr>
                 <w:rFonts w:ascii="Calibri" w:hAnsi="Calibri" w:cs="Arial"/>
-                <w:i/>
-                <w:color w:val="548DD4"/>
-                <w:sz w:val="20"/>
-                <w:szCs w:val="20"/>
-                <w:lang w:eastAsia="es-CL"/>
-              </w:rPr>
-            </w:pPr>
-            <w:r>
-              <w:rPr>
-                <w:rFonts w:ascii="Calibri" w:hAnsi="Calibri" w:cs="Arial"/>
-                <w:i/>
-                <w:color w:val="548DD4"/>
-                <w:sz w:val="20"/>
-                <w:szCs w:val="20"/>
-                <w:lang w:eastAsia="es-CL"/>
-              </w:rPr>
-              <w:t>Describe la</w:t>
-            </w:r>
-            <w:r>
-              <w:rPr>
-                <w:rFonts w:ascii="Calibri" w:hAnsi="Calibri" w:cs="Arial"/>
-                <w:i/>
-                <w:color w:val="548DD4"/>
-                <w:sz w:val="20"/>
-                <w:szCs w:val="20"/>
-                <w:lang w:eastAsia="es-CL"/>
-              </w:rPr>
-              <w:t>(</w:t>
-            </w:r>
-            <w:r>
-              <w:rPr>
-                <w:rFonts w:ascii="Calibri" w:hAnsi="Calibri" w:cs="Arial"/>
-                <w:i/>
-                <w:color w:val="548DD4"/>
-                <w:sz w:val="20"/>
-                <w:szCs w:val="20"/>
-                <w:lang w:eastAsia="es-CL"/>
-              </w:rPr>
-              <w:t>s</w:t>
-            </w:r>
-            <w:r>
-              <w:rPr>
-                <w:rFonts w:ascii="Calibri" w:hAnsi="Calibri" w:cs="Arial"/>
-                <w:i/>
-                <w:color w:val="548DD4"/>
-                <w:sz w:val="20"/>
-                <w:szCs w:val="20"/>
-                <w:lang w:eastAsia="es-CL"/>
-              </w:rPr>
-              <w:t>)</w:t>
-            </w:r>
-            <w:r>
-              <w:rPr>
-                <w:rFonts w:ascii="Calibri" w:hAnsi="Calibri" w:cs="Arial"/>
-                <w:i/>
-                <w:color w:val="548DD4"/>
-                <w:sz w:val="20"/>
-                <w:szCs w:val="20"/>
-                <w:lang w:eastAsia="es-CL"/>
-              </w:rPr>
-              <w:t xml:space="preserve"> evidencia</w:t>
-            </w:r>
-            <w:r>
-              <w:rPr>
-                <w:rFonts w:ascii="Calibri" w:hAnsi="Calibri" w:cs="Arial"/>
-                <w:i/>
-                <w:color w:val="548DD4"/>
-                <w:sz w:val="20"/>
-                <w:szCs w:val="20"/>
-                <w:lang w:eastAsia="es-CL"/>
-              </w:rPr>
-              <w:t>(</w:t>
-            </w:r>
-            <w:r>
-              <w:rPr>
-                <w:rFonts w:ascii="Calibri" w:hAnsi="Calibri" w:cs="Arial"/>
-                <w:i/>
-                <w:color w:val="548DD4"/>
-                <w:sz w:val="20"/>
-                <w:szCs w:val="20"/>
-                <w:lang w:eastAsia="es-CL"/>
-              </w:rPr>
-              <w:t>s</w:t>
-            </w:r>
-            <w:r>
-              <w:rPr>
-                <w:rFonts w:ascii="Calibri" w:hAnsi="Calibri" w:cs="Arial"/>
-                <w:i/>
-                <w:color w:val="548DD4"/>
-                <w:sz w:val="20"/>
-                <w:szCs w:val="20"/>
-                <w:lang w:eastAsia="es-CL"/>
-              </w:rPr>
-              <w:t>)</w:t>
-            </w:r>
-            <w:r>
-              <w:rPr>
-                <w:rFonts w:ascii="Calibri" w:hAnsi="Calibri" w:cs="Arial"/>
-                <w:i/>
-                <w:color w:val="548DD4"/>
-                <w:sz w:val="20"/>
-                <w:szCs w:val="20"/>
-                <w:lang w:eastAsia="es-CL"/>
-              </w:rPr>
-              <w:t xml:space="preserve"> que </w:t>
-            </w:r>
-            <w:r>
-              <w:rPr>
-                <w:rFonts w:ascii="Calibri" w:hAnsi="Calibri" w:cs="Arial"/>
-                <w:i/>
-                <w:color w:val="548DD4"/>
-                <w:sz w:val="20"/>
-                <w:szCs w:val="20"/>
-                <w:lang w:eastAsia="es-CL"/>
-              </w:rPr>
-              <w:t xml:space="preserve">presentarás en este informe de avance y justifica </w:t>
-            </w:r>
-            <w:r>
-              <w:rPr>
-                <w:rFonts w:ascii="Calibri" w:hAnsi="Calibri" w:cs="Arial"/>
-                <w:i/>
-                <w:color w:val="548DD4"/>
-                <w:sz w:val="20"/>
-                <w:szCs w:val="20"/>
-                <w:lang w:eastAsia="es-CL"/>
-              </w:rPr>
-              <w:t xml:space="preserve">de qué manera </w:t>
-            </w:r>
-            <w:r>
-              <w:rPr>
-                <w:rFonts w:ascii="Calibri" w:hAnsi="Calibri" w:cs="Arial"/>
-                <w:i/>
-                <w:color w:val="548DD4"/>
-                <w:sz w:val="20"/>
-                <w:szCs w:val="20"/>
-                <w:lang w:eastAsia="es-CL"/>
-              </w:rPr>
-              <w:t>esta</w:t>
-            </w:r>
-            <w:r>
-              <w:rPr>
-                <w:rFonts w:ascii="Calibri" w:hAnsi="Calibri" w:cs="Arial"/>
-                <w:i/>
-                <w:color w:val="548DD4"/>
-                <w:sz w:val="20"/>
-                <w:szCs w:val="20"/>
-                <w:lang w:eastAsia="es-CL"/>
-              </w:rPr>
-              <w:t>(</w:t>
-            </w:r>
-            <w:r>
-              <w:rPr>
-                <w:rFonts w:ascii="Calibri" w:hAnsi="Calibri" w:cs="Arial"/>
-                <w:i/>
-                <w:color w:val="548DD4"/>
-                <w:sz w:val="20"/>
-                <w:szCs w:val="20"/>
-                <w:lang w:eastAsia="es-CL"/>
-              </w:rPr>
-              <w:t>s</w:t>
-            </w:r>
-            <w:r>
-              <w:rPr>
-                <w:rFonts w:ascii="Calibri" w:hAnsi="Calibri" w:cs="Arial"/>
-                <w:i/>
-                <w:color w:val="548DD4"/>
-                <w:sz w:val="20"/>
-                <w:szCs w:val="20"/>
-                <w:lang w:eastAsia="es-CL"/>
-              </w:rPr>
-              <w:t>)</w:t>
-            </w:r>
-            <w:r>
-              <w:rPr>
-                <w:rFonts w:ascii="Calibri" w:hAnsi="Calibri" w:cs="Arial"/>
-                <w:i/>
-                <w:color w:val="548DD4"/>
-                <w:sz w:val="20"/>
-                <w:szCs w:val="20"/>
-                <w:lang w:eastAsia="es-CL"/>
-              </w:rPr>
-              <w:t xml:space="preserve"> evidencia</w:t>
-            </w:r>
-            <w:r>
-              <w:rPr>
-                <w:rFonts w:ascii="Calibri" w:hAnsi="Calibri" w:cs="Arial"/>
-                <w:i/>
-                <w:color w:val="548DD4"/>
-                <w:sz w:val="20"/>
-                <w:szCs w:val="20"/>
-                <w:lang w:eastAsia="es-CL"/>
-              </w:rPr>
-              <w:t>(</w:t>
-            </w:r>
-            <w:r>
-              <w:rPr>
-                <w:rFonts w:ascii="Calibri" w:hAnsi="Calibri" w:cs="Arial"/>
-                <w:i/>
-                <w:color w:val="548DD4"/>
-                <w:sz w:val="20"/>
-                <w:szCs w:val="20"/>
-                <w:lang w:eastAsia="es-CL"/>
-              </w:rPr>
-              <w:t>s</w:t>
-            </w:r>
-            <w:r>
-              <w:rPr>
-                <w:rFonts w:ascii="Calibri" w:hAnsi="Calibri" w:cs="Arial"/>
-                <w:i/>
-                <w:color w:val="548DD4"/>
-                <w:sz w:val="20"/>
-                <w:szCs w:val="20"/>
-                <w:lang w:eastAsia="es-CL"/>
-              </w:rPr>
-              <w:t>)</w:t>
-            </w:r>
-            <w:r>
-              <w:rPr>
-                <w:rFonts w:ascii="Calibri" w:hAnsi="Calibri" w:cs="Arial"/>
-                <w:i/>
-                <w:color w:val="548DD4"/>
+                <w:b/>
+                <w:iCs/>
+                <w:color w:val="000000" w:themeColor="text1"/>
+                <w:sz w:val="20"/>
+                <w:szCs w:val="20"/>
+                <w:lang w:eastAsia="es-CL"/>
+              </w:rPr>
+            </w:pPr>
+            <w:r>
+              <w:rPr>
+                <w:rFonts w:ascii="Calibri" w:hAnsi="Calibri" w:cs="Arial"/>
+                <w:b/>
+                <w:iCs/>
+                <w:color w:val="000000" w:themeColor="text1"/>
+                <w:sz w:val="20"/>
+                <w:szCs w:val="20"/>
+                <w:lang w:eastAsia="es-CL"/>
+              </w:rPr>
+              <w:t>En este caso presentaremos como evidencia capturas del sistema, funcionalidades implementadas hasta el momento,</w:t>
+            </w:r>
+            <w:r>
+              <w:rPr>
+                <w:rFonts w:ascii="Calibri" w:hAnsi="Calibri" w:cs="Arial"/>
+                <w:b/>
+                <w:iCs/>
+                <w:color w:val="000000" w:themeColor="text1"/>
+                <w:sz w:val="20"/>
+                <w:szCs w:val="20"/>
+                <w:lang w:eastAsia="es-CL"/>
+              </w:rPr>
+              <w:t xml:space="preserve"> pruebas unitarias</w:t>
+            </w:r>
+            <w:r>
+              <w:rPr>
+                <w:rFonts w:ascii="Calibri" w:hAnsi="Calibri" w:cs="Arial"/>
+                <w:b/>
+                <w:iCs/>
+                <w:color w:val="000000" w:themeColor="text1"/>
+                <w:sz w:val="20"/>
+                <w:szCs w:val="20"/>
+                <w:lang w:eastAsia="es-CL"/>
+              </w:rPr>
+              <w:t xml:space="preserve"> y base de datos</w:t>
+            </w:r>
+            <w:r>
+              <w:rPr>
+                <w:rFonts w:ascii="Calibri" w:hAnsi="Calibri" w:cs="Arial"/>
+                <w:b/>
+                <w:iCs/>
+                <w:color w:val="000000" w:themeColor="text1"/>
+                <w:sz w:val="20"/>
+                <w:szCs w:val="20"/>
+                <w:lang w:eastAsia="es-CL"/>
+              </w:rPr>
+              <w:t>.</w:t>
+            </w:r>
+          </w:p>
+          <w:p>
+            <w:pPr>
+              <w:jc w:val="both"/>
+              <w:rPr>
+                <w:rFonts w:ascii="Calibri" w:hAnsi="Calibri" w:cs="Arial"/>
+                <w:b/>
+                <w:iCs/>
+                <w:color w:val="000000" w:themeColor="text1"/>
+                <w:sz w:val="20"/>
+                <w:szCs w:val="20"/>
+                <w:lang w:eastAsia="es-CL"/>
+              </w:rPr>
+            </w:pPr>
+            <w:r>
+              <w:rPr>
+                <w:rFonts w:ascii="Calibri" w:hAnsi="Calibri" w:cs="Arial"/>
+                <w:b/>
+                <w:iCs/>
+                <w:color w:val="000000" w:themeColor="text1"/>
+                <w:sz w:val="20"/>
+                <w:szCs w:val="20"/>
+                <w:lang w:eastAsia="es-CL"/>
+              </w:rPr>
+              <w:t>BASE DE DATOS 20-10-2026</w:t>
+            </w:r>
+          </w:p>
+          <w:p>
+            <w:pPr>
+              <w:jc w:val="both"/>
+              <w:rPr>
+                <w:rFonts w:ascii="Calibri" w:hAnsi="Calibri" w:cs="Arial"/>
+                <w:b/>
+                <w:iCs/>
+                <w:color w:val="548DD4"/>
+                <w:sz w:val="20"/>
+                <w:szCs w:val="20"/>
+                <w:u w:val="single"/>
+                <w:lang w:eastAsia="es-CL"/>
+              </w:rPr>
+            </w:pPr>
+          </w:p>
+          <w:p>
+            <w:pPr>
+              <w:jc w:val="both"/>
+              <w:rPr>
+                <w:rFonts w:ascii="Calibri" w:hAnsi="Calibri" w:cs="Arial"/>
+                <w:b/>
+                <w:iCs/>
+                <w:color w:val="000000" w:themeColor="text1"/>
+                <w:sz w:val="20"/>
+                <w:szCs w:val="20"/>
+                <w:lang w:eastAsia="es-CL"/>
+              </w:rPr>
+            </w:pPr>
+          </w:p>
+          <w:p>
+            <w:pPr>
+              <w:jc w:val="both"/>
+              <w:rPr>
+                <w:rFonts w:ascii="Calibri" w:hAnsi="Calibri" w:cs="Arial"/>
+                <w:b/>
+                <w:iCs/>
+                <w:color w:val="000000" w:themeColor="text1"/>
+                <w:sz w:val="20"/>
+                <w:szCs w:val="20"/>
+                <w:lang w:eastAsia="es-CL"/>
+              </w:rPr>
+            </w:pPr>
+          </w:p>
+          <w:p>
+            <w:pPr>
+              <w:jc w:val="both"/>
+              <w:rPr>
+                <w:rFonts w:ascii="Calibri" w:hAnsi="Calibri" w:cs="Arial"/>
+                <w:b/>
+                <w:iCs/>
+                <w:color w:val="000000" w:themeColor="text1"/>
+                <w:sz w:val="20"/>
+                <w:szCs w:val="20"/>
+                <w:lang w:eastAsia="es-CL"/>
+              </w:rPr>
+            </w:pPr>
+            <w:r>
+              <w:rPr>
+                <w:rFonts w:ascii="Calibri" w:hAnsi="Calibri" w:cs="Arial"/>
+                <w:b/>
+                <w:iCs/>
+                <w:color w:val="000000" w:themeColor="text1"/>
+                <w:sz w:val="20"/>
+                <w:szCs w:val="20"/>
+                <w:lang w:eastAsia="es-CL"/>
+              </w:rPr>
+              <w:t xml:space="preserve">PRUEBAS UNITARIAS EN POSTMAN – ALGUNAS PENDIENTES </w:t>
+            </w:r>
+            <w:r>
+              <w:rPr>
+                <w:rFonts w:ascii="Calibri" w:hAnsi="Calibri" w:cs="Arial"/>
+                <w:b/>
+                <w:iCs/>
+                <w:color w:val="000000" w:themeColor="text1"/>
+                <w:sz w:val="20"/>
+                <w:szCs w:val="20"/>
+                <w:lang w:eastAsia="es-CL"/>
+              </w:rPr>
+              <w:t>20</w:t>
+            </w:r>
+            <w:r>
+              <w:rPr>
+                <w:rFonts w:ascii="Calibri" w:hAnsi="Calibri" w:cs="Arial"/>
+                <w:b/>
+                <w:iCs/>
+                <w:color w:val="000000" w:themeColor="text1"/>
+                <w:sz w:val="20"/>
+                <w:szCs w:val="20"/>
+                <w:lang w:eastAsia="es-CL"/>
+              </w:rPr>
+              <w:t>-10-2026</w:t>
+            </w:r>
+          </w:p>
+          <w:p>
+            <w:pPr>
+              <w:jc w:val="both"/>
+              <w:rPr>
+                <w:rFonts w:ascii="Calibri" w:hAnsi="Calibri" w:cs="Arial"/>
+                <w:b/>
+                <w:iCs/>
+                <w:color w:val="000000" w:themeColor="text1"/>
+                <w:sz w:val="20"/>
+                <w:szCs w:val="20"/>
+                <w:lang w:eastAsia="es-CL"/>
+              </w:rPr>
+            </w:pPr>
+            <w:r>
+              <w:rPr>
+                <w:rFonts w:ascii="Calibri" w:hAnsi="Calibri" w:cs="Arial"/>
+                <w:b/>
+                <w:iCs/>
+                <w:noProof/>
+                <w:color w:val="000000" w:themeColor="text1"/>
+                <w:sz w:val="20"/>
+                <w:szCs w:val="20"/>
+                <w:lang w:eastAsia="es-CL"/>
+              </w:rPr>
+              <w:drawing>
+                <wp:inline distT="0" distB="0" distL="0" distR="0" wp14:anchorId="119AF5E3" wp14:editId="3E3AF163">
+                  <wp:extent cx="1849272" cy="2713549"/>
+                  <wp:effectExtent l="0" t="0" r="0" b="0"/>
+                  <wp:docPr id="332735453" name="Imagen 3"/>
+                  <wp:cNvGraphicFramePr>
+                    <a:graphicFrameLocks xmlns:a="http://schemas.openxmlformats.org/drawingml/2006/main" noChangeAspect="1"/>
+                  </wp:cNvGraphicFramePr>
+                  <a:graphic xmlns:a="http://schemas.openxmlformats.org/drawingml/2006/main">
+                    <a:graphicData uri="http://schemas.openxmlformats.org/drawingml/2006/picture">
+                      <pic:pic xmlns:pic="http://schemas.openxmlformats.org/drawingml/2006/picture">
+                        <pic:nvPicPr>
+                          <pic:cNvPr id="0" name="Picture 1"/>
+                          <pic:cNvPicPr>
+                            <a:picLocks noChangeAspect="1" noChangeArrowheads="1"/>
+                          </pic:cNvPicPr>
+                        </pic:nvPicPr>
+                        <pic:blipFill>
+                          <a:blip r:embed="rId10">
+                            <a:extLst>
+                              <a:ext uri="{28A0092B-C50C-407E-A947-70E740481C1C}">
+                                <a14:useLocalDpi xmlns:a14="http://schemas.microsoft.com/office/drawing/2010/main" val="0"/>
+                              </a:ext>
+                            </a:extLst>
+                          </a:blip>
+                          <a:srcRect/>
+                          <a:stretch>
+                            <a:fillRect/>
+                          </a:stretch>
+                        </pic:blipFill>
+                        <pic:spPr bwMode="auto">
+                          <a:xfrm>
+                            <a:off x="0" y="0"/>
+                            <a:ext cx="1866462" cy="2738774"/>
+                          </a:xfrm>
+                          <a:prstGeom prst="rect">
+                            <a:avLst/>
+                          </a:prstGeom>
+                          <a:noFill/>
+                          <a:ln>
+                            <a:noFill/>
+                          </a:ln>
+                        </pic:spPr>
+                      </pic:pic>
+                    </a:graphicData>
+                  </a:graphic>
+                </wp:inline>
+              </w:drawing>
+            </w:r>
+          </w:p>
+          <w:p>
+            <w:pPr>
+              <w:jc w:val="both"/>
+              <w:rPr>
+                <w:rFonts w:ascii="Calibri" w:hAnsi="Calibri" w:cs="Arial"/>
+                <w:b/>
+                <w:iCs/>
+                <w:color w:val="000000" w:themeColor="text1"/>
+                <w:sz w:val="20"/>
+                <w:szCs w:val="20"/>
+                <w:lang w:eastAsia="es-CL"/>
+              </w:rPr>
+            </w:pPr>
+            <w:r>
+              <w:rPr>
+                <w:rFonts w:ascii="Calibri" w:hAnsi="Calibri" w:cs="Arial"/>
+                <w:b/>
+                <w:iCs/>
+                <w:color w:val="000000" w:themeColor="text1"/>
+                <w:sz w:val="20"/>
+                <w:szCs w:val="20"/>
+                <w:lang w:eastAsia="es-CL"/>
+              </w:rPr>
+              <w:t>INICIO DE SESION</w:t>
+            </w:r>
+          </w:p>
+          <w:p>
+            <w:pPr>
+              <w:jc w:val="both"/>
+              <w:rPr>
+                <w:rFonts w:ascii="Calibri" w:hAnsi="Calibri" w:cs="Arial"/>
+                <w:b/>
+                <w:iCs/>
+                <w:color w:val="000000" w:themeColor="text1"/>
+                <w:sz w:val="20"/>
+                <w:szCs w:val="20"/>
+                <w:lang w:eastAsia="es-CL"/>
+              </w:rPr>
+            </w:pPr>
+            <w:r>
+              <w:rPr>
+                <w:rFonts w:ascii="Calibri" w:hAnsi="Calibri" w:cs="Arial"/>
+                <w:b/>
+                <w:iCs/>
+                <w:color w:val="000000" w:themeColor="text1"/>
                 <w:sz w:val="20"/>
                 <w:szCs w:val="20"/>
                 <w:lang w:eastAsia="es-CL"/>
@@ -1247,149 +1319,1456 @@
             <w:r>
               <w:rPr>
                 <w:rFonts w:ascii="Calibri" w:hAnsi="Calibri" w:cs="Arial"/>
-                <w:i/>
-                <w:color w:val="548DD4"/>
-                <w:sz w:val="20"/>
-                <w:szCs w:val="20"/>
-                <w:lang w:eastAsia="es-CL"/>
-              </w:rPr>
-              <w:t xml:space="preserve">permite(n) </w:t>
-            </w:r>
-            <w:r>
-              <w:rPr>
-                <w:rFonts w:ascii="Calibri" w:hAnsi="Calibri" w:cs="Arial"/>
-                <w:i/>
-                <w:color w:val="548DD4"/>
-                <w:sz w:val="20"/>
-                <w:szCs w:val="20"/>
-                <w:lang w:eastAsia="es-CL"/>
-              </w:rPr>
-              <w:t>da</w:t>
-            </w:r>
-            <w:r>
-              <w:rPr>
-                <w:rFonts w:ascii="Calibri" w:hAnsi="Calibri" w:cs="Arial"/>
-                <w:i/>
-                <w:color w:val="548DD4"/>
-                <w:sz w:val="20"/>
-                <w:szCs w:val="20"/>
-                <w:lang w:eastAsia="es-CL"/>
-              </w:rPr>
-              <w:t>r</w:t>
-            </w:r>
-            <w:r>
-              <w:rPr>
-                <w:rFonts w:ascii="Calibri" w:hAnsi="Calibri" w:cs="Arial"/>
-                <w:i/>
-                <w:color w:val="548DD4"/>
-                <w:sz w:val="20"/>
-                <w:szCs w:val="20"/>
-                <w:lang w:eastAsia="es-CL"/>
-              </w:rPr>
-              <w:t xml:space="preserve"> cuenta del </w:t>
-            </w:r>
-            <w:r>
-              <w:rPr>
-                <w:rFonts w:ascii="Calibri" w:hAnsi="Calibri" w:cs="Arial"/>
-                <w:i/>
-                <w:color w:val="548DD4"/>
-                <w:sz w:val="20"/>
-                <w:szCs w:val="20"/>
-                <w:lang w:eastAsia="es-CL"/>
-              </w:rPr>
-              <w:t>desarrollo</w:t>
-            </w:r>
-            <w:r>
-              <w:rPr>
-                <w:rFonts w:ascii="Calibri" w:hAnsi="Calibri" w:cs="Arial"/>
-                <w:i/>
-                <w:color w:val="548DD4"/>
-                <w:sz w:val="20"/>
-                <w:szCs w:val="20"/>
-                <w:lang w:eastAsia="es-CL"/>
-              </w:rPr>
-              <w:t xml:space="preserve"> </w:t>
-            </w:r>
-            <w:r>
-              <w:rPr>
-                <w:rFonts w:ascii="Calibri" w:hAnsi="Calibri" w:cs="Arial"/>
-                <w:i/>
-                <w:color w:val="548DD4"/>
-                <w:sz w:val="20"/>
-                <w:szCs w:val="20"/>
-                <w:lang w:eastAsia="es-CL"/>
-              </w:rPr>
-              <w:t>del proyecto.</w:t>
-            </w:r>
-          </w:p>
-          <w:p>
-            <w:pPr>
-              <w:jc w:val="both"/>
-              <w:rPr>
-                <w:rFonts w:ascii="Calibri" w:hAnsi="Calibri" w:cs="Arial"/>
-                <w:i/>
-                <w:color w:val="548DD4"/>
-                <w:sz w:val="20"/>
-                <w:szCs w:val="20"/>
-                <w:lang w:eastAsia="es-CL"/>
-              </w:rPr>
-            </w:pPr>
-            <w:r>
-              <w:rPr>
-                <w:rFonts w:ascii="Calibri" w:hAnsi="Calibri" w:cs="Arial"/>
-                <w:i/>
-                <w:color w:val="548DD4"/>
-                <w:sz w:val="20"/>
-                <w:szCs w:val="20"/>
-                <w:lang w:eastAsia="es-CL"/>
-              </w:rPr>
-              <w:t xml:space="preserve">En caso de ser pertinente </w:t>
-            </w:r>
-            <w:r>
-              <w:rPr>
-                <w:rFonts w:ascii="Calibri" w:hAnsi="Calibri" w:cs="Arial"/>
-                <w:i/>
-                <w:color w:val="548DD4"/>
-                <w:sz w:val="20"/>
-                <w:szCs w:val="20"/>
-                <w:lang w:eastAsia="es-CL"/>
-              </w:rPr>
-              <w:t>explica cómo resguardaste la calidad de tu Proyecto APT a partir de aspectos propios de tu disciplina (correcta aplicación de metodologías, actividades, herramientas, recursos propios, etc.).</w:t>
-            </w:r>
-          </w:p>
-          <w:p>
-            <w:pPr>
-              <w:jc w:val="both"/>
-              <w:rPr>
-                <w:rFonts w:ascii="Calibri" w:hAnsi="Calibri" w:cs="Arial"/>
-                <w:b/>
-                <w:i/>
-                <w:color w:val="548DD4"/>
-                <w:sz w:val="20"/>
-                <w:szCs w:val="20"/>
-                <w:lang w:eastAsia="es-CL"/>
-              </w:rPr>
-            </w:pPr>
-            <w:r>
-              <w:rPr>
-                <w:rFonts w:ascii="Calibri" w:hAnsi="Calibri" w:cs="Arial"/>
-                <w:i/>
-                <w:color w:val="548DD4"/>
-                <w:sz w:val="20"/>
-                <w:szCs w:val="20"/>
-                <w:lang w:eastAsia="es-CL"/>
-              </w:rPr>
-              <w:t>En este apartado adjuntar la(s) evidencia(s) seleccionada(s) para ser evaluada por el docente.</w:t>
-            </w:r>
+                <w:b/>
+                <w:iCs/>
+                <w:color w:val="000000" w:themeColor="text1"/>
+                <w:sz w:val="20"/>
+                <w:szCs w:val="20"/>
+                <w:lang w:eastAsia="es-CL"/>
+              </w:rPr>
+              <w:drawing>
+                <wp:inline distT="0" distB="0" distL="0" distR="0" wp14:anchorId="5CD3B424" wp14:editId="09C92131">
+                  <wp:extent cx="2831911" cy="1554154"/>
+                  <wp:effectExtent l="0" t="0" r="6985" b="8255"/>
+                  <wp:docPr id="1496574101" name="Imagen 1"/>
+                  <wp:cNvGraphicFramePr>
+                    <a:graphicFrameLocks xmlns:a="http://schemas.openxmlformats.org/drawingml/2006/main" noChangeAspect="1"/>
+                  </wp:cNvGraphicFramePr>
+                  <a:graphic xmlns:a="http://schemas.openxmlformats.org/drawingml/2006/main">
+                    <a:graphicData uri="http://schemas.openxmlformats.org/drawingml/2006/picture">
+                      <pic:pic xmlns:pic="http://schemas.openxmlformats.org/drawingml/2006/picture">
+                        <pic:nvPicPr>
+                          <pic:cNvPr id="1496574101" name=""/>
+                          <pic:cNvPicPr/>
+                        </pic:nvPicPr>
+                        <pic:blipFill>
+                          <a:blip r:embed="rId11"/>
+                          <a:stretch>
+                            <a:fillRect/>
+                          </a:stretch>
+                        </pic:blipFill>
+                        <pic:spPr>
+                          <a:xfrm>
+                            <a:off x="0" y="0"/>
+                            <a:ext cx="2864011" cy="1571771"/>
+                          </a:xfrm>
+                          <a:prstGeom prst="rect">
+                            <a:avLst/>
+                          </a:prstGeom>
+                        </pic:spPr>
+                      </pic:pic>
+                    </a:graphicData>
+                  </a:graphic>
+                </wp:inline>
+              </w:drawing>
+            </w:r>
+          </w:p>
+          <w:p>
+            <w:pPr>
+              <w:jc w:val="both"/>
+              <w:rPr>
+                <w:rFonts w:ascii="Calibri" w:hAnsi="Calibri" w:cs="Arial"/>
+                <w:b/>
+                <w:iCs/>
+                <w:color w:val="000000" w:themeColor="text1"/>
+                <w:sz w:val="20"/>
+                <w:szCs w:val="20"/>
+                <w:lang w:eastAsia="es-CL"/>
+              </w:rPr>
+            </w:pPr>
+          </w:p>
+          <w:p>
+            <w:pPr>
+              <w:jc w:val="both"/>
+              <w:rPr>
+                <w:rFonts w:ascii="Calibri" w:hAnsi="Calibri" w:cs="Arial"/>
+                <w:b/>
+                <w:iCs/>
+                <w:color w:val="000000" w:themeColor="text1"/>
+                <w:sz w:val="20"/>
+                <w:szCs w:val="20"/>
+                <w:lang w:eastAsia="es-CL"/>
+              </w:rPr>
+            </w:pPr>
+            <w:r>
+              <w:rPr>
+                <w:rFonts w:ascii="Calibri" w:hAnsi="Calibri" w:cs="Arial"/>
+                <w:b/>
+                <w:iCs/>
+                <w:color w:val="000000" w:themeColor="text1"/>
+                <w:sz w:val="20"/>
+                <w:szCs w:val="20"/>
+                <w:lang w:eastAsia="es-CL"/>
+              </w:rPr>
+              <w:t xml:space="preserve">INTERFAZ PRINCIPAL DE LA PAGINA </w:t>
+            </w:r>
+          </w:p>
+          <w:p>
+            <w:pPr>
+              <w:jc w:val="both"/>
+              <w:rPr>
+                <w:rFonts w:ascii="Calibri" w:hAnsi="Calibri" w:cs="Arial"/>
+                <w:b/>
+                <w:iCs/>
+                <w:color w:val="000000" w:themeColor="text1"/>
+                <w:sz w:val="20"/>
+                <w:szCs w:val="20"/>
+                <w:lang w:eastAsia="es-CL"/>
+              </w:rPr>
+            </w:pPr>
+            <w:r>
+              <w:rPr>
+                <w:rFonts w:ascii="Calibri" w:hAnsi="Calibri" w:cs="Arial"/>
+                <w:b/>
+                <w:iCs/>
+                <w:color w:val="000000" w:themeColor="text1"/>
+                <w:sz w:val="20"/>
+                <w:szCs w:val="20"/>
+                <w:lang w:eastAsia="es-CL"/>
+              </w:rPr>
+              <w:drawing>
+                <wp:inline distT="0" distB="0" distL="0" distR="0" wp14:anchorId="7B861A80" wp14:editId="13D2931F">
+                  <wp:extent cx="4130885" cy="2279176"/>
+                  <wp:effectExtent l="0" t="0" r="3175" b="6985"/>
+                  <wp:docPr id="1021035023" name="Imagen 1"/>
+                  <wp:cNvGraphicFramePr>
+                    <a:graphicFrameLocks xmlns:a="http://schemas.openxmlformats.org/drawingml/2006/main" noChangeAspect="1"/>
+                  </wp:cNvGraphicFramePr>
+                  <a:graphic xmlns:a="http://schemas.openxmlformats.org/drawingml/2006/main">
+                    <a:graphicData uri="http://schemas.openxmlformats.org/drawingml/2006/picture">
+                      <pic:pic xmlns:pic="http://schemas.openxmlformats.org/drawingml/2006/picture">
+                        <pic:nvPicPr>
+                          <pic:cNvPr id="1021035023" name=""/>
+                          <pic:cNvPicPr/>
+                        </pic:nvPicPr>
+                        <pic:blipFill>
+                          <a:blip r:embed="rId12"/>
+                          <a:stretch>
+                            <a:fillRect/>
+                          </a:stretch>
+                        </pic:blipFill>
+                        <pic:spPr>
+                          <a:xfrm>
+                            <a:off x="0" y="0"/>
+                            <a:ext cx="4169429" cy="2300443"/>
+                          </a:xfrm>
+                          <a:prstGeom prst="rect">
+                            <a:avLst/>
+                          </a:prstGeom>
+                        </pic:spPr>
+                      </pic:pic>
+                    </a:graphicData>
+                  </a:graphic>
+                </wp:inline>
+              </w:drawing>
+            </w:r>
+          </w:p>
+          <w:p>
+            <w:pPr>
+              <w:jc w:val="both"/>
+              <w:rPr>
+                <w:rFonts w:ascii="Calibri" w:hAnsi="Calibri" w:cs="Arial"/>
+                <w:b/>
+                <w:iCs/>
+                <w:color w:val="000000" w:themeColor="text1"/>
+                <w:sz w:val="20"/>
+                <w:szCs w:val="20"/>
+                <w:lang w:eastAsia="es-CL"/>
+              </w:rPr>
+            </w:pPr>
+            <w:r>
+              <w:rPr>
+                <w:rFonts w:ascii="Calibri" w:hAnsi="Calibri" w:cs="Arial"/>
+                <w:b/>
+                <w:iCs/>
+                <w:color w:val="000000" w:themeColor="text1"/>
+                <w:sz w:val="20"/>
+                <w:szCs w:val="20"/>
+                <w:lang w:eastAsia="es-CL"/>
+              </w:rPr>
+              <w:t>VISTA DE INVENTARIO</w:t>
+            </w:r>
+          </w:p>
+          <w:p>
+            <w:pPr>
+              <w:jc w:val="both"/>
+              <w:rPr>
+                <w:rFonts w:ascii="Calibri" w:hAnsi="Calibri" w:cs="Arial"/>
+                <w:b/>
+                <w:iCs/>
+                <w:color w:val="000000" w:themeColor="text1"/>
+                <w:sz w:val="20"/>
+                <w:szCs w:val="20"/>
+                <w:lang w:eastAsia="es-CL"/>
+              </w:rPr>
+            </w:pPr>
+            <w:r>
+              <w:rPr>
+                <w:rFonts w:ascii="Calibri" w:hAnsi="Calibri" w:cs="Arial"/>
+                <w:b/>
+                <w:iCs/>
+                <w:color w:val="000000" w:themeColor="text1"/>
+                <w:sz w:val="20"/>
+                <w:szCs w:val="20"/>
+                <w:lang w:eastAsia="es-CL"/>
+              </w:rPr>
+              <w:drawing>
+                <wp:inline distT="0" distB="0" distL="0" distR="0" wp14:anchorId="5A2ADF35" wp14:editId="0170997D">
+                  <wp:extent cx="4339590" cy="2265730"/>
+                  <wp:effectExtent l="0" t="0" r="3810" b="1270"/>
+                  <wp:docPr id="572358290" name="Imagen 1"/>
+                  <wp:cNvGraphicFramePr>
+                    <a:graphicFrameLocks xmlns:a="http://schemas.openxmlformats.org/drawingml/2006/main" noChangeAspect="1"/>
+                  </wp:cNvGraphicFramePr>
+                  <a:graphic xmlns:a="http://schemas.openxmlformats.org/drawingml/2006/main">
+                    <a:graphicData uri="http://schemas.openxmlformats.org/drawingml/2006/picture">
+                      <pic:pic xmlns:pic="http://schemas.openxmlformats.org/drawingml/2006/picture">
+                        <pic:nvPicPr>
+                          <pic:cNvPr id="572358290" name=""/>
+                          <pic:cNvPicPr/>
+                        </pic:nvPicPr>
+                        <pic:blipFill>
+                          <a:blip r:embed="rId13"/>
+                          <a:stretch>
+                            <a:fillRect/>
+                          </a:stretch>
+                        </pic:blipFill>
+                        <pic:spPr>
+                          <a:xfrm>
+                            <a:off x="0" y="0"/>
+                            <a:ext cx="4367729" cy="2280421"/>
+                          </a:xfrm>
+                          <a:prstGeom prst="rect">
+                            <a:avLst/>
+                          </a:prstGeom>
+                        </pic:spPr>
+                      </pic:pic>
+                    </a:graphicData>
+                  </a:graphic>
+                </wp:inline>
+              </w:drawing>
+            </w:r>
+          </w:p>
+          <w:p>
+            <w:pPr>
+              <w:jc w:val="both"/>
+              <w:rPr>
+                <w:rFonts w:ascii="Calibri" w:hAnsi="Calibri" w:cs="Arial"/>
+                <w:b/>
+                <w:iCs/>
+                <w:color w:val="000000" w:themeColor="text1"/>
+                <w:sz w:val="20"/>
+                <w:szCs w:val="20"/>
+                <w:lang w:eastAsia="es-CL"/>
+              </w:rPr>
+            </w:pPr>
+            <w:r>
+              <w:rPr>
+                <w:rFonts w:ascii="Calibri" w:hAnsi="Calibri" w:cs="Arial"/>
+                <w:b/>
+                <w:iCs/>
+                <w:color w:val="000000" w:themeColor="text1"/>
+                <w:sz w:val="20"/>
+                <w:szCs w:val="20"/>
+                <w:lang w:eastAsia="es-CL"/>
+              </w:rPr>
+              <w:t>VISTA DE PRODUCTOS IMPORTACION/NUEVO PRODUCTO/EDITAR/VER PRODUCTO</w:t>
+            </w:r>
+          </w:p>
+          <w:p>
+            <w:pPr>
+              <w:jc w:val="both"/>
+              <w:rPr>
+                <w:rFonts w:ascii="Calibri" w:hAnsi="Calibri" w:cs="Arial"/>
+                <w:b/>
+                <w:iCs/>
+                <w:color w:val="000000" w:themeColor="text1"/>
+                <w:sz w:val="20"/>
+                <w:szCs w:val="20"/>
+                <w:lang w:eastAsia="es-CL"/>
+              </w:rPr>
+            </w:pPr>
+            <w:r>
+              <w:rPr>
+                <w:rFonts w:ascii="Calibri" w:hAnsi="Calibri" w:cs="Arial"/>
+                <w:b/>
+                <w:iCs/>
+                <w:color w:val="000000" w:themeColor="text1"/>
+                <w:sz w:val="20"/>
+                <w:szCs w:val="20"/>
+                <w:lang w:eastAsia="es-CL"/>
+              </w:rPr>
+              <w:drawing>
+                <wp:inline distT="0" distB="0" distL="0" distR="0" wp14:anchorId="40729C14" wp14:editId="2F131E46">
+                  <wp:extent cx="4339988" cy="2282781"/>
+                  <wp:effectExtent l="0" t="0" r="3810" b="3810"/>
+                  <wp:docPr id="524675024" name="Imagen 1"/>
+                  <wp:cNvGraphicFramePr>
+                    <a:graphicFrameLocks xmlns:a="http://schemas.openxmlformats.org/drawingml/2006/main" noChangeAspect="1"/>
+                  </wp:cNvGraphicFramePr>
+                  <a:graphic xmlns:a="http://schemas.openxmlformats.org/drawingml/2006/main">
+                    <a:graphicData uri="http://schemas.openxmlformats.org/drawingml/2006/picture">
+                      <pic:pic xmlns:pic="http://schemas.openxmlformats.org/drawingml/2006/picture">
+                        <pic:nvPicPr>
+                          <pic:cNvPr id="524675024" name=""/>
+                          <pic:cNvPicPr/>
+                        </pic:nvPicPr>
+                        <pic:blipFill>
+                          <a:blip r:embed="rId14"/>
+                          <a:stretch>
+                            <a:fillRect/>
+                          </a:stretch>
+                        </pic:blipFill>
+                        <pic:spPr>
+                          <a:xfrm>
+                            <a:off x="0" y="0"/>
+                            <a:ext cx="4357533" cy="2292009"/>
+                          </a:xfrm>
+                          <a:prstGeom prst="rect">
+                            <a:avLst/>
+                          </a:prstGeom>
+                        </pic:spPr>
+                      </pic:pic>
+                    </a:graphicData>
+                  </a:graphic>
+                </wp:inline>
+              </w:drawing>
+            </w:r>
+          </w:p>
+          <w:p>
+            <w:pPr>
+              <w:jc w:val="both"/>
+              <w:rPr>
+                <w:rFonts w:ascii="Calibri" w:hAnsi="Calibri" w:cs="Arial"/>
+                <w:b/>
+                <w:iCs/>
+                <w:color w:val="000000" w:themeColor="text1"/>
+                <w:sz w:val="20"/>
+                <w:szCs w:val="20"/>
+                <w:lang w:eastAsia="es-CL"/>
+              </w:rPr>
+            </w:pPr>
+            <w:r>
+              <w:rPr>
+                <w:rFonts w:ascii="Calibri" w:hAnsi="Calibri" w:cs="Arial"/>
+                <w:b/>
+                <w:iCs/>
+                <w:color w:val="000000" w:themeColor="text1"/>
+                <w:sz w:val="20"/>
+                <w:szCs w:val="20"/>
+                <w:lang w:eastAsia="es-CL"/>
+              </w:rPr>
+              <w:lastRenderedPageBreak/>
+              <w:drawing>
+                <wp:inline distT="0" distB="0" distL="0" distR="0" wp14:anchorId="1C588608" wp14:editId="1B2A2857">
+                  <wp:extent cx="3684896" cy="2067772"/>
+                  <wp:effectExtent l="0" t="0" r="0" b="8890"/>
+                  <wp:docPr id="436227183" name="Imagen 1"/>
+                  <wp:cNvGraphicFramePr>
+                    <a:graphicFrameLocks xmlns:a="http://schemas.openxmlformats.org/drawingml/2006/main" noChangeAspect="1"/>
+                  </wp:cNvGraphicFramePr>
+                  <a:graphic xmlns:a="http://schemas.openxmlformats.org/drawingml/2006/main">
+                    <a:graphicData uri="http://schemas.openxmlformats.org/drawingml/2006/picture">
+                      <pic:pic xmlns:pic="http://schemas.openxmlformats.org/drawingml/2006/picture">
+                        <pic:nvPicPr>
+                          <pic:cNvPr id="436227183" name=""/>
+                          <pic:cNvPicPr/>
+                        </pic:nvPicPr>
+                        <pic:blipFill>
+                          <a:blip r:embed="rId15"/>
+                          <a:stretch>
+                            <a:fillRect/>
+                          </a:stretch>
+                        </pic:blipFill>
+                        <pic:spPr>
+                          <a:xfrm>
+                            <a:off x="0" y="0"/>
+                            <a:ext cx="3705647" cy="2079416"/>
+                          </a:xfrm>
+                          <a:prstGeom prst="rect">
+                            <a:avLst/>
+                          </a:prstGeom>
+                        </pic:spPr>
+                      </pic:pic>
+                    </a:graphicData>
+                  </a:graphic>
+                </wp:inline>
+              </w:drawing>
+            </w:r>
+          </w:p>
+          <w:p>
+            <w:pPr>
+              <w:jc w:val="both"/>
+              <w:rPr>
+                <w:rFonts w:ascii="Calibri" w:hAnsi="Calibri" w:cs="Arial"/>
+                <w:b/>
+                <w:iCs/>
+                <w:color w:val="000000" w:themeColor="text1"/>
+                <w:sz w:val="20"/>
+                <w:szCs w:val="20"/>
+                <w:lang w:val="es-ES" w:eastAsia="es-CL"/>
+              </w:rPr>
+            </w:pPr>
+            <w:r>
+              <w:rPr>
+                <w:rFonts w:ascii="Calibri" w:hAnsi="Calibri" w:cs="Arial"/>
+                <w:b/>
+                <w:iCs/>
+                <w:color w:val="000000" w:themeColor="text1"/>
+                <w:sz w:val="20"/>
+                <w:szCs w:val="20"/>
+                <w:lang w:eastAsia="es-CL"/>
+              </w:rPr>
+              <w:drawing>
+                <wp:inline distT="0" distB="0" distL="0" distR="0" wp14:anchorId="275A2632" wp14:editId="4CE2AB15">
+                  <wp:extent cx="3643952" cy="2807523"/>
+                  <wp:effectExtent l="0" t="0" r="0" b="0"/>
+                  <wp:docPr id="1150525575" name="Imagen 1"/>
+                  <wp:cNvGraphicFramePr>
+                    <a:graphicFrameLocks xmlns:a="http://schemas.openxmlformats.org/drawingml/2006/main" noChangeAspect="1"/>
+                  </wp:cNvGraphicFramePr>
+                  <a:graphic xmlns:a="http://schemas.openxmlformats.org/drawingml/2006/main">
+                    <a:graphicData uri="http://schemas.openxmlformats.org/drawingml/2006/picture">
+                      <pic:pic xmlns:pic="http://schemas.openxmlformats.org/drawingml/2006/picture">
+                        <pic:nvPicPr>
+                          <pic:cNvPr id="1150525575" name=""/>
+                          <pic:cNvPicPr/>
+                        </pic:nvPicPr>
+                        <pic:blipFill>
+                          <a:blip r:embed="rId16"/>
+                          <a:stretch>
+                            <a:fillRect/>
+                          </a:stretch>
+                        </pic:blipFill>
+                        <pic:spPr>
+                          <a:xfrm>
+                            <a:off x="0" y="0"/>
+                            <a:ext cx="3670276" cy="2827805"/>
+                          </a:xfrm>
+                          <a:prstGeom prst="rect">
+                            <a:avLst/>
+                          </a:prstGeom>
+                        </pic:spPr>
+                      </pic:pic>
+                    </a:graphicData>
+                  </a:graphic>
+                </wp:inline>
+              </w:drawing>
+            </w:r>
+          </w:p>
+          <w:p>
+            <w:pPr>
+              <w:jc w:val="both"/>
+              <w:rPr>
+                <w:rFonts w:ascii="Calibri" w:hAnsi="Calibri" w:cs="Arial"/>
+                <w:b/>
+                <w:iCs/>
+                <w:color w:val="000000" w:themeColor="text1"/>
+                <w:sz w:val="20"/>
+                <w:szCs w:val="20"/>
+                <w:lang w:eastAsia="es-CL"/>
+              </w:rPr>
+            </w:pPr>
+            <w:r>
+              <w:rPr>
+                <w:rFonts w:ascii="Calibri" w:hAnsi="Calibri" w:cs="Arial"/>
+                <w:b/>
+                <w:iCs/>
+                <w:color w:val="000000" w:themeColor="text1"/>
+                <w:sz w:val="20"/>
+                <w:szCs w:val="20"/>
+                <w:lang w:eastAsia="es-CL"/>
+              </w:rPr>
+              <w:drawing>
+                <wp:inline distT="0" distB="0" distL="0" distR="0" wp14:anchorId="6011D1E1" wp14:editId="5D30288F">
+                  <wp:extent cx="3132161" cy="2910802"/>
+                  <wp:effectExtent l="0" t="0" r="0" b="4445"/>
+                  <wp:docPr id="1352917718" name="Imagen 1"/>
+                  <wp:cNvGraphicFramePr>
+                    <a:graphicFrameLocks xmlns:a="http://schemas.openxmlformats.org/drawingml/2006/main" noChangeAspect="1"/>
+                  </wp:cNvGraphicFramePr>
+                  <a:graphic xmlns:a="http://schemas.openxmlformats.org/drawingml/2006/main">
+                    <a:graphicData uri="http://schemas.openxmlformats.org/drawingml/2006/picture">
+                      <pic:pic xmlns:pic="http://schemas.openxmlformats.org/drawingml/2006/picture">
+                        <pic:nvPicPr>
+                          <pic:cNvPr id="1352917718" name=""/>
+                          <pic:cNvPicPr/>
+                        </pic:nvPicPr>
+                        <pic:blipFill>
+                          <a:blip r:embed="rId17"/>
+                          <a:stretch>
+                            <a:fillRect/>
+                          </a:stretch>
+                        </pic:blipFill>
+                        <pic:spPr>
+                          <a:xfrm>
+                            <a:off x="0" y="0"/>
+                            <a:ext cx="3146748" cy="2924358"/>
+                          </a:xfrm>
+                          <a:prstGeom prst="rect">
+                            <a:avLst/>
+                          </a:prstGeom>
+                        </pic:spPr>
+                      </pic:pic>
+                    </a:graphicData>
+                  </a:graphic>
+                </wp:inline>
+              </w:drawing>
+            </w:r>
+          </w:p>
+          <w:p>
+            <w:pPr>
+              <w:jc w:val="both"/>
+              <w:rPr>
+                <w:rFonts w:ascii="Calibri" w:hAnsi="Calibri" w:cs="Arial"/>
+                <w:b/>
+                <w:iCs/>
+                <w:color w:val="000000" w:themeColor="text1"/>
+                <w:sz w:val="20"/>
+                <w:szCs w:val="20"/>
+                <w:lang w:eastAsia="es-CL"/>
+              </w:rPr>
+            </w:pPr>
+          </w:p>
+          <w:p>
+            <w:pPr>
+              <w:jc w:val="both"/>
+              <w:rPr>
+                <w:rFonts w:ascii="Calibri" w:hAnsi="Calibri" w:cs="Arial"/>
+                <w:b/>
+                <w:iCs/>
+                <w:color w:val="000000" w:themeColor="text1"/>
+                <w:sz w:val="20"/>
+                <w:szCs w:val="20"/>
+                <w:lang w:eastAsia="es-CL"/>
+              </w:rPr>
+            </w:pPr>
+            <w:r>
+              <w:rPr>
+                <w:rFonts w:ascii="Calibri" w:hAnsi="Calibri" w:cs="Arial"/>
+                <w:b/>
+                <w:iCs/>
+                <w:color w:val="000000" w:themeColor="text1"/>
+                <w:sz w:val="20"/>
+                <w:szCs w:val="20"/>
+                <w:lang w:eastAsia="es-CL"/>
+              </w:rPr>
+              <w:lastRenderedPageBreak/>
+              <w:drawing>
+                <wp:inline distT="0" distB="0" distL="0" distR="0" wp14:anchorId="0A3B1A1D" wp14:editId="0CDA2AD7">
+                  <wp:extent cx="2804615" cy="2518019"/>
+                  <wp:effectExtent l="0" t="0" r="0" b="0"/>
+                  <wp:docPr id="1237215996" name="Imagen 1"/>
+                  <wp:cNvGraphicFramePr>
+                    <a:graphicFrameLocks xmlns:a="http://schemas.openxmlformats.org/drawingml/2006/main" noChangeAspect="1"/>
+                  </wp:cNvGraphicFramePr>
+                  <a:graphic xmlns:a="http://schemas.openxmlformats.org/drawingml/2006/main">
+                    <a:graphicData uri="http://schemas.openxmlformats.org/drawingml/2006/picture">
+                      <pic:pic xmlns:pic="http://schemas.openxmlformats.org/drawingml/2006/picture">
+                        <pic:nvPicPr>
+                          <pic:cNvPr id="1237215996" name=""/>
+                          <pic:cNvPicPr/>
+                        </pic:nvPicPr>
+                        <pic:blipFill>
+                          <a:blip r:embed="rId18"/>
+                          <a:stretch>
+                            <a:fillRect/>
+                          </a:stretch>
+                        </pic:blipFill>
+                        <pic:spPr>
+                          <a:xfrm>
+                            <a:off x="0" y="0"/>
+                            <a:ext cx="2815153" cy="2527480"/>
+                          </a:xfrm>
+                          <a:prstGeom prst="rect">
+                            <a:avLst/>
+                          </a:prstGeom>
+                        </pic:spPr>
+                      </pic:pic>
+                    </a:graphicData>
+                  </a:graphic>
+                </wp:inline>
+              </w:drawing>
+            </w:r>
+          </w:p>
+          <w:p>
+            <w:pPr>
+              <w:jc w:val="both"/>
+              <w:rPr>
+                <w:rFonts w:ascii="Calibri" w:hAnsi="Calibri" w:cs="Arial"/>
+                <w:b/>
+                <w:iCs/>
+                <w:color w:val="000000" w:themeColor="text1"/>
+                <w:sz w:val="20"/>
+                <w:szCs w:val="20"/>
+                <w:lang w:eastAsia="es-CL"/>
+              </w:rPr>
+            </w:pPr>
+            <w:r>
+              <w:rPr>
+                <w:rFonts w:ascii="Calibri" w:hAnsi="Calibri" w:cs="Arial"/>
+                <w:b/>
+                <w:iCs/>
+                <w:color w:val="000000" w:themeColor="text1"/>
+                <w:sz w:val="20"/>
+                <w:szCs w:val="20"/>
+                <w:lang w:eastAsia="es-CL"/>
+              </w:rPr>
+              <w:t>VISTA DE VENTAS IMPORTAR Y VER DETALLE DE BOLETA</w:t>
+            </w:r>
+          </w:p>
+          <w:p>
+            <w:pPr>
+              <w:jc w:val="both"/>
+              <w:rPr>
+                <w:rFonts w:ascii="Calibri" w:hAnsi="Calibri" w:cs="Arial"/>
+                <w:b/>
+                <w:iCs/>
+                <w:color w:val="000000" w:themeColor="text1"/>
+                <w:sz w:val="20"/>
+                <w:szCs w:val="20"/>
+                <w:lang w:eastAsia="es-CL"/>
+              </w:rPr>
+            </w:pPr>
+            <w:r>
+              <w:rPr>
+                <w:rFonts w:ascii="Calibri" w:hAnsi="Calibri" w:cs="Arial"/>
+                <w:b/>
+                <w:iCs/>
+                <w:color w:val="000000" w:themeColor="text1"/>
+                <w:sz w:val="20"/>
+                <w:szCs w:val="20"/>
+                <w:lang w:eastAsia="es-CL"/>
+              </w:rPr>
+              <w:drawing>
+                <wp:inline distT="0" distB="0" distL="0" distR="0" wp14:anchorId="2FEEF6A6" wp14:editId="374C9C69">
+                  <wp:extent cx="4412781" cy="2040340"/>
+                  <wp:effectExtent l="0" t="0" r="6985" b="0"/>
+                  <wp:docPr id="1743719252" name="Imagen 1"/>
+                  <wp:cNvGraphicFramePr>
+                    <a:graphicFrameLocks xmlns:a="http://schemas.openxmlformats.org/drawingml/2006/main" noChangeAspect="1"/>
+                  </wp:cNvGraphicFramePr>
+                  <a:graphic xmlns:a="http://schemas.openxmlformats.org/drawingml/2006/main">
+                    <a:graphicData uri="http://schemas.openxmlformats.org/drawingml/2006/picture">
+                      <pic:pic xmlns:pic="http://schemas.openxmlformats.org/drawingml/2006/picture">
+                        <pic:nvPicPr>
+                          <pic:cNvPr id="1743719252" name=""/>
+                          <pic:cNvPicPr/>
+                        </pic:nvPicPr>
+                        <pic:blipFill>
+                          <a:blip r:embed="rId19"/>
+                          <a:stretch>
+                            <a:fillRect/>
+                          </a:stretch>
+                        </pic:blipFill>
+                        <pic:spPr>
+                          <a:xfrm>
+                            <a:off x="0" y="0"/>
+                            <a:ext cx="4435777" cy="2050972"/>
+                          </a:xfrm>
+                          <a:prstGeom prst="rect">
+                            <a:avLst/>
+                          </a:prstGeom>
+                        </pic:spPr>
+                      </pic:pic>
+                    </a:graphicData>
+                  </a:graphic>
+                </wp:inline>
+              </w:drawing>
+            </w:r>
+          </w:p>
+          <w:p>
+            <w:pPr>
+              <w:jc w:val="both"/>
+              <w:rPr>
+                <w:rFonts w:ascii="Calibri" w:hAnsi="Calibri" w:cs="Arial"/>
+                <w:b/>
+                <w:iCs/>
+                <w:color w:val="000000" w:themeColor="text1"/>
+                <w:sz w:val="20"/>
+                <w:szCs w:val="20"/>
+                <w:lang w:eastAsia="es-CL"/>
+              </w:rPr>
+            </w:pPr>
+            <w:r>
+              <w:rPr>
+                <w:rFonts w:ascii="Calibri" w:hAnsi="Calibri" w:cs="Arial"/>
+                <w:b/>
+                <w:iCs/>
+                <w:color w:val="000000" w:themeColor="text1"/>
+                <w:sz w:val="20"/>
+                <w:szCs w:val="20"/>
+                <w:lang w:eastAsia="es-CL"/>
+              </w:rPr>
+              <w:drawing>
+                <wp:inline distT="0" distB="0" distL="0" distR="0" wp14:anchorId="29D25ADC" wp14:editId="09669880">
+                  <wp:extent cx="1815152" cy="1463392"/>
+                  <wp:effectExtent l="0" t="0" r="0" b="3810"/>
+                  <wp:docPr id="1372393182" name="Imagen 1"/>
+                  <wp:cNvGraphicFramePr>
+                    <a:graphicFrameLocks xmlns:a="http://schemas.openxmlformats.org/drawingml/2006/main" noChangeAspect="1"/>
+                  </wp:cNvGraphicFramePr>
+                  <a:graphic xmlns:a="http://schemas.openxmlformats.org/drawingml/2006/main">
+                    <a:graphicData uri="http://schemas.openxmlformats.org/drawingml/2006/picture">
+                      <pic:pic xmlns:pic="http://schemas.openxmlformats.org/drawingml/2006/picture">
+                        <pic:nvPicPr>
+                          <pic:cNvPr id="1372393182" name=""/>
+                          <pic:cNvPicPr/>
+                        </pic:nvPicPr>
+                        <pic:blipFill>
+                          <a:blip r:embed="rId20"/>
+                          <a:stretch>
+                            <a:fillRect/>
+                          </a:stretch>
+                        </pic:blipFill>
+                        <pic:spPr>
+                          <a:xfrm>
+                            <a:off x="0" y="0"/>
+                            <a:ext cx="1829829" cy="1475225"/>
+                          </a:xfrm>
+                          <a:prstGeom prst="rect">
+                            <a:avLst/>
+                          </a:prstGeom>
+                        </pic:spPr>
+                      </pic:pic>
+                    </a:graphicData>
+                  </a:graphic>
+                </wp:inline>
+              </w:drawing>
+            </w:r>
+          </w:p>
+          <w:p>
+            <w:pPr>
+              <w:jc w:val="both"/>
+              <w:rPr>
+                <w:rFonts w:ascii="Calibri" w:hAnsi="Calibri" w:cs="Arial"/>
+                <w:b/>
+                <w:iCs/>
+                <w:color w:val="000000" w:themeColor="text1"/>
+                <w:sz w:val="20"/>
+                <w:szCs w:val="20"/>
+                <w:lang w:eastAsia="es-CL"/>
+              </w:rPr>
+            </w:pPr>
+            <w:r>
+              <w:rPr>
+                <w:rFonts w:ascii="Calibri" w:hAnsi="Calibri" w:cs="Arial"/>
+                <w:b/>
+                <w:iCs/>
+                <w:color w:val="000000" w:themeColor="text1"/>
+                <w:sz w:val="20"/>
+                <w:szCs w:val="20"/>
+                <w:lang w:eastAsia="es-CL"/>
+              </w:rPr>
+              <w:drawing>
+                <wp:inline distT="0" distB="0" distL="0" distR="0" wp14:anchorId="4F308369" wp14:editId="532CFF39">
+                  <wp:extent cx="3418764" cy="1617722"/>
+                  <wp:effectExtent l="0" t="0" r="0" b="1905"/>
+                  <wp:docPr id="505680099" name="Imagen 1"/>
+                  <wp:cNvGraphicFramePr>
+                    <a:graphicFrameLocks xmlns:a="http://schemas.openxmlformats.org/drawingml/2006/main" noChangeAspect="1"/>
+                  </wp:cNvGraphicFramePr>
+                  <a:graphic xmlns:a="http://schemas.openxmlformats.org/drawingml/2006/main">
+                    <a:graphicData uri="http://schemas.openxmlformats.org/drawingml/2006/picture">
+                      <pic:pic xmlns:pic="http://schemas.openxmlformats.org/drawingml/2006/picture">
+                        <pic:nvPicPr>
+                          <pic:cNvPr id="505680099" name=""/>
+                          <pic:cNvPicPr/>
+                        </pic:nvPicPr>
+                        <pic:blipFill>
+                          <a:blip r:embed="rId21"/>
+                          <a:stretch>
+                            <a:fillRect/>
+                          </a:stretch>
+                        </pic:blipFill>
+                        <pic:spPr>
+                          <a:xfrm>
+                            <a:off x="0" y="0"/>
+                            <a:ext cx="3427549" cy="1621879"/>
+                          </a:xfrm>
+                          <a:prstGeom prst="rect">
+                            <a:avLst/>
+                          </a:prstGeom>
+                        </pic:spPr>
+                      </pic:pic>
+                    </a:graphicData>
+                  </a:graphic>
+                </wp:inline>
+              </w:drawing>
+            </w:r>
+          </w:p>
+          <w:p>
+            <w:pPr>
+              <w:jc w:val="both"/>
+              <w:rPr>
+                <w:rFonts w:ascii="Calibri" w:hAnsi="Calibri" w:cs="Arial"/>
+                <w:b/>
+                <w:iCs/>
+                <w:color w:val="000000" w:themeColor="text1"/>
+                <w:sz w:val="20"/>
+                <w:szCs w:val="20"/>
+                <w:lang w:eastAsia="es-CL"/>
+              </w:rPr>
+            </w:pPr>
+          </w:p>
+          <w:p>
+            <w:pPr>
+              <w:jc w:val="both"/>
+              <w:rPr>
+                <w:rFonts w:ascii="Calibri" w:hAnsi="Calibri" w:cs="Arial"/>
+                <w:b/>
+                <w:iCs/>
+                <w:color w:val="000000" w:themeColor="text1"/>
+                <w:sz w:val="20"/>
+                <w:szCs w:val="20"/>
+                <w:lang w:eastAsia="es-CL"/>
+              </w:rPr>
+            </w:pPr>
+            <w:r>
+              <w:rPr>
+                <w:rFonts w:ascii="Calibri" w:hAnsi="Calibri" w:cs="Arial"/>
+                <w:b/>
+                <w:iCs/>
+                <w:color w:val="000000" w:themeColor="text1"/>
+                <w:sz w:val="20"/>
+                <w:szCs w:val="20"/>
+                <w:lang w:eastAsia="es-CL"/>
+              </w:rPr>
+              <w:t>VISTA DE PROVEEDORES NUEVO PROVEEDOR Y EDITAR PROVEEDOR</w:t>
+            </w:r>
+          </w:p>
+          <w:p>
+            <w:pPr>
+              <w:jc w:val="both"/>
+              <w:rPr>
+                <w:rFonts w:ascii="Calibri" w:hAnsi="Calibri" w:cs="Arial"/>
+                <w:b/>
+                <w:iCs/>
+                <w:color w:val="000000" w:themeColor="text1"/>
+                <w:sz w:val="20"/>
+                <w:szCs w:val="20"/>
+                <w:lang w:eastAsia="es-CL"/>
+              </w:rPr>
+            </w:pPr>
+            <w:r>
+              <w:rPr>
+                <w:rFonts w:ascii="Calibri" w:hAnsi="Calibri" w:cs="Arial"/>
+                <w:b/>
+                <w:iCs/>
+                <w:color w:val="000000" w:themeColor="text1"/>
+                <w:sz w:val="20"/>
+                <w:szCs w:val="20"/>
+                <w:lang w:eastAsia="es-CL"/>
+              </w:rPr>
+              <w:drawing>
+                <wp:inline distT="0" distB="0" distL="0" distR="0" wp14:anchorId="219E84D5" wp14:editId="520A19A6">
+                  <wp:extent cx="4528795" cy="1903863"/>
+                  <wp:effectExtent l="0" t="0" r="5715" b="1270"/>
+                  <wp:docPr id="1307049923" name="Imagen 1"/>
+                  <wp:cNvGraphicFramePr>
+                    <a:graphicFrameLocks xmlns:a="http://schemas.openxmlformats.org/drawingml/2006/main" noChangeAspect="1"/>
+                  </wp:cNvGraphicFramePr>
+                  <a:graphic xmlns:a="http://schemas.openxmlformats.org/drawingml/2006/main">
+                    <a:graphicData uri="http://schemas.openxmlformats.org/drawingml/2006/picture">
+                      <pic:pic xmlns:pic="http://schemas.openxmlformats.org/drawingml/2006/picture">
+                        <pic:nvPicPr>
+                          <pic:cNvPr id="1307049923" name=""/>
+                          <pic:cNvPicPr/>
+                        </pic:nvPicPr>
+                        <pic:blipFill>
+                          <a:blip r:embed="rId22"/>
+                          <a:stretch>
+                            <a:fillRect/>
+                          </a:stretch>
+                        </pic:blipFill>
+                        <pic:spPr>
+                          <a:xfrm>
+                            <a:off x="0" y="0"/>
+                            <a:ext cx="4548707" cy="1912234"/>
+                          </a:xfrm>
+                          <a:prstGeom prst="rect">
+                            <a:avLst/>
+                          </a:prstGeom>
+                        </pic:spPr>
+                      </pic:pic>
+                    </a:graphicData>
+                  </a:graphic>
+                </wp:inline>
+              </w:drawing>
+            </w:r>
+          </w:p>
+          <w:p>
+            <w:pPr>
+              <w:jc w:val="both"/>
+              <w:rPr>
+                <w:rFonts w:ascii="Calibri" w:hAnsi="Calibri" w:cs="Arial"/>
+                <w:b/>
+                <w:iCs/>
+                <w:color w:val="000000" w:themeColor="text1"/>
+                <w:sz w:val="20"/>
+                <w:szCs w:val="20"/>
+                <w:lang w:eastAsia="es-CL"/>
+              </w:rPr>
+            </w:pPr>
+            <w:r>
+              <w:rPr>
+                <w:rFonts w:ascii="Calibri" w:hAnsi="Calibri" w:cs="Arial"/>
+                <w:b/>
+                <w:iCs/>
+                <w:color w:val="000000" w:themeColor="text1"/>
+                <w:sz w:val="20"/>
+                <w:szCs w:val="20"/>
+                <w:lang w:eastAsia="es-CL"/>
+              </w:rPr>
+              <w:drawing>
+                <wp:inline distT="0" distB="0" distL="0" distR="0" wp14:anchorId="16EF9B68" wp14:editId="48EA2F7C">
+                  <wp:extent cx="3993775" cy="2599898"/>
+                  <wp:effectExtent l="0" t="0" r="6985" b="0"/>
+                  <wp:docPr id="1399888309" name="Imagen 1"/>
+                  <wp:cNvGraphicFramePr>
+                    <a:graphicFrameLocks xmlns:a="http://schemas.openxmlformats.org/drawingml/2006/main" noChangeAspect="1"/>
+                  </wp:cNvGraphicFramePr>
+                  <a:graphic xmlns:a="http://schemas.openxmlformats.org/drawingml/2006/main">
+                    <a:graphicData uri="http://schemas.openxmlformats.org/drawingml/2006/picture">
+                      <pic:pic xmlns:pic="http://schemas.openxmlformats.org/drawingml/2006/picture">
+                        <pic:nvPicPr>
+                          <pic:cNvPr id="1399888309" name=""/>
+                          <pic:cNvPicPr/>
+                        </pic:nvPicPr>
+                        <pic:blipFill>
+                          <a:blip r:embed="rId23"/>
+                          <a:stretch>
+                            <a:fillRect/>
+                          </a:stretch>
+                        </pic:blipFill>
+                        <pic:spPr>
+                          <a:xfrm>
+                            <a:off x="0" y="0"/>
+                            <a:ext cx="4015965" cy="2614343"/>
+                          </a:xfrm>
+                          <a:prstGeom prst="rect">
+                            <a:avLst/>
+                          </a:prstGeom>
+                        </pic:spPr>
+                      </pic:pic>
+                    </a:graphicData>
+                  </a:graphic>
+                </wp:inline>
+              </w:drawing>
+            </w:r>
+          </w:p>
+          <w:p>
+            <w:pPr>
+              <w:jc w:val="both"/>
+              <w:rPr>
+                <w:rFonts w:ascii="Calibri" w:hAnsi="Calibri" w:cs="Arial"/>
+                <w:b/>
+                <w:iCs/>
+                <w:color w:val="000000" w:themeColor="text1"/>
+                <w:sz w:val="20"/>
+                <w:szCs w:val="20"/>
+                <w:lang w:eastAsia="es-CL"/>
+              </w:rPr>
+            </w:pPr>
+            <w:r>
+              <w:rPr>
+                <w:rFonts w:ascii="Calibri" w:hAnsi="Calibri" w:cs="Arial"/>
+                <w:b/>
+                <w:iCs/>
+                <w:color w:val="000000" w:themeColor="text1"/>
+                <w:sz w:val="20"/>
+                <w:szCs w:val="20"/>
+                <w:lang w:eastAsia="es-CL"/>
+              </w:rPr>
+              <w:drawing>
+                <wp:inline distT="0" distB="0" distL="0" distR="0" wp14:anchorId="087E3E09" wp14:editId="736A2962">
+                  <wp:extent cx="4101152" cy="2520780"/>
+                  <wp:effectExtent l="0" t="0" r="0" b="0"/>
+                  <wp:docPr id="1215478936" name="Imagen 1"/>
+                  <wp:cNvGraphicFramePr>
+                    <a:graphicFrameLocks xmlns:a="http://schemas.openxmlformats.org/drawingml/2006/main" noChangeAspect="1"/>
+                  </wp:cNvGraphicFramePr>
+                  <a:graphic xmlns:a="http://schemas.openxmlformats.org/drawingml/2006/main">
+                    <a:graphicData uri="http://schemas.openxmlformats.org/drawingml/2006/picture">
+                      <pic:pic xmlns:pic="http://schemas.openxmlformats.org/drawingml/2006/picture">
+                        <pic:nvPicPr>
+                          <pic:cNvPr id="1215478936" name=""/>
+                          <pic:cNvPicPr/>
+                        </pic:nvPicPr>
+                        <pic:blipFill>
+                          <a:blip r:embed="rId24"/>
+                          <a:stretch>
+                            <a:fillRect/>
+                          </a:stretch>
+                        </pic:blipFill>
+                        <pic:spPr>
+                          <a:xfrm>
+                            <a:off x="0" y="0"/>
+                            <a:ext cx="4128688" cy="2537705"/>
+                          </a:xfrm>
+                          <a:prstGeom prst="rect">
+                            <a:avLst/>
+                          </a:prstGeom>
+                        </pic:spPr>
+                      </pic:pic>
+                    </a:graphicData>
+                  </a:graphic>
+                </wp:inline>
+              </w:drawing>
+            </w:r>
+          </w:p>
+          <w:p>
+            <w:pPr>
+              <w:jc w:val="both"/>
+              <w:rPr>
+                <w:rFonts w:ascii="Calibri" w:hAnsi="Calibri" w:cs="Arial"/>
+                <w:b/>
+                <w:iCs/>
+                <w:color w:val="000000" w:themeColor="text1"/>
+                <w:sz w:val="20"/>
+                <w:szCs w:val="20"/>
+                <w:lang w:eastAsia="es-CL"/>
+              </w:rPr>
+            </w:pPr>
+          </w:p>
+          <w:p>
+            <w:pPr>
+              <w:jc w:val="both"/>
+              <w:rPr>
+                <w:rFonts w:ascii="Calibri" w:hAnsi="Calibri" w:cs="Arial"/>
+                <w:b/>
+                <w:iCs/>
+                <w:color w:val="000000" w:themeColor="text1"/>
+                <w:sz w:val="20"/>
+                <w:szCs w:val="20"/>
+                <w:lang w:eastAsia="es-CL"/>
+              </w:rPr>
+            </w:pPr>
+          </w:p>
+          <w:p>
+            <w:pPr>
+              <w:jc w:val="both"/>
+              <w:rPr>
+                <w:rFonts w:ascii="Calibri" w:hAnsi="Calibri" w:cs="Arial"/>
+                <w:b/>
+                <w:iCs/>
+                <w:color w:val="000000" w:themeColor="text1"/>
+                <w:sz w:val="20"/>
+                <w:szCs w:val="20"/>
+                <w:u w:val="single"/>
+                <w:lang w:eastAsia="es-CL"/>
+              </w:rPr>
+            </w:pPr>
+            <w:r>
+              <w:rPr>
+                <w:rFonts w:ascii="Calibri" w:hAnsi="Calibri" w:cs="Arial"/>
+                <w:b/>
+                <w:iCs/>
+                <w:color w:val="000000" w:themeColor="text1"/>
+                <w:sz w:val="20"/>
+                <w:szCs w:val="20"/>
+                <w:lang w:eastAsia="es-CL"/>
+              </w:rPr>
+              <w:lastRenderedPageBreak/>
+              <w:t>VISTA DE ADMINISTRACION Y NUEVO USUARIO</w:t>
+            </w:r>
+          </w:p>
+          <w:p>
+            <w:pPr>
+              <w:jc w:val="both"/>
+              <w:rPr>
+                <w:rFonts w:ascii="Calibri" w:hAnsi="Calibri" w:cs="Arial"/>
+                <w:b/>
+                <w:iCs/>
+                <w:color w:val="000000" w:themeColor="text1"/>
+                <w:sz w:val="20"/>
+                <w:szCs w:val="20"/>
+                <w:u w:val="single"/>
+                <w:lang w:eastAsia="es-CL"/>
+              </w:rPr>
+            </w:pPr>
+            <w:r>
+              <w:rPr>
+                <w:rFonts w:ascii="Calibri" w:hAnsi="Calibri" w:cs="Arial"/>
+                <w:b/>
+                <w:iCs/>
+                <w:color w:val="000000" w:themeColor="text1"/>
+                <w:sz w:val="20"/>
+                <w:szCs w:val="20"/>
+                <w:u w:val="single"/>
+                <w:lang w:eastAsia="es-CL"/>
+              </w:rPr>
+              <w:drawing>
+                <wp:inline distT="0" distB="0" distL="0" distR="0" wp14:anchorId="7888B2D4" wp14:editId="3016322D">
+                  <wp:extent cx="4537951" cy="1897039"/>
+                  <wp:effectExtent l="0" t="0" r="0" b="8255"/>
+                  <wp:docPr id="1194234671" name="Imagen 1"/>
+                  <wp:cNvGraphicFramePr>
+                    <a:graphicFrameLocks xmlns:a="http://schemas.openxmlformats.org/drawingml/2006/main" noChangeAspect="1"/>
+                  </wp:cNvGraphicFramePr>
+                  <a:graphic xmlns:a="http://schemas.openxmlformats.org/drawingml/2006/main">
+                    <a:graphicData uri="http://schemas.openxmlformats.org/drawingml/2006/picture">
+                      <pic:pic xmlns:pic="http://schemas.openxmlformats.org/drawingml/2006/picture">
+                        <pic:nvPicPr>
+                          <pic:cNvPr id="1194234671" name=""/>
+                          <pic:cNvPicPr/>
+                        </pic:nvPicPr>
+                        <pic:blipFill>
+                          <a:blip r:embed="rId25"/>
+                          <a:stretch>
+                            <a:fillRect/>
+                          </a:stretch>
+                        </pic:blipFill>
+                        <pic:spPr>
+                          <a:xfrm>
+                            <a:off x="0" y="0"/>
+                            <a:ext cx="4568716" cy="1909900"/>
+                          </a:xfrm>
+                          <a:prstGeom prst="rect">
+                            <a:avLst/>
+                          </a:prstGeom>
+                        </pic:spPr>
+                      </pic:pic>
+                    </a:graphicData>
+                  </a:graphic>
+                </wp:inline>
+              </w:drawing>
+            </w:r>
+          </w:p>
+          <w:p>
+            <w:pPr>
+              <w:jc w:val="both"/>
+              <w:rPr>
+                <w:rFonts w:ascii="Calibri" w:hAnsi="Calibri" w:cs="Arial"/>
+                <w:b/>
+                <w:iCs/>
+                <w:color w:val="000000" w:themeColor="text1"/>
+                <w:sz w:val="20"/>
+                <w:szCs w:val="20"/>
+                <w:u w:val="single"/>
+                <w:lang w:eastAsia="es-CL"/>
+              </w:rPr>
+            </w:pPr>
+            <w:r>
+              <w:rPr>
+                <w:rFonts w:ascii="Calibri" w:hAnsi="Calibri" w:cs="Arial"/>
+                <w:b/>
+                <w:iCs/>
+                <w:color w:val="000000" w:themeColor="text1"/>
+                <w:sz w:val="20"/>
+                <w:szCs w:val="20"/>
+                <w:u w:val="single"/>
+                <w:lang w:eastAsia="es-CL"/>
+              </w:rPr>
+              <w:drawing>
+                <wp:inline distT="0" distB="0" distL="0" distR="0" wp14:anchorId="23BCAEE5" wp14:editId="10BE5602">
+                  <wp:extent cx="3534770" cy="2133997"/>
+                  <wp:effectExtent l="0" t="0" r="8890" b="0"/>
+                  <wp:docPr id="1282445931" name="Imagen 1"/>
+                  <wp:cNvGraphicFramePr>
+                    <a:graphicFrameLocks xmlns:a="http://schemas.openxmlformats.org/drawingml/2006/main" noChangeAspect="1"/>
+                  </wp:cNvGraphicFramePr>
+                  <a:graphic xmlns:a="http://schemas.openxmlformats.org/drawingml/2006/main">
+                    <a:graphicData uri="http://schemas.openxmlformats.org/drawingml/2006/picture">
+                      <pic:pic xmlns:pic="http://schemas.openxmlformats.org/drawingml/2006/picture">
+                        <pic:nvPicPr>
+                          <pic:cNvPr id="1282445931" name=""/>
+                          <pic:cNvPicPr/>
+                        </pic:nvPicPr>
+                        <pic:blipFill>
+                          <a:blip r:embed="rId26"/>
+                          <a:stretch>
+                            <a:fillRect/>
+                          </a:stretch>
+                        </pic:blipFill>
+                        <pic:spPr>
+                          <a:xfrm>
+                            <a:off x="0" y="0"/>
+                            <a:ext cx="3550033" cy="2143212"/>
+                          </a:xfrm>
+                          <a:prstGeom prst="rect">
+                            <a:avLst/>
+                          </a:prstGeom>
+                        </pic:spPr>
+                      </pic:pic>
+                    </a:graphicData>
+                  </a:graphic>
+                </wp:inline>
+              </w:drawing>
+            </w:r>
+          </w:p>
+          <w:p>
+            <w:pPr>
+              <w:jc w:val="both"/>
+              <w:rPr>
+                <w:rFonts w:ascii="Calibri" w:hAnsi="Calibri" w:cs="Arial"/>
+                <w:b/>
+                <w:iCs/>
+                <w:color w:val="000000" w:themeColor="text1"/>
+                <w:sz w:val="20"/>
+                <w:szCs w:val="20"/>
+                <w:u w:val="single"/>
+                <w:lang w:eastAsia="es-CL"/>
+              </w:rPr>
+            </w:pPr>
+            <w:r>
+              <w:rPr>
+                <w:rFonts w:ascii="Calibri" w:hAnsi="Calibri" w:cs="Arial"/>
+                <w:b/>
+                <w:iCs/>
+                <w:color w:val="000000" w:themeColor="text1"/>
+                <w:sz w:val="20"/>
+                <w:szCs w:val="20"/>
+                <w:u w:val="single"/>
+                <w:lang w:eastAsia="es-CL"/>
+              </w:rPr>
+              <w:t>ESCANEAR PRODUCTOS</w:t>
+            </w:r>
+          </w:p>
+          <w:p>
+            <w:pPr>
+              <w:jc w:val="both"/>
+              <w:rPr>
+                <w:rFonts w:ascii="Calibri" w:hAnsi="Calibri" w:cs="Arial"/>
+                <w:b/>
+                <w:iCs/>
+                <w:color w:val="000000" w:themeColor="text1"/>
+                <w:sz w:val="20"/>
+                <w:szCs w:val="20"/>
+                <w:u w:val="single"/>
+                <w:lang w:eastAsia="es-CL"/>
+              </w:rPr>
+            </w:pPr>
+            <w:r>
+              <w:rPr>
+                <w:rFonts w:ascii="Calibri" w:hAnsi="Calibri" w:cs="Arial"/>
+                <w:b/>
+                <w:iCs/>
+                <w:color w:val="000000" w:themeColor="text1"/>
+                <w:sz w:val="20"/>
+                <w:szCs w:val="20"/>
+                <w:u w:val="single"/>
+                <w:lang w:eastAsia="es-CL"/>
+              </w:rPr>
+              <w:drawing>
+                <wp:inline distT="0" distB="0" distL="0" distR="0" wp14:anchorId="79C5CAFD" wp14:editId="675F9BFC">
+                  <wp:extent cx="4780583" cy="3466822"/>
+                  <wp:effectExtent l="0" t="0" r="1270" b="635"/>
+                  <wp:docPr id="1578653397" name="Imagen 1"/>
+                  <wp:cNvGraphicFramePr>
+                    <a:graphicFrameLocks xmlns:a="http://schemas.openxmlformats.org/drawingml/2006/main" noChangeAspect="1"/>
+                  </wp:cNvGraphicFramePr>
+                  <a:graphic xmlns:a="http://schemas.openxmlformats.org/drawingml/2006/main">
+                    <a:graphicData uri="http://schemas.openxmlformats.org/drawingml/2006/picture">
+                      <pic:pic xmlns:pic="http://schemas.openxmlformats.org/drawingml/2006/picture">
+                        <pic:nvPicPr>
+                          <pic:cNvPr id="1578653397" name=""/>
+                          <pic:cNvPicPr/>
+                        </pic:nvPicPr>
+                        <pic:blipFill>
+                          <a:blip r:embed="rId27"/>
+                          <a:stretch>
+                            <a:fillRect/>
+                          </a:stretch>
+                        </pic:blipFill>
+                        <pic:spPr>
+                          <a:xfrm>
+                            <a:off x="0" y="0"/>
+                            <a:ext cx="4816128" cy="3492599"/>
+                          </a:xfrm>
+                          <a:prstGeom prst="rect">
+                            <a:avLst/>
+                          </a:prstGeom>
+                        </pic:spPr>
+                      </pic:pic>
+                    </a:graphicData>
+                  </a:graphic>
+                </wp:inline>
+              </w:drawing>
+            </w:r>
+          </w:p>
+          <w:p>
+            <w:pPr>
+              <w:jc w:val="both"/>
+              <w:rPr>
+                <w:rFonts w:ascii="Calibri" w:hAnsi="Calibri" w:cs="Arial"/>
+                <w:b/>
+                <w:iCs/>
+                <w:color w:val="000000" w:themeColor="text1"/>
+                <w:sz w:val="20"/>
+                <w:szCs w:val="20"/>
+                <w:u w:val="single"/>
+                <w:lang w:eastAsia="es-CL"/>
+              </w:rPr>
+            </w:pPr>
+            <w:r>
+              <w:rPr>
+                <w:rFonts w:ascii="Calibri" w:hAnsi="Calibri" w:cs="Arial"/>
+                <w:b/>
+                <w:iCs/>
+                <w:color w:val="000000" w:themeColor="text1"/>
+                <w:sz w:val="20"/>
+                <w:szCs w:val="20"/>
+                <w:u w:val="single"/>
+                <w:lang w:eastAsia="es-CL"/>
+              </w:rPr>
+              <w:lastRenderedPageBreak/>
+              <w:drawing>
+                <wp:inline distT="0" distB="0" distL="0" distR="0" wp14:anchorId="1989A35D" wp14:editId="3D12E9AB">
+                  <wp:extent cx="4804012" cy="3203051"/>
+                  <wp:effectExtent l="0" t="0" r="0" b="0"/>
+                  <wp:docPr id="1806440116" name="Imagen 1"/>
+                  <wp:cNvGraphicFramePr>
+                    <a:graphicFrameLocks xmlns:a="http://schemas.openxmlformats.org/drawingml/2006/main" noChangeAspect="1"/>
+                  </wp:cNvGraphicFramePr>
+                  <a:graphic xmlns:a="http://schemas.openxmlformats.org/drawingml/2006/main">
+                    <a:graphicData uri="http://schemas.openxmlformats.org/drawingml/2006/picture">
+                      <pic:pic xmlns:pic="http://schemas.openxmlformats.org/drawingml/2006/picture">
+                        <pic:nvPicPr>
+                          <pic:cNvPr id="1806440116" name=""/>
+                          <pic:cNvPicPr/>
+                        </pic:nvPicPr>
+                        <pic:blipFill>
+                          <a:blip r:embed="rId28"/>
+                          <a:stretch>
+                            <a:fillRect/>
+                          </a:stretch>
+                        </pic:blipFill>
+                        <pic:spPr>
+                          <a:xfrm>
+                            <a:off x="0" y="0"/>
+                            <a:ext cx="4808227" cy="3205861"/>
+                          </a:xfrm>
+                          <a:prstGeom prst="rect">
+                            <a:avLst/>
+                          </a:prstGeom>
+                        </pic:spPr>
+                      </pic:pic>
+                    </a:graphicData>
+                  </a:graphic>
+                </wp:inline>
+              </w:drawing>
+            </w:r>
+          </w:p>
+          <w:p>
+            <w:pPr>
+              <w:jc w:val="both"/>
+              <w:rPr>
+                <w:rFonts w:ascii="Calibri" w:hAnsi="Calibri" w:cs="Arial"/>
+                <w:b/>
+                <w:iCs/>
+                <w:color w:val="000000" w:themeColor="text1"/>
+                <w:sz w:val="20"/>
+                <w:szCs w:val="20"/>
+                <w:u w:val="single"/>
+                <w:lang w:eastAsia="es-CL"/>
+              </w:rPr>
+            </w:pPr>
+            <w:r>
+              <w:rPr>
+                <w:rFonts w:ascii="Calibri" w:hAnsi="Calibri" w:cs="Arial"/>
+                <w:b/>
+                <w:iCs/>
+                <w:color w:val="000000" w:themeColor="text1"/>
+                <w:sz w:val="20"/>
+                <w:szCs w:val="20"/>
+                <w:u w:val="single"/>
+                <w:lang w:eastAsia="es-CL"/>
+              </w:rPr>
+              <w:drawing>
+                <wp:inline distT="0" distB="0" distL="0" distR="0" wp14:anchorId="0BA4AEBE" wp14:editId="309104C5">
+                  <wp:extent cx="4680585" cy="4367283"/>
+                  <wp:effectExtent l="0" t="0" r="5715" b="0"/>
+                  <wp:docPr id="398176739" name="Imagen 1"/>
+                  <wp:cNvGraphicFramePr>
+                    <a:graphicFrameLocks xmlns:a="http://schemas.openxmlformats.org/drawingml/2006/main" noChangeAspect="1"/>
+                  </wp:cNvGraphicFramePr>
+                  <a:graphic xmlns:a="http://schemas.openxmlformats.org/drawingml/2006/main">
+                    <a:graphicData uri="http://schemas.openxmlformats.org/drawingml/2006/picture">
+                      <pic:pic xmlns:pic="http://schemas.openxmlformats.org/drawingml/2006/picture">
+                        <pic:nvPicPr>
+                          <pic:cNvPr id="398176739" name=""/>
+                          <pic:cNvPicPr/>
+                        </pic:nvPicPr>
+                        <pic:blipFill>
+                          <a:blip r:embed="rId29"/>
+                          <a:stretch>
+                            <a:fillRect/>
+                          </a:stretch>
+                        </pic:blipFill>
+                        <pic:spPr>
+                          <a:xfrm>
+                            <a:off x="0" y="0"/>
+                            <a:ext cx="4706677" cy="4391628"/>
+                          </a:xfrm>
+                          <a:prstGeom prst="rect">
+                            <a:avLst/>
+                          </a:prstGeom>
+                        </pic:spPr>
+                      </pic:pic>
+                    </a:graphicData>
+                  </a:graphic>
+                </wp:inline>
+              </w:drawing>
+            </w:r>
+          </w:p>
+          <w:p>
+            <w:pPr>
+              <w:jc w:val="both"/>
+              <w:rPr>
+                <w:rFonts w:ascii="Calibri" w:hAnsi="Calibri" w:cs="Arial"/>
+                <w:b/>
+                <w:iCs/>
+                <w:color w:val="000000" w:themeColor="text1"/>
+                <w:sz w:val="20"/>
+                <w:szCs w:val="20"/>
+                <w:u w:val="single"/>
+                <w:lang w:eastAsia="es-CL"/>
+              </w:rPr>
+            </w:pPr>
           </w:p>
         </w:tc>
       </w:tr>
     </w:tbl>
+    <w:p>
+      <w:pPr>
+        <w:spacing w:after="0" w:line="240" w:lineRule="auto"/>
+        <w:rPr>
+          <w:rFonts w:cs="Calibri Light"/>
+          <w:color w:val="595959" w:themeColor="text1" w:themeTint="A6"/>
+          <w:sz w:val="24"/>
+          <w:szCs w:val="24"/>
+          <w:lang w:val="es-ES"/>
+        </w:rPr>
+      </w:pPr>
+    </w:p>
+    <w:p>
+      <w:pPr>
+        <w:spacing w:after="0" w:line="240" w:lineRule="auto"/>
+        <w:rPr>
+          <w:rFonts w:cs="Calibri Light"/>
+          <w:color w:val="595959" w:themeColor="text1" w:themeTint="A6"/>
+          <w:sz w:val="24"/>
+          <w:szCs w:val="24"/>
+          <w:lang w:val="es-ES"/>
+        </w:rPr>
+      </w:pPr>
+      <w:r>
+        <w:rPr>
+          <w:rFonts w:cs="Calibri Light"/>
+          <w:color w:val="595959" w:themeColor="text1" w:themeTint="A6"/>
+          <w:sz w:val="24"/>
+          <w:szCs w:val="24"/>
+          <w:lang w:val="es-ES"/>
+        </w:rPr>
+        <w:br w:type="page"/>
+      </w:r>
+    </w:p>
     <w:tbl>
       <w:tblPr>
         <w:tblStyle w:val="Tablaconcuadrcula"/>
-        <w:tblpPr w:leftFromText="141" w:rightFromText="141" w:vertAnchor="text" w:horzAnchor="margin" w:tblpX="-582" w:tblpY="-116"/>
-        <w:tblW w:w="9503" w:type="dxa"/>
+        <w:tblpPr w:leftFromText="141" w:rightFromText="141" w:vertAnchor="text" w:horzAnchor="margin" w:tblpXSpec="center" w:tblpY="207"/>
+        <w:tblW w:w="9640" w:type="dxa"/>
         <w:tblBorders>
           <w:top w:val="single" w:sz="4" w:space="0" w:color="BFBFBF" w:themeColor="background1" w:themeShade="BF"/>
           <w:left w:val="single" w:sz="4" w:space="0" w:color="BFBFBF" w:themeColor="background1" w:themeShade="BF"/>
@@ -1401,7 +2780,7 @@
         <w:tblLook w:val="04A0" w:firstRow="1" w:lastRow="0" w:firstColumn="1" w:lastColumn="0" w:noHBand="0" w:noVBand="1"/>
       </w:tblPr>
       <w:tblGrid>
-        <w:gridCol w:w="9503"/>
+        <w:gridCol w:w="9640"/>
       </w:tblGrid>
       <w:tr>
         <w:trPr>
@@ -1409,7 +2788,7 @@
         </w:trPr>
         <w:tc>
           <w:tcPr>
-            <w:tcW w:w="9503" w:type="dxa"/>
+            <w:tcW w:w="9640" w:type="dxa"/>
             <w:vAlign w:val="center"/>
           </w:tcPr>
           <w:p>
@@ -1428,6 +2807,7 @@
                 <w:sz w:val="28"/>
                 <w:szCs w:val="28"/>
               </w:rPr>
+              <w:lastRenderedPageBreak/>
               <w:t>2</w:t>
             </w:r>
             <w:r>
@@ -1457,7 +2837,7 @@
         </w:trPr>
         <w:tc>
           <w:tcPr>
-            <w:tcW w:w="9503" w:type="dxa"/>
+            <w:tcW w:w="9640" w:type="dxa"/>
             <w:shd w:val="clear" w:color="auto" w:fill="D9E2F3" w:themeFill="accent1" w:themeFillTint="33"/>
             <w:vAlign w:val="center"/>
           </w:tcPr>
@@ -1557,7 +2937,6 @@
                 <w:color w:val="1F3864" w:themeColor="accent1" w:themeShade="80"/>
                 <w:sz w:val="18"/>
               </w:rPr>
-              <w:lastRenderedPageBreak/>
               <w:t>Plan de Trabajo</w:t>
             </w:r>
           </w:p>
@@ -2590,8 +3969,6 @@
               <w:jc w:val="both"/>
               <w:rPr>
                 <w:rFonts w:ascii="Calibri" w:hAnsi="Calibri" w:cs="Arial"/>
-                <w:i/>
-                <w:iCs/>
                 <w:color w:val="548DD4"/>
                 <w:sz w:val="20"/>
                 <w:szCs w:val="20"/>
@@ -2663,6 +4040,16 @@
                 <w:szCs w:val="20"/>
                 <w:lang w:eastAsia="es-CL"/>
               </w:rPr>
+              <w:t xml:space="preserve"> </w:t>
+            </w:r>
+            <w:r>
+              <w:rPr>
+                <w:rFonts w:ascii="Calibri" w:hAnsi="Calibri" w:cs="Arial"/>
+                <w:color w:val="000000" w:themeColor="text1"/>
+                <w:sz w:val="20"/>
+                <w:szCs w:val="20"/>
+                <w:lang w:eastAsia="es-CL"/>
+              </w:rPr>
               <w:t xml:space="preserve">Entre los factores que han facilitado el desarrollo del proyecto APT se encuentra el avance progresivo en la implementación de las funcionalidades principales de </w:t>
             </w:r>
             <w:proofErr w:type="spellStart"/>
@@ -2737,21 +4124,33 @@
               <w:jc w:val="both"/>
               <w:rPr>
                 <w:rFonts w:ascii="Calibri" w:hAnsi="Calibri" w:cs="Arial"/>
-                <w:color w:val="000000" w:themeColor="text1"/>
-                <w:sz w:val="20"/>
-                <w:szCs w:val="20"/>
-                <w:lang w:eastAsia="es-CL"/>
-              </w:rPr>
-            </w:pPr>
-            <w:r>
-              <w:rPr>
-                <w:rFonts w:ascii="Calibri" w:hAnsi="Calibri" w:cs="Arial"/>
-                <w:color w:val="000000" w:themeColor="text1"/>
-                <w:sz w:val="20"/>
-                <w:szCs w:val="20"/>
-                <w:lang w:eastAsia="es-CL"/>
-              </w:rPr>
-              <w:t>Para abordar esta dificultad, se contempla retomar las actividades pendientes una vez finalizada la práctica profesional, reorganizando los tiempos de trabajo y priorizando las tareas según su importancia para el cumplimiento de los objetivos. De esta manera, se busca avanzar en las funcionalidades restantes, mejorar la integración entre los módulos y verificar el correcto funcionamiento del sistema.</w:t>
+                <w:i/>
+                <w:color w:val="548DD4"/>
+                <w:sz w:val="20"/>
+                <w:szCs w:val="20"/>
+                <w:lang w:eastAsia="es-CL"/>
+              </w:rPr>
+            </w:pPr>
+            <w:r>
+              <w:rPr>
+                <w:rFonts w:ascii="Calibri" w:hAnsi="Calibri" w:cs="Arial"/>
+                <w:color w:val="000000" w:themeColor="text1"/>
+                <w:sz w:val="20"/>
+                <w:szCs w:val="20"/>
+                <w:lang w:eastAsia="es-CL"/>
+              </w:rPr>
+              <w:t xml:space="preserve">Para abordar esta dificultad, se contempla retomar las actividades pendientes una vez finalizada la práctica profesional, reorganizando los tiempos de trabajo y priorizando las tareas según su importancia para el </w:t>
+            </w:r>
+            <w:r>
+              <w:rPr>
+                <w:rFonts w:ascii="Calibri" w:hAnsi="Calibri" w:cs="Arial"/>
+                <w:color w:val="000000" w:themeColor="text1"/>
+                <w:sz w:val="20"/>
+                <w:szCs w:val="20"/>
+                <w:lang w:eastAsia="es-CL"/>
+              </w:rPr>
+              <w:lastRenderedPageBreak/>
+              <w:t>cumplimiento de los objetivos. De esta manera, se busca avanzar en las funcionalidades restantes, mejorar la integración entre los módulos y verificar el correcto funcionamiento del sistema.</w:t>
             </w:r>
           </w:p>
         </w:tc>
@@ -3382,7 +4781,7 @@
       </w:pPr>
     </w:p>
     <w:sectPr>
-      <w:headerReference w:type="default" r:id="rId10"/>
+      <w:headerReference w:type="default" r:id="rId30"/>
       <w:pgSz w:w="11906" w:h="16838"/>
       <w:pgMar w:top="1417" w:right="1701" w:bottom="1417" w:left="1701" w:header="708" w:footer="708" w:gutter="0"/>
       <w:cols w:space="708"/>
@@ -3848,7 +5247,7 @@
       </w:rPr>
     </w:lvl>
   </w:abstractNum>
-  <w:num w:numId="1" w16cid:durableId="1293943374">
+  <w:num w:numId="1" w16cid:durableId="159582011">
     <w:abstractNumId w:val="0"/>
   </w:num>
 </w:numbering>
@@ -4282,6 +5681,7 @@
   <w:style w:type="character" w:default="1" w:styleId="Fuentedeprrafopredeter">
     <w:name w:val="Default Paragraph Font"/>
     <w:uiPriority w:val="1"/>
+    <w:semiHidden/>
     <w:unhideWhenUsed/>
   </w:style>
   <w:style w:type="table" w:default="1" w:styleId="Tablanormal">
@@ -4544,19 +5944,6 @@
       <w:bCs/>
       <w:sz w:val="20"/>
       <w:szCs w:val="20"/>
-    </w:rPr>
-  </w:style>
-  <w:style w:type="paragraph" w:styleId="NormalWeb">
-    <w:name w:val="Normal (Web)"/>
-    <w:basedOn w:val="Normal"/>
-    <w:uiPriority w:val="99"/>
-    <w:semiHidden/>
-    <w:unhideWhenUsed/>
-    <w:rsid w:val="00A54DFB"/>
-    <w:rPr>
-      <w:rFonts w:ascii="Times New Roman" w:hAnsi="Times New Roman" w:cs="Times New Roman"/>
-      <w:sz w:val="24"/>
-      <w:szCs w:val="24"/>
     </w:rPr>
   </w:style>
 </w:styles>
@@ -4858,12 +6245,6 @@
 </file>
 
 <file path=customXml/item1.xml><?xml version="1.0" encoding="utf-8"?>
-<p:properties xmlns:p="http://schemas.microsoft.com/office/2006/metadata/properties" xmlns:xsi="http://www.w3.org/2001/XMLSchema-instance" xmlns:pc="http://schemas.microsoft.com/office/infopath/2007/PartnerControls">
-  <documentManagement/>
-</p:properties>
-</file>
-
-<file path=customXml/item2.xml><?xml version="1.0" encoding="utf-8"?>
 <?mso-contentType ?>
 <FormTemplates xmlns="http://schemas.microsoft.com/sharepoint/v3/contenttype/forms">
   <Display>DocumentLibraryForm</Display>
@@ -4872,7 +6253,7 @@
 </FormTemplates>
 </file>
 
-<file path=customXml/item3.xml><?xml version="1.0" encoding="utf-8"?>
+<file path=customXml/item2.xml><?xml version="1.0" encoding="utf-8"?>
 <ct:contentTypeSchema xmlns:ct="http://schemas.microsoft.com/office/2006/metadata/contentType" xmlns:ma="http://schemas.microsoft.com/office/2006/metadata/properties/metaAttributes" ct:_="" ma:_="" ma:contentTypeName="Documento" ma:contentTypeID="0x010100E96778489EE7714D8BD12CC105EB918B" ma:contentTypeVersion="2" ma:contentTypeDescription="Crear nuevo documento." ma:contentTypeScope="" ma:versionID="416c5c7ae9b5d54d83875cd3c65194e3">
   <xsd:schema xmlns:xsd="http://www.w3.org/2001/XMLSchema" xmlns:xs="http://www.w3.org/2001/XMLSchema" xmlns:p="http://schemas.microsoft.com/office/2006/metadata/properties" xmlns:ns2="126e8a1c-9ea9-435a-ac89-d06c80d62e30" targetNamespace="http://schemas.microsoft.com/office/2006/metadata/properties" ma:root="true" ma:fieldsID="70a237c842677bd850644f8595079f5e" ns2:_="">
     <xsd:import namespace="126e8a1c-9ea9-435a-ac89-d06c80d62e30"/>
@@ -5004,16 +6385,13 @@
 </ct:contentTypeSchema>
 </file>
 
-<file path=customXml/itemProps1.xml><?xml version="1.0" encoding="utf-8"?>
-<ds:datastoreItem xmlns:ds="http://schemas.openxmlformats.org/officeDocument/2006/customXml" ds:itemID="{46CA5683-AF87-4E40-B841-2E23A3B52406}">
-  <ds:schemaRefs>
-    <ds:schemaRef ds:uri="http://schemas.microsoft.com/office/2006/metadata/properties"/>
-    <ds:schemaRef ds:uri="http://schemas.microsoft.com/office/infopath/2007/PartnerControls"/>
-  </ds:schemaRefs>
-</ds:datastoreItem>
+<file path=customXml/item3.xml><?xml version="1.0" encoding="utf-8"?>
+<p:properties xmlns:p="http://schemas.microsoft.com/office/2006/metadata/properties" xmlns:xsi="http://www.w3.org/2001/XMLSchema-instance" xmlns:pc="http://schemas.microsoft.com/office/infopath/2007/PartnerControls">
+  <documentManagement/>
+</p:properties>
 </file>
 
-<file path=customXml/itemProps2.xml><?xml version="1.0" encoding="utf-8"?>
+<file path=customXml/itemProps1.xml><?xml version="1.0" encoding="utf-8"?>
 <ds:datastoreItem xmlns:ds="http://schemas.openxmlformats.org/officeDocument/2006/customXml" ds:itemID="{D51C61E4-DB75-4684-AD25-71F546404E96}">
   <ds:schemaRefs>
     <ds:schemaRef ds:uri="http://schemas.microsoft.com/sharepoint/v3/contenttype/forms"/>
@@ -5021,7 +6399,7 @@
 </ds:datastoreItem>
 </file>
 
-<file path=customXml/itemProps3.xml><?xml version="1.0" encoding="utf-8"?>
+<file path=customXml/itemProps2.xml><?xml version="1.0" encoding="utf-8"?>
 <ds:datastoreItem xmlns:ds="http://schemas.openxmlformats.org/officeDocument/2006/customXml" ds:itemID="{6F3661B0-5934-4FAB-ADC6-33A19B814E8D}">
   <ds:schemaRefs>
     <ds:schemaRef ds:uri="http://schemas.microsoft.com/office/2006/metadata/contentType"/>
@@ -5037,4 +6415,13 @@
     <ds:schemaRef ds:uri="http://schemas.microsoft.com/internal/obd"/>
   </ds:schemaRefs>
 </ds:datastoreItem>
+</file>
+
+<file path=customXml/itemProps3.xml><?xml version="1.0" encoding="utf-8"?>
+<ds:datastoreItem xmlns:ds="http://schemas.openxmlformats.org/officeDocument/2006/customXml" ds:itemID="{46CA5683-AF87-4E40-B841-2E23A3B52406}">
+  <ds:schemaRefs>
+    <ds:schemaRef ds:uri="http://schemas.microsoft.com/office/2006/metadata/properties"/>
+    <ds:schemaRef ds:uri="http://schemas.microsoft.com/office/infopath/2007/PartnerControls"/>
+  </ds:schemaRefs>
+</ds:datastoreItem>
 </file>
</xml_diff>

<commit_message>
Ajuste de algunas imágenes de las vistas
</commit_message>
<xml_diff>
--- a/Fase 2/Evidencias Grupales/2.4_GuiaEstudiante_Fase 2_DesarrolloProyecto APT.docx
+++ b/Fase 2/Evidencias Grupales/2.4_GuiaEstudiante_Fase 2_DesarrolloProyecto APT.docx
@@ -162,7 +162,6 @@
                                 </w:rPr>
                                 <w:t xml:space="preserve">Asignatura </w:t>
                               </w:r>
-                              <w:proofErr w:type="spellStart"/>
                               <w:r>
                                 <w:rPr>
                                   <w:b/>
@@ -172,7 +171,6 @@
                                 </w:rPr>
                                 <w:t>Capstone</w:t>
                               </w:r>
-                              <w:proofErr w:type="spellEnd"/>
                             </w:p>
                           </w:txbxContent>
                         </wps:txbx>
@@ -237,7 +235,7 @@
           </mc:Choice>
           <mc:Fallback>
             <w:pict>
-              <v:group w14:anchorId="39581AEC" id="Grupo 27" o:spid="_x0000_s1026" style="position:absolute;margin-left:0;margin-top:.75pt;width:491.25pt;height:123pt;z-index:251659264;mso-position-horizontal:center;mso-position-horizontal-relative:margin;mso-width-relative:margin;mso-height-relative:margin" coordsize="59912,15621" o:gfxdata="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">
+              <v:group w14:anchorId="39581AEC" id="Grupo 27" o:spid="_x0000_s1026" style="position:absolute;margin-left:0;margin-top:.75pt;width:491.25pt;height:123pt;z-index:251659264;mso-position-horizontal:center;mso-position-horizontal-relative:margin;mso-width-relative:margin;mso-height-relative:margin" coordsize="59912,15621" o:gfxdata="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">
                 <v:shapetype id="_x0000_t202" coordsize="21600,21600" o:spt="202" path="m,l,21600r21600,l21600,xe">
                   <v:stroke joinstyle="miter"/>
                   <v:path gradientshapeok="t" o:connecttype="rect"/>
@@ -645,103 +643,31 @@
                 <w:szCs w:val="20"/>
                 <w:lang w:eastAsia="es-CL"/>
               </w:rPr>
-              <w:t xml:space="preserve">Hasta el 20 de octubre de 2026, los avances del proyecto </w:t>
-            </w:r>
-            <w:proofErr w:type="spellStart"/>
-            <w:r>
-              <w:rPr>
-                <w:rFonts w:ascii="Calibri" w:hAnsi="Calibri" w:cs="Arial"/>
-                <w:iCs/>
-                <w:color w:val="000000" w:themeColor="text1"/>
-                <w:sz w:val="20"/>
-                <w:szCs w:val="20"/>
-                <w:lang w:eastAsia="es-CL"/>
-              </w:rPr>
-              <w:t>TresStock</w:t>
-            </w:r>
-            <w:proofErr w:type="spellEnd"/>
-            <w:r>
-              <w:rPr>
-                <w:rFonts w:ascii="Calibri" w:hAnsi="Calibri" w:cs="Arial"/>
-                <w:iCs/>
-                <w:color w:val="000000" w:themeColor="text1"/>
-                <w:sz w:val="20"/>
-                <w:szCs w:val="20"/>
-                <w:lang w:eastAsia="es-CL"/>
-              </w:rPr>
-              <w:t xml:space="preserve"> se han enfocado en desarrollar e implementar las funcionalidades básicas del sistema, con el objetivo de contar con una plataforma funcional que permita complementar la gestión de inventario del </w:t>
-            </w:r>
-            <w:proofErr w:type="spellStart"/>
-            <w:r>
-              <w:rPr>
-                <w:rFonts w:ascii="Calibri" w:hAnsi="Calibri" w:cs="Arial"/>
-                <w:iCs/>
-                <w:color w:val="000000" w:themeColor="text1"/>
-                <w:sz w:val="20"/>
-                <w:szCs w:val="20"/>
-                <w:lang w:eastAsia="es-CL"/>
-              </w:rPr>
-              <w:t>minimarket</w:t>
-            </w:r>
-            <w:proofErr w:type="spellEnd"/>
-            <w:r>
-              <w:rPr>
-                <w:rFonts w:ascii="Calibri" w:hAnsi="Calibri" w:cs="Arial"/>
-                <w:iCs/>
-                <w:color w:val="000000" w:themeColor="text1"/>
-                <w:sz w:val="20"/>
-                <w:szCs w:val="20"/>
-                <w:lang w:eastAsia="es-CL"/>
-              </w:rPr>
-              <w:t xml:space="preserve"> Los Tres.</w:t>
-            </w:r>
-          </w:p>
-          <w:p>
-            <w:pPr>
-              <w:jc w:val="both"/>
-              <w:rPr>
-                <w:rFonts w:ascii="Calibri" w:hAnsi="Calibri" w:cs="Arial"/>
-                <w:iCs/>
-                <w:color w:val="000000" w:themeColor="text1"/>
-                <w:sz w:val="20"/>
-                <w:szCs w:val="20"/>
-                <w:lang w:eastAsia="es-CL"/>
-              </w:rPr>
-            </w:pPr>
-            <w:r>
-              <w:rPr>
-                <w:rFonts w:ascii="Calibri" w:hAnsi="Calibri" w:cs="Arial"/>
-                <w:iCs/>
-                <w:color w:val="000000" w:themeColor="text1"/>
-                <w:sz w:val="20"/>
-                <w:szCs w:val="20"/>
-                <w:lang w:eastAsia="es-CL"/>
-              </w:rPr>
-              <w:t xml:space="preserve">Entre las actividades realizadas, se encuentra la implementación de la importación de archivos CSV provenientes del sistema de gestión </w:t>
-            </w:r>
-            <w:proofErr w:type="spellStart"/>
-            <w:r>
-              <w:rPr>
-                <w:rFonts w:ascii="Calibri" w:hAnsi="Calibri" w:cs="Arial"/>
-                <w:iCs/>
-                <w:color w:val="000000" w:themeColor="text1"/>
-                <w:sz w:val="20"/>
-                <w:szCs w:val="20"/>
-                <w:lang w:eastAsia="es-CL"/>
-              </w:rPr>
-              <w:t>DimaSoft</w:t>
-            </w:r>
-            <w:proofErr w:type="spellEnd"/>
-            <w:r>
-              <w:rPr>
-                <w:rFonts w:ascii="Calibri" w:hAnsi="Calibri" w:cs="Arial"/>
-                <w:iCs/>
-                <w:color w:val="000000" w:themeColor="text1"/>
-                <w:sz w:val="20"/>
-                <w:szCs w:val="20"/>
-                <w:lang w:eastAsia="es-CL"/>
-              </w:rPr>
-              <w:t>, lo que permite incorporar los datos existentes al sistema desarrollado. Asimismo, se ha avanzado en el desarrollo de los módulos de inventario, gestión de proveedores, inicio de sesión e historial de ventas, estableciendo las funcionalidades principales para la administración y consulta de la información.</w:t>
+              <w:t>Hasta el 20 de octubre de 2026, los avances del proyecto TresStock se han enfocado en desarrollar e implementar las funcionalidades básicas del sistema, con el objetivo de contar con una plataforma funcional que permita complementar la gestión de inventario del minimarket Los Tres.</w:t>
+            </w:r>
+          </w:p>
+          <w:p>
+            <w:pPr>
+              <w:jc w:val="both"/>
+              <w:rPr>
+                <w:rFonts w:ascii="Calibri" w:hAnsi="Calibri" w:cs="Arial"/>
+                <w:iCs/>
+                <w:color w:val="000000" w:themeColor="text1"/>
+                <w:sz w:val="20"/>
+                <w:szCs w:val="20"/>
+                <w:lang w:eastAsia="es-CL"/>
+              </w:rPr>
+            </w:pPr>
+            <w:r>
+              <w:rPr>
+                <w:rFonts w:ascii="Calibri" w:hAnsi="Calibri" w:cs="Arial"/>
+                <w:iCs/>
+                <w:color w:val="000000" w:themeColor="text1"/>
+                <w:sz w:val="20"/>
+                <w:szCs w:val="20"/>
+                <w:lang w:eastAsia="es-CL"/>
+              </w:rPr>
+              <w:t>Entre las actividades realizadas, se encuentra la implementación de la importación de archivos CSV provenientes del sistema de gestión DimaSoft, lo que permite incorporar los datos existentes al sistema desarrollado. Asimismo, se ha avanzado en el desarrollo de los módulos de inventario, gestión de proveedores, inicio de sesión e historial de ventas, estableciendo las funcionalidades principales para la administración y consulta de la información.</w:t>
             </w:r>
           </w:p>
           <w:p>
@@ -870,31 +796,7 @@
                 <w:szCs w:val="20"/>
                 <w:lang w:eastAsia="es-CL"/>
               </w:rPr>
-              <w:t xml:space="preserve">Se mantiene el objetivo general y los objetivos específicos establecidos inicialmente para el proyecto </w:t>
-            </w:r>
-            <w:proofErr w:type="spellStart"/>
-            <w:r>
-              <w:rPr>
-                <w:rFonts w:ascii="Calibri" w:hAnsi="Calibri" w:cs="Arial"/>
-                <w:iCs/>
-                <w:color w:val="000000" w:themeColor="text1"/>
-                <w:sz w:val="20"/>
-                <w:szCs w:val="20"/>
-                <w:lang w:eastAsia="es-CL"/>
-              </w:rPr>
-              <w:t>TresStock</w:t>
-            </w:r>
-            <w:proofErr w:type="spellEnd"/>
-            <w:r>
-              <w:rPr>
-                <w:rFonts w:ascii="Calibri" w:hAnsi="Calibri" w:cs="Arial"/>
-                <w:iCs/>
-                <w:color w:val="000000" w:themeColor="text1"/>
-                <w:sz w:val="20"/>
-                <w:szCs w:val="20"/>
-                <w:lang w:eastAsia="es-CL"/>
-              </w:rPr>
-              <w:t>. Sin embargo, debido a los retrasos ocasionados por la realización paralela de la práctica profesional, se contempla ajustar la planificación de las actividades pendientes de la carta Gantt, retomando su ejecución una vez finalizada dicha práctica.</w:t>
+              <w:t>Se mantiene el objetivo general y los objetivos específicos establecidos inicialmente para el proyecto TresStock. Sin embargo, debido a los retrasos ocasionados por la realización paralela de la práctica profesional, se contempla ajustar la planificación de las actividades pendientes de la carta Gantt, retomando su ejecución una vez finalizada dicha práctica.</w:t>
             </w:r>
           </w:p>
           <w:p>
@@ -1321,6 +1223,7 @@
                 <w:rFonts w:ascii="Calibri" w:hAnsi="Calibri" w:cs="Arial"/>
                 <w:b/>
                 <w:iCs/>
+                <w:noProof/>
                 <w:color w:val="000000" w:themeColor="text1"/>
                 <w:sz w:val="20"/>
                 <w:szCs w:val="20"/>
@@ -1421,6 +1324,7 @@
                 <w:rFonts w:ascii="Calibri" w:hAnsi="Calibri" w:cs="Arial"/>
                 <w:b/>
                 <w:iCs/>
+                <w:noProof/>
                 <w:color w:val="000000" w:themeColor="text1"/>
                 <w:sz w:val="20"/>
                 <w:szCs w:val="20"/>
@@ -1513,10 +1417,10 @@
                 <w:lang w:eastAsia="es-CL"/>
               </w:rPr>
               <w:drawing>
-                <wp:inline distT="0" distB="0" distL="0" distR="0" wp14:anchorId="5A2ADF35" wp14:editId="0170997D">
-                  <wp:extent cx="4339590" cy="2265730"/>
-                  <wp:effectExtent l="0" t="0" r="3810" b="1270"/>
-                  <wp:docPr id="572358290" name="Imagen 1"/>
+                <wp:inline distT="0" distB="0" distL="0" distR="0" wp14:anchorId="3AA460C8" wp14:editId="5273C700">
+                  <wp:extent cx="4290646" cy="2130054"/>
+                  <wp:effectExtent l="0" t="0" r="0" b="3810"/>
+                  <wp:docPr id="1432176033" name="Imagen 1"/>
                   <wp:cNvGraphicFramePr>
                     <a:graphicFrameLocks xmlns:a="http://schemas.openxmlformats.org/drawingml/2006/main" noChangeAspect="1"/>
                   </wp:cNvGraphicFramePr>
@@ -1524,23 +1428,32 @@
                     <a:graphicData uri="http://schemas.openxmlformats.org/drawingml/2006/picture">
                       <pic:pic xmlns:pic="http://schemas.openxmlformats.org/drawingml/2006/picture">
                         <pic:nvPicPr>
-                          <pic:cNvPr id="572358290" name=""/>
+                          <pic:cNvPr id="1432176033" name=""/>
                           <pic:cNvPicPr/>
                         </pic:nvPicPr>
-                        <pic:blipFill>
+                        <pic:blipFill rotWithShape="1">
                           <a:blip r:embed="rId13"/>
+                          <a:srcRect t="594"/>
                           <a:stretch>
                             <a:fillRect/>
                           </a:stretch>
                         </pic:blipFill>
-                        <pic:spPr>
+                        <pic:spPr bwMode="auto">
                           <a:xfrm>
                             <a:off x="0" y="0"/>
-                            <a:ext cx="4367729" cy="2280421"/>
+                            <a:ext cx="4317922" cy="2143595"/>
                           </a:xfrm>
                           <a:prstGeom prst="rect">
                             <a:avLst/>
                           </a:prstGeom>
+                          <a:ln>
+                            <a:noFill/>
+                          </a:ln>
+                          <a:extLst>
+                            <a:ext uri="{53640926-AAD7-44D8-BBD7-CCE9431645EC}">
+                              <a14:shadowObscured xmlns:a14="http://schemas.microsoft.com/office/drawing/2010/main"/>
+                            </a:ext>
+                          </a:extLst>
                         </pic:spPr>
                       </pic:pic>
                     </a:graphicData>
@@ -1599,10 +1512,10 @@
                 <w:lang w:eastAsia="es-CL"/>
               </w:rPr>
               <w:drawing>
-                <wp:inline distT="0" distB="0" distL="0" distR="0" wp14:anchorId="40729C14" wp14:editId="2F131E46">
-                  <wp:extent cx="4339988" cy="2282781"/>
-                  <wp:effectExtent l="0" t="0" r="3810" b="3810"/>
-                  <wp:docPr id="524675024" name="Imagen 1"/>
+                <wp:inline distT="0" distB="0" distL="0" distR="0" wp14:anchorId="2181CA70" wp14:editId="2B0C610B">
+                  <wp:extent cx="4329239" cy="2149856"/>
+                  <wp:effectExtent l="0" t="0" r="0" b="3175"/>
+                  <wp:docPr id="1348839631" name="Imagen 1"/>
                   <wp:cNvGraphicFramePr>
                     <a:graphicFrameLocks xmlns:a="http://schemas.openxmlformats.org/drawingml/2006/main" noChangeAspect="1"/>
                   </wp:cNvGraphicFramePr>
@@ -1610,7 +1523,7 @@
                     <a:graphicData uri="http://schemas.openxmlformats.org/drawingml/2006/picture">
                       <pic:pic xmlns:pic="http://schemas.openxmlformats.org/drawingml/2006/picture">
                         <pic:nvPicPr>
-                          <pic:cNvPr id="524675024" name=""/>
+                          <pic:cNvPr id="1348839631" name=""/>
                           <pic:cNvPicPr/>
                         </pic:nvPicPr>
                         <pic:blipFill>
@@ -1622,7 +1535,7 @@
                         <pic:spPr>
                           <a:xfrm>
                             <a:off x="0" y="0"/>
-                            <a:ext cx="4357533" cy="2292009"/>
+                            <a:ext cx="4343928" cy="2157150"/>
                           </a:xfrm>
                           <a:prstGeom prst="rect">
                             <a:avLst/>
@@ -1653,6 +1566,7 @@
                 <w:rFonts w:ascii="Calibri" w:hAnsi="Calibri" w:cs="Arial"/>
                 <w:b/>
                 <w:iCs/>
+                <w:noProof/>
                 <w:color w:val="000000" w:themeColor="text1"/>
                 <w:sz w:val="20"/>
                 <w:szCs w:val="20"/>
@@ -1714,6 +1628,7 @@
                 <w:rFonts w:ascii="Calibri" w:hAnsi="Calibri" w:cs="Arial"/>
                 <w:b/>
                 <w:iCs/>
+                <w:noProof/>
                 <w:color w:val="000000" w:themeColor="text1"/>
                 <w:sz w:val="20"/>
                 <w:szCs w:val="20"/>
@@ -1774,6 +1689,7 @@
                 <w:rFonts w:ascii="Calibri" w:hAnsi="Calibri" w:cs="Arial"/>
                 <w:b/>
                 <w:iCs/>
+                <w:noProof/>
                 <w:color w:val="000000" w:themeColor="text1"/>
                 <w:sz w:val="20"/>
                 <w:szCs w:val="20"/>
@@ -1848,6 +1764,7 @@
                 <w:rFonts w:ascii="Calibri" w:hAnsi="Calibri" w:cs="Arial"/>
                 <w:b/>
                 <w:iCs/>
+                <w:noProof/>
                 <w:color w:val="000000" w:themeColor="text1"/>
                 <w:sz w:val="20"/>
                 <w:szCs w:val="20"/>
@@ -1935,6 +1852,7 @@
                 <w:rFonts w:ascii="Calibri" w:hAnsi="Calibri" w:cs="Arial"/>
                 <w:b/>
                 <w:iCs/>
+                <w:noProof/>
                 <w:color w:val="000000" w:themeColor="text1"/>
                 <w:sz w:val="20"/>
                 <w:szCs w:val="20"/>
@@ -1995,6 +1913,7 @@
                 <w:rFonts w:ascii="Calibri" w:hAnsi="Calibri" w:cs="Arial"/>
                 <w:b/>
                 <w:iCs/>
+                <w:noProof/>
                 <w:color w:val="000000" w:themeColor="text1"/>
                 <w:sz w:val="20"/>
                 <w:szCs w:val="20"/>
@@ -2055,6 +1974,7 @@
                 <w:rFonts w:ascii="Calibri" w:hAnsi="Calibri" w:cs="Arial"/>
                 <w:b/>
                 <w:iCs/>
+                <w:noProof/>
                 <w:color w:val="000000" w:themeColor="text1"/>
                 <w:sz w:val="20"/>
                 <w:szCs w:val="20"/>
@@ -2161,10 +2081,10 @@
                 <w:lang w:eastAsia="es-CL"/>
               </w:rPr>
               <w:drawing>
-                <wp:inline distT="0" distB="0" distL="0" distR="0" wp14:anchorId="219E84D5" wp14:editId="520A19A6">
-                  <wp:extent cx="4528795" cy="1903863"/>
-                  <wp:effectExtent l="0" t="0" r="5715" b="1270"/>
-                  <wp:docPr id="1307049923" name="Imagen 1"/>
+                <wp:inline distT="0" distB="0" distL="0" distR="0" wp14:anchorId="1E8D70DB" wp14:editId="23313257">
+                  <wp:extent cx="4377191" cy="2176757"/>
+                  <wp:effectExtent l="0" t="0" r="4445" b="0"/>
+                  <wp:docPr id="1973889828" name="Imagen 1"/>
                   <wp:cNvGraphicFramePr>
                     <a:graphicFrameLocks xmlns:a="http://schemas.openxmlformats.org/drawingml/2006/main" noChangeAspect="1"/>
                   </wp:cNvGraphicFramePr>
@@ -2172,7 +2092,7 @@
                     <a:graphicData uri="http://schemas.openxmlformats.org/drawingml/2006/picture">
                       <pic:pic xmlns:pic="http://schemas.openxmlformats.org/drawingml/2006/picture">
                         <pic:nvPicPr>
-                          <pic:cNvPr id="1307049923" name=""/>
+                          <pic:cNvPr id="1973889828" name=""/>
                           <pic:cNvPicPr/>
                         </pic:nvPicPr>
                         <pic:blipFill>
@@ -2184,7 +2104,7 @@
                         <pic:spPr>
                           <a:xfrm>
                             <a:off x="0" y="0"/>
-                            <a:ext cx="4548707" cy="1912234"/>
+                            <a:ext cx="4385460" cy="2180869"/>
                           </a:xfrm>
                           <a:prstGeom prst="rect">
                             <a:avLst/>
@@ -2221,10 +2141,10 @@
                 <w:lang w:eastAsia="es-CL"/>
               </w:rPr>
               <w:drawing>
-                <wp:inline distT="0" distB="0" distL="0" distR="0" wp14:anchorId="16EF9B68" wp14:editId="48EA2F7C">
-                  <wp:extent cx="3993775" cy="2599898"/>
-                  <wp:effectExtent l="0" t="0" r="6985" b="0"/>
-                  <wp:docPr id="1399888309" name="Imagen 1"/>
+                <wp:inline distT="0" distB="0" distL="0" distR="0" wp14:anchorId="042A0D71" wp14:editId="2B5D228C">
+                  <wp:extent cx="3981282" cy="2916922"/>
+                  <wp:effectExtent l="0" t="0" r="635" b="0"/>
+                  <wp:docPr id="1802653686" name="Imagen 1"/>
                   <wp:cNvGraphicFramePr>
                     <a:graphicFrameLocks xmlns:a="http://schemas.openxmlformats.org/drawingml/2006/main" noChangeAspect="1"/>
                   </wp:cNvGraphicFramePr>
@@ -2232,7 +2152,7 @@
                     <a:graphicData uri="http://schemas.openxmlformats.org/drawingml/2006/picture">
                       <pic:pic xmlns:pic="http://schemas.openxmlformats.org/drawingml/2006/picture">
                         <pic:nvPicPr>
-                          <pic:cNvPr id="1399888309" name=""/>
+                          <pic:cNvPr id="1802653686" name=""/>
                           <pic:cNvPicPr/>
                         </pic:nvPicPr>
                         <pic:blipFill>
@@ -2244,7 +2164,7 @@
                         <pic:spPr>
                           <a:xfrm>
                             <a:off x="0" y="0"/>
-                            <a:ext cx="4015965" cy="2614343"/>
+                            <a:ext cx="3990938" cy="2923997"/>
                           </a:xfrm>
                           <a:prstGeom prst="rect">
                             <a:avLst/>
@@ -2281,10 +2201,10 @@
                 <w:lang w:eastAsia="es-CL"/>
               </w:rPr>
               <w:drawing>
-                <wp:inline distT="0" distB="0" distL="0" distR="0" wp14:anchorId="087E3E09" wp14:editId="736A2962">
-                  <wp:extent cx="4101152" cy="2520780"/>
+                <wp:inline distT="0" distB="0" distL="0" distR="0" wp14:anchorId="1873B17E" wp14:editId="3E25D4C5">
+                  <wp:extent cx="3565993" cy="2557083"/>
                   <wp:effectExtent l="0" t="0" r="0" b="0"/>
-                  <wp:docPr id="1215478936" name="Imagen 1"/>
+                  <wp:docPr id="477213355" name="Imagen 1"/>
                   <wp:cNvGraphicFramePr>
                     <a:graphicFrameLocks xmlns:a="http://schemas.openxmlformats.org/drawingml/2006/main" noChangeAspect="1"/>
                   </wp:cNvGraphicFramePr>
@@ -2292,7 +2212,7 @@
                     <a:graphicData uri="http://schemas.openxmlformats.org/drawingml/2006/picture">
                       <pic:pic xmlns:pic="http://schemas.openxmlformats.org/drawingml/2006/picture">
                         <pic:nvPicPr>
-                          <pic:cNvPr id="1215478936" name=""/>
+                          <pic:cNvPr id="477213355" name=""/>
                           <pic:cNvPicPr/>
                         </pic:nvPicPr>
                         <pic:blipFill>
@@ -2304,7 +2224,7 @@
                         <pic:spPr>
                           <a:xfrm>
                             <a:off x="0" y="0"/>
-                            <a:ext cx="4128688" cy="2537705"/>
+                            <a:ext cx="3573509" cy="2562472"/>
                           </a:xfrm>
                           <a:prstGeom prst="rect">
                             <a:avLst/>
@@ -2369,7 +2289,6 @@
                 <w:szCs w:val="20"/>
                 <w:lang w:eastAsia="es-CL"/>
               </w:rPr>
-              <w:lastRenderedPageBreak/>
               <w:t>VISTA DE ADMINISTRACION Y NUEVO USUARIO</w:t>
             </w:r>
           </w:p>
@@ -2392,6 +2311,7 @@
                 <w:rFonts w:ascii="Calibri" w:hAnsi="Calibri" w:cs="Arial"/>
                 <w:b/>
                 <w:iCs/>
+                <w:noProof/>
                 <w:color w:val="000000" w:themeColor="text1"/>
                 <w:sz w:val="20"/>
                 <w:szCs w:val="20"/>
@@ -2454,6 +2374,7 @@
                 <w:rFonts w:ascii="Calibri" w:hAnsi="Calibri" w:cs="Arial"/>
                 <w:b/>
                 <w:iCs/>
+                <w:noProof/>
                 <w:color w:val="000000" w:themeColor="text1"/>
                 <w:sz w:val="20"/>
                 <w:szCs w:val="20"/>
@@ -2544,12 +2465,14 @@
                 <w:rFonts w:ascii="Calibri" w:hAnsi="Calibri" w:cs="Arial"/>
                 <w:b/>
                 <w:iCs/>
+                <w:noProof/>
                 <w:color w:val="000000" w:themeColor="text1"/>
                 <w:sz w:val="20"/>
                 <w:szCs w:val="20"/>
                 <w:u w:val="single"/>
                 <w:lang w:eastAsia="es-CL"/>
               </w:rPr>
+              <w:lastRenderedPageBreak/>
               <w:drawing>
                 <wp:inline distT="0" distB="0" distL="0" distR="0" wp14:anchorId="79C5CAFD" wp14:editId="675F9BFC">
                   <wp:extent cx="4780583" cy="3466822"/>
@@ -2606,13 +2529,13 @@
                 <w:rFonts w:ascii="Calibri" w:hAnsi="Calibri" w:cs="Arial"/>
                 <w:b/>
                 <w:iCs/>
+                <w:noProof/>
                 <w:color w:val="000000" w:themeColor="text1"/>
                 <w:sz w:val="20"/>
                 <w:szCs w:val="20"/>
                 <w:u w:val="single"/>
                 <w:lang w:eastAsia="es-CL"/>
               </w:rPr>
-              <w:lastRenderedPageBreak/>
               <w:drawing>
                 <wp:inline distT="0" distB="0" distL="0" distR="0" wp14:anchorId="1989A35D" wp14:editId="3D12E9AB">
                   <wp:extent cx="4804012" cy="3203051"/>
@@ -2669,16 +2592,18 @@
                 <w:rFonts w:ascii="Calibri" w:hAnsi="Calibri" w:cs="Arial"/>
                 <w:b/>
                 <w:iCs/>
+                <w:noProof/>
                 <w:color w:val="000000" w:themeColor="text1"/>
                 <w:sz w:val="20"/>
                 <w:szCs w:val="20"/>
                 <w:u w:val="single"/>
                 <w:lang w:eastAsia="es-CL"/>
               </w:rPr>
+              <w:lastRenderedPageBreak/>
               <w:drawing>
-                <wp:inline distT="0" distB="0" distL="0" distR="0" wp14:anchorId="0BA4AEBE" wp14:editId="309104C5">
-                  <wp:extent cx="4680585" cy="4367283"/>
-                  <wp:effectExtent l="0" t="0" r="5715" b="0"/>
+                <wp:inline distT="0" distB="0" distL="0" distR="0" wp14:anchorId="0BA4AEBE" wp14:editId="7B2C68A9">
+                  <wp:extent cx="3803256" cy="4366338"/>
+                  <wp:effectExtent l="0" t="0" r="6985" b="0"/>
                   <wp:docPr id="398176739" name="Imagen 1"/>
                   <wp:cNvGraphicFramePr>
                     <a:graphicFrameLocks xmlns:a="http://schemas.openxmlformats.org/drawingml/2006/main" noChangeAspect="1"/>
@@ -2699,7 +2624,7 @@
                         <pic:spPr>
                           <a:xfrm>
                             <a:off x="0" y="0"/>
-                            <a:ext cx="4706677" cy="4391628"/>
+                            <a:ext cx="3829366" cy="4396313"/>
                           </a:xfrm>
                           <a:prstGeom prst="rect">
                             <a:avLst/>
@@ -3770,17 +3695,6 @@
         </w:tc>
       </w:tr>
     </w:tbl>
-    <w:p>
-      <w:pPr>
-        <w:rPr>
-          <w:rFonts w:cs="Calibri Light"/>
-          <w:color w:val="595959" w:themeColor="text1" w:themeTint="A6"/>
-          <w:sz w:val="24"/>
-          <w:szCs w:val="24"/>
-          <w:lang w:val="es-ES"/>
-        </w:rPr>
-      </w:pPr>
-    </w:p>
     <w:tbl>
       <w:tblPr>
         <w:tblStyle w:val="Tablaconcuadrcula"/>
@@ -4040,61 +3954,7 @@
                 <w:szCs w:val="20"/>
                 <w:lang w:eastAsia="es-CL"/>
               </w:rPr>
-              <w:t xml:space="preserve"> </w:t>
-            </w:r>
-            <w:r>
-              <w:rPr>
-                <w:rFonts w:ascii="Calibri" w:hAnsi="Calibri" w:cs="Arial"/>
-                <w:color w:val="000000" w:themeColor="text1"/>
-                <w:sz w:val="20"/>
-                <w:szCs w:val="20"/>
-                <w:lang w:eastAsia="es-CL"/>
-              </w:rPr>
-              <w:t xml:space="preserve">Entre los factores que han facilitado el desarrollo del proyecto APT se encuentra el avance progresivo en la implementación de las funcionalidades principales de </w:t>
-            </w:r>
-            <w:proofErr w:type="spellStart"/>
-            <w:r>
-              <w:rPr>
-                <w:rFonts w:ascii="Calibri" w:hAnsi="Calibri" w:cs="Arial"/>
-                <w:color w:val="000000" w:themeColor="text1"/>
-                <w:sz w:val="20"/>
-                <w:szCs w:val="20"/>
-                <w:lang w:eastAsia="es-CL"/>
-              </w:rPr>
-              <w:t>TresStock</w:t>
-            </w:r>
-            <w:proofErr w:type="spellEnd"/>
-            <w:r>
-              <w:rPr>
-                <w:rFonts w:ascii="Calibri" w:hAnsi="Calibri" w:cs="Arial"/>
-                <w:color w:val="000000" w:themeColor="text1"/>
-                <w:sz w:val="20"/>
-                <w:szCs w:val="20"/>
-                <w:lang w:eastAsia="es-CL"/>
-              </w:rPr>
-              <w:t xml:space="preserve">, como la importación de archivos CSV provenientes de </w:t>
-            </w:r>
-            <w:proofErr w:type="spellStart"/>
-            <w:r>
-              <w:rPr>
-                <w:rFonts w:ascii="Calibri" w:hAnsi="Calibri" w:cs="Arial"/>
-                <w:color w:val="000000" w:themeColor="text1"/>
-                <w:sz w:val="20"/>
-                <w:szCs w:val="20"/>
-                <w:lang w:eastAsia="es-CL"/>
-              </w:rPr>
-              <w:t>DimaSoft</w:t>
-            </w:r>
-            <w:proofErr w:type="spellEnd"/>
-            <w:r>
-              <w:rPr>
-                <w:rFonts w:ascii="Calibri" w:hAnsi="Calibri" w:cs="Arial"/>
-                <w:color w:val="000000" w:themeColor="text1"/>
-                <w:sz w:val="20"/>
-                <w:szCs w:val="20"/>
-                <w:lang w:eastAsia="es-CL"/>
-              </w:rPr>
-              <w:t>, el sistema de inventario, la gestión de proveedores, el inicio de sesión y el historial de ventas. Estos avances han permitido establecer una base funcional para continuar con el desarrollo e integración de los distintos módulos.</w:t>
+              <w:t xml:space="preserve"> Entre los factores que han facilitado el desarrollo del proyecto APT se encuentra el avance progresivo en la implementación de las funcionalidades principales de TresStock, como la importación de archivos CSV provenientes de DimaSoft, el sistema de inventario, la gestión de proveedores, el inicio de sesión y el historial de ventas. Estos avances han permitido establecer una base funcional para continuar con el desarrollo e integración de los distintos módulos.</w:t>
             </w:r>
           </w:p>
           <w:p>
@@ -4139,18 +3999,7 @@
                 <w:szCs w:val="20"/>
                 <w:lang w:eastAsia="es-CL"/>
               </w:rPr>
-              <w:t xml:space="preserve">Para abordar esta dificultad, se contempla retomar las actividades pendientes una vez finalizada la práctica profesional, reorganizando los tiempos de trabajo y priorizando las tareas según su importancia para el </w:t>
-            </w:r>
-            <w:r>
-              <w:rPr>
-                <w:rFonts w:ascii="Calibri" w:hAnsi="Calibri" w:cs="Arial"/>
-                <w:color w:val="000000" w:themeColor="text1"/>
-                <w:sz w:val="20"/>
-                <w:szCs w:val="20"/>
-                <w:lang w:eastAsia="es-CL"/>
-              </w:rPr>
-              <w:lastRenderedPageBreak/>
-              <w:t>cumplimiento de los objetivos. De esta manera, se busca avanzar en las funcionalidades restantes, mejorar la integración entre los módulos y verificar el correcto funcionamiento del sistema.</w:t>
+              <w:t>Para abordar esta dificultad, se contempla retomar las actividades pendientes una vez finalizada la práctica profesional, reorganizando los tiempos de trabajo y priorizando las tareas según su importancia para el cumplimiento de los objetivos. De esta manera, se busca avanzar en las funcionalidades restantes, mejorar la integración entre los módulos y verificar el correcto funcionamiento del sistema.</w:t>
             </w:r>
           </w:p>
         </w:tc>
@@ -4608,31 +4457,7 @@
                 <w:szCs w:val="20"/>
                 <w:lang w:eastAsia="es-CL"/>
               </w:rPr>
-              <w:t xml:space="preserve"> </w:t>
-            </w:r>
-            <w:proofErr w:type="gramStart"/>
-            <w:r>
-              <w:rPr>
-                <w:rFonts w:ascii="Calibri" w:hAnsi="Calibri" w:cs="Arial"/>
-                <w:i/>
-                <w:color w:val="548DD4"/>
-                <w:sz w:val="20"/>
-                <w:szCs w:val="20"/>
-                <w:lang w:eastAsia="es-CL"/>
-              </w:rPr>
-              <w:t>de acuerdo a</w:t>
-            </w:r>
-            <w:proofErr w:type="gramEnd"/>
-            <w:r>
-              <w:rPr>
-                <w:rFonts w:ascii="Calibri" w:hAnsi="Calibri" w:cs="Arial"/>
-                <w:i/>
-                <w:color w:val="548DD4"/>
-                <w:sz w:val="20"/>
-                <w:szCs w:val="20"/>
-                <w:lang w:eastAsia="es-CL"/>
-              </w:rPr>
-              <w:t xml:space="preserve"> tu planificación</w:t>
+              <w:t xml:space="preserve"> de acuerdo a tu planificación</w:t>
             </w:r>
             <w:r>
               <w:rPr>
@@ -6245,12 +6070,9 @@
 </file>
 
 <file path=customXml/item1.xml><?xml version="1.0" encoding="utf-8"?>
-<?mso-contentType ?>
-<FormTemplates xmlns="http://schemas.microsoft.com/sharepoint/v3/contenttype/forms">
-  <Display>DocumentLibraryForm</Display>
-  <Edit>DocumentLibraryForm</Edit>
-  <New>DocumentLibraryForm</New>
-</FormTemplates>
+<p:properties xmlns:p="http://schemas.microsoft.com/office/2006/metadata/properties" xmlns:xsi="http://www.w3.org/2001/XMLSchema-instance" xmlns:pc="http://schemas.microsoft.com/office/infopath/2007/PartnerControls">
+  <documentManagement/>
+</p:properties>
 </file>
 
 <file path=customXml/item2.xml><?xml version="1.0" encoding="utf-8"?>
@@ -6386,15 +6208,19 @@
 </file>
 
 <file path=customXml/item3.xml><?xml version="1.0" encoding="utf-8"?>
-<p:properties xmlns:p="http://schemas.microsoft.com/office/2006/metadata/properties" xmlns:xsi="http://www.w3.org/2001/XMLSchema-instance" xmlns:pc="http://schemas.microsoft.com/office/infopath/2007/PartnerControls">
-  <documentManagement/>
-</p:properties>
+<?mso-contentType ?>
+<FormTemplates xmlns="http://schemas.microsoft.com/sharepoint/v3/contenttype/forms">
+  <Display>DocumentLibraryForm</Display>
+  <Edit>DocumentLibraryForm</Edit>
+  <New>DocumentLibraryForm</New>
+</FormTemplates>
 </file>
 
 <file path=customXml/itemProps1.xml><?xml version="1.0" encoding="utf-8"?>
-<ds:datastoreItem xmlns:ds="http://schemas.openxmlformats.org/officeDocument/2006/customXml" ds:itemID="{D51C61E4-DB75-4684-AD25-71F546404E96}">
+<ds:datastoreItem xmlns:ds="http://schemas.openxmlformats.org/officeDocument/2006/customXml" ds:itemID="{46CA5683-AF87-4E40-B841-2E23A3B52406}">
   <ds:schemaRefs>
-    <ds:schemaRef ds:uri="http://schemas.microsoft.com/sharepoint/v3/contenttype/forms"/>
+    <ds:schemaRef ds:uri="http://schemas.microsoft.com/office/2006/metadata/properties"/>
+    <ds:schemaRef ds:uri="http://schemas.microsoft.com/office/infopath/2007/PartnerControls"/>
   </ds:schemaRefs>
 </ds:datastoreItem>
 </file>
@@ -6418,10 +6244,9 @@
 </file>
 
 <file path=customXml/itemProps3.xml><?xml version="1.0" encoding="utf-8"?>
-<ds:datastoreItem xmlns:ds="http://schemas.openxmlformats.org/officeDocument/2006/customXml" ds:itemID="{46CA5683-AF87-4E40-B841-2E23A3B52406}">
+<ds:datastoreItem xmlns:ds="http://schemas.openxmlformats.org/officeDocument/2006/customXml" ds:itemID="{D51C61E4-DB75-4684-AD25-71F546404E96}">
   <ds:schemaRefs>
-    <ds:schemaRef ds:uri="http://schemas.microsoft.com/office/2006/metadata/properties"/>
-    <ds:schemaRef ds:uri="http://schemas.microsoft.com/office/infopath/2007/PartnerControls"/>
+    <ds:schemaRef ds:uri="http://schemas.microsoft.com/sharepoint/v3/contenttype/forms"/>
   </ds:schemaRefs>
 </ds:datastoreItem>
 </file>
</xml_diff>